<commit_message>
Remove goals and methodology chapter from documentation
Co-Authored-By: Claude Opus 5.5 <noreply@anthropic.com>
</commit_message>
<xml_diff>
--- a/docs/dokumentace-tym-07.docx
+++ b/docs/dokumentace-tym-07.docx
@@ -593,7 +593,7 @@
       </w:r>
       <w:r>
         <w:rPr/>
-        <w:t xml:space="preserve">Cíl práce a metodika</w:t>
+        <w:t xml:space="preserve">Úvodní studie</w:t>
       </w:r>
     </w:p>
     <w:p>
@@ -609,7 +609,71 @@
       </w:r>
       <w:r>
         <w:rPr/>
-        <w:t xml:space="preserve">Cíl práce</w:t>
+        <w:t xml:space="preserve">Analýza současného stavu</w:t>
+      </w:r>
+    </w:p>
+    <w:p>
+      <w:pPr>
+        <w:pStyle w:val="Obsah3"/>
+      </w:pPr>
+      <w:r>
+        <w:rPr/>
+        <w:t xml:space="preserve">2.1.1</w:t>
+      </w:r>
+      <w:r>
+        <w:tab/>
+      </w:r>
+      <w:r>
+        <w:rPr/>
+        <w:t xml:space="preserve">Knihovna ČZU</w:t>
+      </w:r>
+    </w:p>
+    <w:p>
+      <w:pPr>
+        <w:pStyle w:val="Obsah3"/>
+      </w:pPr>
+      <w:r>
+        <w:rPr/>
+        <w:t xml:space="preserve">2.1.2</w:t>
+      </w:r>
+      <w:r>
+        <w:tab/>
+      </w:r>
+      <w:r>
+        <w:rPr/>
+        <w:t xml:space="preserve">Správa učeben PEF</w:t>
+      </w:r>
+    </w:p>
+    <w:p>
+      <w:pPr>
+        <w:pStyle w:val="Obsah3"/>
+      </w:pPr>
+      <w:r>
+        <w:rPr/>
+        <w:t xml:space="preserve">2.1.3</w:t>
+      </w:r>
+      <w:r>
+        <w:tab/>
+      </w:r>
+      <w:r>
+        <w:rPr/>
+        <w:t xml:space="preserve">Facebooková skupina</w:t>
+      </w:r>
+    </w:p>
+    <w:p>
+      <w:pPr>
+        <w:pStyle w:val="Obsah3"/>
+      </w:pPr>
+      <w:r>
+        <w:rPr/>
+        <w:t xml:space="preserve">2.1.4</w:t>
+      </w:r>
+      <w:r>
+        <w:tab/>
+      </w:r>
+      <w:r>
+        <w:rPr/>
+        <w:t xml:space="preserve">Shrnutí</w:t>
       </w:r>
     </w:p>
     <w:p>
@@ -625,7 +689,7 @@
       </w:r>
       <w:r>
         <w:rPr/>
-        <w:t xml:space="preserve">Metodika</w:t>
+        <w:t xml:space="preserve">Idea projektu</w:t>
       </w:r>
     </w:p>
     <w:p>
@@ -641,7 +705,119 @@
       </w:r>
       <w:r>
         <w:rPr/>
-        <w:t xml:space="preserve">Rozdělení práce v týmu</w:t>
+        <w:t xml:space="preserve">Uživatelské role</w:t>
+      </w:r>
+    </w:p>
+    <w:p>
+      <w:pPr>
+        <w:pStyle w:val="Obsah2"/>
+      </w:pPr>
+      <w:r>
+        <w:rPr/>
+        <w:t xml:space="preserve">2.4</w:t>
+      </w:r>
+      <w:r>
+        <w:tab/>
+      </w:r>
+      <w:r>
+        <w:rPr/>
+        <w:t xml:space="preserve">Informační architektura</w:t>
+      </w:r>
+    </w:p>
+    <w:p>
+      <w:pPr>
+        <w:pStyle w:val="Obsah3"/>
+      </w:pPr>
+      <w:r>
+        <w:rPr/>
+        <w:t xml:space="preserve">2.4.1</w:t>
+      </w:r>
+      <w:r>
+        <w:tab/>
+      </w:r>
+      <w:r>
+        <w:rPr/>
+        <w:t xml:space="preserve">Mapa stránek</w:t>
+      </w:r>
+    </w:p>
+    <w:p>
+      <w:pPr>
+        <w:pStyle w:val="Obsah3"/>
+      </w:pPr>
+      <w:r>
+        <w:rPr/>
+        <w:t xml:space="preserve">2.4.2</w:t>
+      </w:r>
+      <w:r>
+        <w:tab/>
+      </w:r>
+      <w:r>
+        <w:rPr/>
+        <w:t xml:space="preserve">Navigace</w:t>
+      </w:r>
+    </w:p>
+    <w:p>
+      <w:pPr>
+        <w:pStyle w:val="Obsah3"/>
+      </w:pPr>
+      <w:r>
+        <w:rPr/>
+        <w:t xml:space="preserve">2.4.3</w:t>
+      </w:r>
+      <w:r>
+        <w:tab/>
+      </w:r>
+      <w:r>
+        <w:rPr/>
+        <w:t xml:space="preserve">Datový model</w:t>
+      </w:r>
+    </w:p>
+    <w:p>
+      <w:pPr>
+        <w:pStyle w:val="Obsah2"/>
+      </w:pPr>
+      <w:r>
+        <w:rPr/>
+        <w:t xml:space="preserve">2.5</w:t>
+      </w:r>
+      <w:r>
+        <w:tab/>
+      </w:r>
+      <w:r>
+        <w:rPr/>
+        <w:t xml:space="preserve">Wireframy</w:t>
+      </w:r>
+    </w:p>
+    <w:p>
+      <w:pPr>
+        <w:pStyle w:val="Obsah2"/>
+      </w:pPr>
+      <w:r>
+        <w:rPr/>
+        <w:t xml:space="preserve">2.6</w:t>
+      </w:r>
+      <w:r>
+        <w:tab/>
+      </w:r>
+      <w:r>
+        <w:rPr/>
+        <w:t xml:space="preserve">Klíčová slova</w:t>
+      </w:r>
+    </w:p>
+    <w:p>
+      <w:pPr>
+        <w:pStyle w:val="Obsah2"/>
+      </w:pPr>
+      <w:r>
+        <w:rPr/>
+        <w:t xml:space="preserve">2.7</w:t>
+      </w:r>
+      <w:r>
+        <w:tab/>
+      </w:r>
+      <w:r>
+        <w:rPr/>
+        <w:t xml:space="preserve">SEO strategie</w:t>
       </w:r>
     </w:p>
     <w:p>
@@ -657,7 +833,7 @@
       </w:r>
       <w:r>
         <w:rPr/>
-        <w:t xml:space="preserve">Úvodní studie</w:t>
+        <w:t xml:space="preserve">Realizace</w:t>
       </w:r>
     </w:p>
     <w:p>
@@ -673,71 +849,71 @@
       </w:r>
       <w:r>
         <w:rPr/>
-        <w:t xml:space="preserve">Analýza současného stavu</w:t>
-      </w:r>
-    </w:p>
-    <w:p>
-      <w:pPr>
-        <w:pStyle w:val="Obsah3"/>
-      </w:pPr>
-      <w:r>
-        <w:rPr/>
-        <w:t xml:space="preserve">3.1.1</w:t>
+        <w:t xml:space="preserve">Použité technologie</w:t>
+      </w:r>
+    </w:p>
+    <w:p>
+      <w:pPr>
+        <w:pStyle w:val="Obsah2"/>
+      </w:pPr>
+      <w:r>
+        <w:rPr/>
+        <w:t xml:space="preserve">3.2</w:t>
       </w:r>
       <w:r>
         <w:tab/>
       </w:r>
       <w:r>
         <w:rPr/>
-        <w:t xml:space="preserve">Knihovna ČZU</w:t>
-      </w:r>
-    </w:p>
-    <w:p>
-      <w:pPr>
-        <w:pStyle w:val="Obsah3"/>
-      </w:pPr>
-      <w:r>
-        <w:rPr/>
-        <w:t xml:space="preserve">3.1.2</w:t>
+        <w:t xml:space="preserve">Struktura projektu</w:t>
+      </w:r>
+    </w:p>
+    <w:p>
+      <w:pPr>
+        <w:pStyle w:val="Obsah2"/>
+      </w:pPr>
+      <w:r>
+        <w:rPr/>
+        <w:t xml:space="preserve">3.3</w:t>
       </w:r>
       <w:r>
         <w:tab/>
       </w:r>
       <w:r>
         <w:rPr/>
-        <w:t xml:space="preserve">Správa učeben PEF</w:t>
-      </w:r>
-    </w:p>
-    <w:p>
-      <w:pPr>
-        <w:pStyle w:val="Obsah3"/>
-      </w:pPr>
-      <w:r>
-        <w:rPr/>
-        <w:t xml:space="preserve">3.1.3</w:t>
+        <w:t xml:space="preserve">Responzivní design</w:t>
+      </w:r>
+    </w:p>
+    <w:p>
+      <w:pPr>
+        <w:pStyle w:val="Obsah2"/>
+      </w:pPr>
+      <w:r>
+        <w:rPr/>
+        <w:t xml:space="preserve">3.4</w:t>
       </w:r>
       <w:r>
         <w:tab/>
       </w:r>
       <w:r>
         <w:rPr/>
-        <w:t xml:space="preserve">Facebooková skupina</w:t>
-      </w:r>
-    </w:p>
-    <w:p>
-      <w:pPr>
-        <w:pStyle w:val="Obsah3"/>
-      </w:pPr>
-      <w:r>
-        <w:rPr/>
-        <w:t xml:space="preserve">3.1.4</w:t>
+        <w:t xml:space="preserve">Serverová část v PHP</w:t>
+      </w:r>
+    </w:p>
+    <w:p>
+      <w:pPr>
+        <w:pStyle w:val="Obsah2"/>
+      </w:pPr>
+      <w:r>
+        <w:rPr/>
+        <w:t xml:space="preserve">3.5</w:t>
       </w:r>
       <w:r>
         <w:tab/>
       </w:r>
       <w:r>
         <w:rPr/>
-        <w:t xml:space="preserve">Shrnutí</w:t>
+        <w:t xml:space="preserve">AJAX</w:t>
       </w:r>
     </w:p>
     <w:p>
@@ -746,14 +922,14 @@
       </w:pPr>
       <w:r>
         <w:rPr/>
-        <w:t xml:space="preserve">3.2</w:t>
+        <w:t xml:space="preserve">3.6</w:t>
       </w:r>
       <w:r>
         <w:tab/>
       </w:r>
       <w:r>
         <w:rPr/>
-        <w:t xml:space="preserve">Idea projektu</w:t>
+        <w:t xml:space="preserve">API třetích stran</w:t>
       </w:r>
     </w:p>
     <w:p>
@@ -762,14 +938,30 @@
       </w:pPr>
       <w:r>
         <w:rPr/>
-        <w:t xml:space="preserve">3.3</w:t>
+        <w:t xml:space="preserve">3.7</w:t>
       </w:r>
       <w:r>
         <w:tab/>
       </w:r>
       <w:r>
         <w:rPr/>
-        <w:t xml:space="preserve">Uživatelské role</w:t>
+        <w:t xml:space="preserve">Co zbývá dokončit</w:t>
+      </w:r>
+    </w:p>
+    <w:p>
+      <w:pPr>
+        <w:pStyle w:val="Obsah1"/>
+      </w:pPr>
+      <w:r>
+        <w:rPr/>
+        <w:t xml:space="preserve">4</w:t>
+      </w:r>
+      <w:r>
+        <w:tab/>
+      </w:r>
+      <w:r>
+        <w:rPr/>
+        <w:t xml:space="preserve">Testování a analýzy</w:t>
       </w:r>
     </w:p>
     <w:p>
@@ -778,62 +970,110 @@
       </w:pPr>
       <w:r>
         <w:rPr/>
-        <w:t xml:space="preserve">3.4</w:t>
+        <w:t xml:space="preserve">4.1</w:t>
       </w:r>
       <w:r>
         <w:tab/>
       </w:r>
       <w:r>
         <w:rPr/>
-        <w:t xml:space="preserve">Informační architektura</w:t>
-      </w:r>
-    </w:p>
-    <w:p>
-      <w:pPr>
-        <w:pStyle w:val="Obsah3"/>
-      </w:pPr>
-      <w:r>
-        <w:rPr/>
-        <w:t xml:space="preserve">3.4.1</w:t>
+        <w:t xml:space="preserve">Použitelnost</w:t>
+      </w:r>
+    </w:p>
+    <w:p>
+      <w:pPr>
+        <w:pStyle w:val="Obsah2"/>
+      </w:pPr>
+      <w:r>
+        <w:rPr/>
+        <w:t xml:space="preserve">4.2</w:t>
       </w:r>
       <w:r>
         <w:tab/>
       </w:r>
       <w:r>
         <w:rPr/>
-        <w:t xml:space="preserve">Mapa stránek</w:t>
-      </w:r>
-    </w:p>
-    <w:p>
-      <w:pPr>
-        <w:pStyle w:val="Obsah3"/>
-      </w:pPr>
-      <w:r>
-        <w:rPr/>
-        <w:t xml:space="preserve">3.4.2</w:t>
+        <w:t xml:space="preserve">Přístupnost</w:t>
+      </w:r>
+    </w:p>
+    <w:p>
+      <w:pPr>
+        <w:pStyle w:val="Obsah2"/>
+      </w:pPr>
+      <w:r>
+        <w:rPr/>
+        <w:t xml:space="preserve">4.3</w:t>
       </w:r>
       <w:r>
         <w:tab/>
       </w:r>
       <w:r>
         <w:rPr/>
-        <w:t xml:space="preserve">Navigace</w:t>
-      </w:r>
-    </w:p>
-    <w:p>
-      <w:pPr>
-        <w:pStyle w:val="Obsah3"/>
-      </w:pPr>
-      <w:r>
-        <w:rPr/>
-        <w:t xml:space="preserve">3.4.3</w:t>
+        <w:t xml:space="preserve">Rychlost</w:t>
+      </w:r>
+    </w:p>
+    <w:p>
+      <w:pPr>
+        <w:pStyle w:val="Obsah2"/>
+      </w:pPr>
+      <w:r>
+        <w:rPr/>
+        <w:t xml:space="preserve">4.4</w:t>
       </w:r>
       <w:r>
         <w:tab/>
       </w:r>
       <w:r>
         <w:rPr/>
-        <w:t xml:space="preserve">Datový model</w:t>
+        <w:t xml:space="preserve">Validita kódu</w:t>
+      </w:r>
+    </w:p>
+    <w:p>
+      <w:pPr>
+        <w:pStyle w:val="Obsah1"/>
+      </w:pPr>
+      <w:r>
+        <w:rPr/>
+        <w:t xml:space="preserve">5</w:t>
+      </w:r>
+      <w:r>
+        <w:tab/>
+      </w:r>
+      <w:r>
+        <w:rPr/>
+        <w:t xml:space="preserve">Závěr</w:t>
+      </w:r>
+    </w:p>
+    <w:p>
+      <w:pPr>
+        <w:pStyle w:val="Obsah1"/>
+      </w:pPr>
+      <w:r>
+        <w:rPr/>
+        <w:t xml:space="preserve">6</w:t>
+      </w:r>
+      <w:r>
+        <w:tab/>
+      </w:r>
+      <w:r>
+        <w:rPr/>
+        <w:t xml:space="preserve">Seznam použitých zdrojů</w:t>
+      </w:r>
+    </w:p>
+    <w:p>
+      <w:pPr>
+        <w:pStyle w:val="Obsah1"/>
+      </w:pPr>
+      <w:r>
+        <w:rPr/>
+        <w:t xml:space="preserve">7</w:t>
+      </w:r>
+      <w:r>
+        <w:tab/>
+      </w:r>
+      <w:r>
+        <w:rPr/>
+        <w:t xml:space="preserve">Seznam obrázků, tabulek, grafů a zkratek</w:t>
       </w:r>
     </w:p>
     <w:p>
@@ -842,14 +1082,14 @@
       </w:pPr>
       <w:r>
         <w:rPr/>
-        <w:t xml:space="preserve">3.5</w:t>
+        <w:t xml:space="preserve">7.1</w:t>
       </w:r>
       <w:r>
         <w:tab/>
       </w:r>
       <w:r>
         <w:rPr/>
-        <w:t xml:space="preserve">Wireframy</w:t>
+        <w:t xml:space="preserve">Seznam obrázků</w:t>
       </w:r>
     </w:p>
     <w:p>
@@ -858,14 +1098,14 @@
       </w:pPr>
       <w:r>
         <w:rPr/>
-        <w:t xml:space="preserve">3.6</w:t>
+        <w:t xml:space="preserve">7.2</w:t>
       </w:r>
       <w:r>
         <w:tab/>
       </w:r>
       <w:r>
         <w:rPr/>
-        <w:t xml:space="preserve">Klíčová slova</w:t>
+        <w:t xml:space="preserve">Seznam tabulek</w:t>
       </w:r>
     </w:p>
     <w:p>
@@ -874,30 +1114,14 @@
       </w:pPr>
       <w:r>
         <w:rPr/>
-        <w:t xml:space="preserve">3.7</w:t>
+        <w:t xml:space="preserve">7.3</w:t>
       </w:r>
       <w:r>
         <w:tab/>
       </w:r>
       <w:r>
         <w:rPr/>
-        <w:t xml:space="preserve">SEO strategie</w:t>
-      </w:r>
-    </w:p>
-    <w:p>
-      <w:pPr>
-        <w:pStyle w:val="Obsah1"/>
-      </w:pPr>
-      <w:r>
-        <w:rPr/>
-        <w:t xml:space="preserve">4</w:t>
-      </w:r>
-      <w:r>
-        <w:tab/>
-      </w:r>
-      <w:r>
-        <w:rPr/>
-        <w:t xml:space="preserve">Realizace</w:t>
+        <w:t xml:space="preserve">Seznam grafů</w:t>
       </w:r>
     </w:p>
     <w:p>
@@ -906,295 +1130,7 @@
       </w:pPr>
       <w:r>
         <w:rPr/>
-        <w:t xml:space="preserve">4.1</w:t>
-      </w:r>
-      <w:r>
-        <w:tab/>
-      </w:r>
-      <w:r>
-        <w:rPr/>
-        <w:t xml:space="preserve">Použité technologie</w:t>
-      </w:r>
-    </w:p>
-    <w:p>
-      <w:pPr>
-        <w:pStyle w:val="Obsah2"/>
-      </w:pPr>
-      <w:r>
-        <w:rPr/>
-        <w:t xml:space="preserve">4.2</w:t>
-      </w:r>
-      <w:r>
-        <w:tab/>
-      </w:r>
-      <w:r>
-        <w:rPr/>
-        <w:t xml:space="preserve">Struktura projektu</w:t>
-      </w:r>
-    </w:p>
-    <w:p>
-      <w:pPr>
-        <w:pStyle w:val="Obsah2"/>
-      </w:pPr>
-      <w:r>
-        <w:rPr/>
-        <w:t xml:space="preserve">4.3</w:t>
-      </w:r>
-      <w:r>
-        <w:tab/>
-      </w:r>
-      <w:r>
-        <w:rPr/>
-        <w:t xml:space="preserve">Responzivní design</w:t>
-      </w:r>
-    </w:p>
-    <w:p>
-      <w:pPr>
-        <w:pStyle w:val="Obsah2"/>
-      </w:pPr>
-      <w:r>
-        <w:rPr/>
-        <w:t xml:space="preserve">4.4</w:t>
-      </w:r>
-      <w:r>
-        <w:tab/>
-      </w:r>
-      <w:r>
-        <w:rPr/>
-        <w:t xml:space="preserve">Serverová část v PHP</w:t>
-      </w:r>
-    </w:p>
-    <w:p>
-      <w:pPr>
-        <w:pStyle w:val="Obsah2"/>
-      </w:pPr>
-      <w:r>
-        <w:rPr/>
-        <w:t xml:space="preserve">4.5</w:t>
-      </w:r>
-      <w:r>
-        <w:tab/>
-      </w:r>
-      <w:r>
-        <w:rPr/>
-        <w:t xml:space="preserve">AJAX</w:t>
-      </w:r>
-    </w:p>
-    <w:p>
-      <w:pPr>
-        <w:pStyle w:val="Obsah2"/>
-      </w:pPr>
-      <w:r>
-        <w:rPr/>
-        <w:t xml:space="preserve">4.6</w:t>
-      </w:r>
-      <w:r>
-        <w:tab/>
-      </w:r>
-      <w:r>
-        <w:rPr/>
-        <w:t xml:space="preserve">API třetích stran</w:t>
-      </w:r>
-    </w:p>
-    <w:p>
-      <w:pPr>
-        <w:pStyle w:val="Obsah2"/>
-      </w:pPr>
-      <w:r>
-        <w:rPr/>
-        <w:t xml:space="preserve">4.7</w:t>
-      </w:r>
-      <w:r>
-        <w:tab/>
-      </w:r>
-      <w:r>
-        <w:rPr/>
-        <w:t xml:space="preserve">Co zbývá dokončit</w:t>
-      </w:r>
-    </w:p>
-    <w:p>
-      <w:pPr>
-        <w:pStyle w:val="Obsah1"/>
-      </w:pPr>
-      <w:r>
-        <w:rPr/>
-        <w:t xml:space="preserve">5</w:t>
-      </w:r>
-      <w:r>
-        <w:tab/>
-      </w:r>
-      <w:r>
-        <w:rPr/>
-        <w:t xml:space="preserve">Testování a analýzy</w:t>
-      </w:r>
-    </w:p>
-    <w:p>
-      <w:pPr>
-        <w:pStyle w:val="Obsah2"/>
-      </w:pPr>
-      <w:r>
-        <w:rPr/>
-        <w:t xml:space="preserve">5.1</w:t>
-      </w:r>
-      <w:r>
-        <w:tab/>
-      </w:r>
-      <w:r>
-        <w:rPr/>
-        <w:t xml:space="preserve">Použitelnost</w:t>
-      </w:r>
-    </w:p>
-    <w:p>
-      <w:pPr>
-        <w:pStyle w:val="Obsah2"/>
-      </w:pPr>
-      <w:r>
-        <w:rPr/>
-        <w:t xml:space="preserve">5.2</w:t>
-      </w:r>
-      <w:r>
-        <w:tab/>
-      </w:r>
-      <w:r>
-        <w:rPr/>
-        <w:t xml:space="preserve">Přístupnost</w:t>
-      </w:r>
-    </w:p>
-    <w:p>
-      <w:pPr>
-        <w:pStyle w:val="Obsah2"/>
-      </w:pPr>
-      <w:r>
-        <w:rPr/>
-        <w:t xml:space="preserve">5.3</w:t>
-      </w:r>
-      <w:r>
-        <w:tab/>
-      </w:r>
-      <w:r>
-        <w:rPr/>
-        <w:t xml:space="preserve">Rychlost</w:t>
-      </w:r>
-    </w:p>
-    <w:p>
-      <w:pPr>
-        <w:pStyle w:val="Obsah2"/>
-      </w:pPr>
-      <w:r>
-        <w:rPr/>
-        <w:t xml:space="preserve">5.4</w:t>
-      </w:r>
-      <w:r>
-        <w:tab/>
-      </w:r>
-      <w:r>
-        <w:rPr/>
-        <w:t xml:space="preserve">Validita kódu</w:t>
-      </w:r>
-    </w:p>
-    <w:p>
-      <w:pPr>
-        <w:pStyle w:val="Obsah1"/>
-      </w:pPr>
-      <w:r>
-        <w:rPr/>
-        <w:t xml:space="preserve">6</w:t>
-      </w:r>
-      <w:r>
-        <w:tab/>
-      </w:r>
-      <w:r>
-        <w:rPr/>
-        <w:t xml:space="preserve">Závěr</w:t>
-      </w:r>
-    </w:p>
-    <w:p>
-      <w:pPr>
-        <w:pStyle w:val="Obsah1"/>
-      </w:pPr>
-      <w:r>
-        <w:rPr/>
-        <w:t xml:space="preserve">7</w:t>
-      </w:r>
-      <w:r>
-        <w:tab/>
-      </w:r>
-      <w:r>
-        <w:rPr/>
-        <w:t xml:space="preserve">Seznam použitých zdrojů</w:t>
-      </w:r>
-    </w:p>
-    <w:p>
-      <w:pPr>
-        <w:pStyle w:val="Obsah1"/>
-      </w:pPr>
-      <w:r>
-        <w:rPr/>
-        <w:t xml:space="preserve">8</w:t>
-      </w:r>
-      <w:r>
-        <w:tab/>
-      </w:r>
-      <w:r>
-        <w:rPr/>
-        <w:t xml:space="preserve">Seznam obrázků, tabulek, grafů a zkratek</w:t>
-      </w:r>
-    </w:p>
-    <w:p>
-      <w:pPr>
-        <w:pStyle w:val="Obsah2"/>
-      </w:pPr>
-      <w:r>
-        <w:rPr/>
-        <w:t xml:space="preserve">8.1</w:t>
-      </w:r>
-      <w:r>
-        <w:tab/>
-      </w:r>
-      <w:r>
-        <w:rPr/>
-        <w:t xml:space="preserve">Seznam obrázků</w:t>
-      </w:r>
-    </w:p>
-    <w:p>
-      <w:pPr>
-        <w:pStyle w:val="Obsah2"/>
-      </w:pPr>
-      <w:r>
-        <w:rPr/>
-        <w:t xml:space="preserve">8.2</w:t>
-      </w:r>
-      <w:r>
-        <w:tab/>
-      </w:r>
-      <w:r>
-        <w:rPr/>
-        <w:t xml:space="preserve">Seznam tabulek</w:t>
-      </w:r>
-    </w:p>
-    <w:p>
-      <w:pPr>
-        <w:pStyle w:val="Obsah2"/>
-      </w:pPr>
-      <w:r>
-        <w:rPr/>
-        <w:t xml:space="preserve">8.3</w:t>
-      </w:r>
-      <w:r>
-        <w:tab/>
-      </w:r>
-      <w:r>
-        <w:rPr/>
-        <w:t xml:space="preserve">Seznam grafů</w:t>
-      </w:r>
-    </w:p>
-    <w:p>
-      <w:pPr>
-        <w:pStyle w:val="Obsah2"/>
-      </w:pPr>
-      <w:r>
-        <w:rPr/>
-        <w:t xml:space="preserve">8.4</w:t>
+        <w:t xml:space="preserve">7.4</w:t>
       </w:r>
       <w:r>
         <w:tab/>
@@ -1294,7 +1230,7 @@
       </w:r>
       <w:r>
         <w:rPr/>
-        <w:t xml:space="preserve">Cíl práce a metodika</w:t>
+        <w:t xml:space="preserve">Úvodní studie</w:t>
       </w:r>
     </w:p>
     <w:p>
@@ -1304,7 +1240,7 @@
       </w:pPr>
       <w:r>
         <w:rPr/>
-        <w:t xml:space="preserve">Cíl práce</w:t>
+        <w:t xml:space="preserve">Analýza současného stavu</w:t>
       </w:r>
     </w:p>
     <w:p>
@@ -1315,17 +1251,17 @@
       </w:pPr>
       <w:r>
         <w:rPr/>
-        <w:t xml:space="preserve">Cílem je navrhnout a vytvořit plně responzivní web pro hlášení ztracených a nalezených věcí v areálu ČZU. Web má rozlišovat tři typy uživatelů (nepřihlášený, přihlášený a administrátor), stránky vykresluje PHP na serveru, výpis načítá data přes AJAX a mapu zajišťuje API třetí strany. Součástí práce je i otestování použitelnosti, přístupnosti, rychlosti a validity kódu.</w:t>
-      </w:r>
-    </w:p>
-    <w:p>
-      <w:pPr>
-        <w:pStyle w:val="Nadpis2"/>
+        <w:t xml:space="preserve">Než jsme začali cokoliv navrhovat, podívali jsme se, jak to na ČZU funguje teď. Našli jsme tři místa, kde se ztráty a nálezy řeší.</w:t>
+      </w:r>
+    </w:p>
+    <w:p>
+      <w:pPr>
+        <w:pStyle w:val="Nadpis3"/>
         <w:keepNext/>
       </w:pPr>
       <w:r>
         <w:rPr/>
-        <w:t xml:space="preserve">Metodika</w:t>
+        <w:t xml:space="preserve">Knihovna ČZU</w:t>
       </w:r>
     </w:p>
     <w:p>
@@ -1336,7 +1272,70 @@
       </w:pPr>
       <w:r>
         <w:rPr/>
-        <w:t xml:space="preserve">Postupovali jsme v těchto krocích:</w:t>
+        <w:t xml:space="preserve">Knihovna má na svém webu stránku se seznamem nalezených věcí. Je to tabulka s pořadovým číslem, popisem předmětu, místem a datem nálezu a sloupcem Kontrola, podle kterého se knihovna při výdeji ptá, aby věc dostal opravdu majitel. Seznam ale vede jen knihovna a týká se jen jejích prostor. Nedá se v něm vyhledávat ani filtrovat a ztrátu do něj student nahlásit nemůže.</w:t>
+      </w:r>
+    </w:p>
+    <w:p>
+      <w:pPr>
+        <w:pStyle w:val="Nadpis3"/>
+        <w:keepNext/>
+      </w:pPr>
+      <w:r>
+        <w:rPr/>
+        <w:t xml:space="preserve">Správa učeben PEF</w:t>
+      </w:r>
+    </w:p>
+    <w:p>
+      <w:pPr>
+        <w:spacing w:line="360" w:lineRule="auto"/>
+        <w:ind w:firstLine="567"/>
+        <w:jc w:val="both"/>
+      </w:pPr>
+      <w:r>
+        <w:rPr/>
+        <w:t xml:space="preserve">Na webu PEF je jen krátká informace, že nalezené věci z budovy fakulty se schraňují v kanceláři E250 a po roce se likvidují. Seznam věcí online není, takže student musí přijít osobně nebo napsat a zeptat se.</w:t>
+      </w:r>
+    </w:p>
+    <w:p>
+      <w:pPr>
+        <w:pStyle w:val="Nadpis3"/>
+        <w:keepNext/>
+      </w:pPr>
+      <w:r>
+        <w:rPr/>
+        <w:t xml:space="preserve">Facebooková skupina</w:t>
+      </w:r>
+    </w:p>
+    <w:p>
+      <w:pPr>
+        <w:spacing w:line="360" w:lineRule="auto"/>
+        <w:ind w:firstLine="567"/>
+        <w:jc w:val="both"/>
+      </w:pPr>
+      <w:r>
+        <w:rPr/>
+        <w:t xml:space="preserve">Nejvíc se toho děje ve facebookové skupině, kam studenti píšou, co ztratili nebo našli. Příspěvky ale rychle zapadnou mezi ostatní, nejde je filtrovat podle místa ani typu věci a ne každý student Facebook používá.</w:t>
+      </w:r>
+    </w:p>
+    <w:p>
+      <w:pPr>
+        <w:pStyle w:val="Nadpis3"/>
+        <w:keepNext/>
+      </w:pPr>
+      <w:r>
+        <w:rPr/>
+        <w:t xml:space="preserve">Shrnutí</w:t>
+      </w:r>
+    </w:p>
+    <w:p>
+      <w:pPr>
+        <w:spacing w:line="360" w:lineRule="auto"/>
+        <w:ind w:firstLine="567"/>
+        <w:jc w:val="both"/>
+      </w:pPr>
+      <w:r>
+        <w:rPr/>
+        <w:t xml:space="preserve">Z analýzy vychází tyto problémy:</w:t>
       </w:r>
     </w:p>
     <w:p>
@@ -1350,7 +1349,7 @@
       </w:pPr>
       <w:r>
         <w:rPr/>
-        <w:t xml:space="preserve">analýza současného stavu, tedy jak se ztráty a nálezy na ČZU řeší dnes,</w:t>
+        <w:t xml:space="preserve">informace jsou rozházené po budovách a různých kanálech,</w:t>
       </w:r>
     </w:p>
     <w:p>
@@ -1364,7 +1363,7 @@
       </w:pPr>
       <w:r>
         <w:rPr/>
-        <w:t xml:space="preserve">návrh rolí, struktury webu a datového modelu,</w:t>
+        <w:t xml:space="preserve">vyhledávat se dá jen ručně a v každém zdroji zvlášť,</w:t>
       </w:r>
     </w:p>
     <w:p>
@@ -1378,7 +1377,7 @@
       </w:pPr>
       <w:r>
         <w:rPr/>
-        <w:t xml:space="preserve">wireframy hlavních obrazovek pro počítač i mobil,</w:t>
+        <w:t xml:space="preserve">ztrátu jde nahlásit jen na Facebooku, oficiální stránky řeší jen nálezy,</w:t>
       </w:r>
     </w:p>
     <w:p>
@@ -1392,35 +1391,7 @@
       </w:pPr>
       <w:r>
         <w:rPr/>
-        <w:t xml:space="preserve">výběr frází, které lidé hledají, a návrh SEO,</w:t>
-      </w:r>
-    </w:p>
-    <w:p>
-      <w:pPr>
-        <w:pStyle w:val="Odstavecseseznamem"/>
-        <w:numPr>
-          <w:ilvl w:val="0"/>
-          <w:numId w:val="2"/>
-        </w:numPr>
-        <w:spacing w:line="360" w:lineRule="auto"/>
-      </w:pPr>
-      <w:r>
-        <w:rPr/>
-        <w:t xml:space="preserve">vývoj po menších částech, kdy jsme každou část hned zkoušeli v prohlížeči na počítači i na mobilu,</w:t>
-      </w:r>
-    </w:p>
-    <w:p>
-      <w:pPr>
-        <w:pStyle w:val="Odstavecseseznamem"/>
-        <w:numPr>
-          <w:ilvl w:val="0"/>
-          <w:numId w:val="2"/>
-        </w:numPr>
-        <w:spacing w:line="360" w:lineRule="auto"/>
-      </w:pPr>
-      <w:r>
-        <w:rPr/>
-        <w:t xml:space="preserve">testování nástroji Lighthouse, WAVE, PageSpeed Insights a validátory W3C a test použitelnosti se spolužáky.</w:t>
+        <w:t xml:space="preserve">chybí mapa a není poznat, jestli se věc už vrátila majiteli.</w:t>
       </w:r>
     </w:p>
     <w:p>
@@ -1431,7 +1402,7 @@
       </w:pPr>
       <w:r>
         <w:rPr/>
-        <w:t xml:space="preserve">Zdrojový kód i dokumentaci máme v jednom repozitáři na GitHubu (github.com/TomasDevs/ztraty-nalezy-czu). Každá změna má vlastní commit, takže je vidět, kdo a kdy co udělal.</w:t>
+        <w:t xml:space="preserve">Z knihovny jsme si naopak vzali dvě dobré věci: evidenční číslo u každé věci a kontrolní otázku, podle které se ověří majitel.</w:t>
       </w:r>
     </w:p>
     <w:p>
@@ -1441,7 +1412,72 @@
       </w:pPr>
       <w:r>
         <w:rPr/>
-        <w:t xml:space="preserve">Rozdělení práce v týmu</w:t>
+        <w:t xml:space="preserve">Idea projektu</w:t>
+      </w:r>
+    </w:p>
+    <w:p>
+      <w:pPr>
+        <w:spacing w:line="360" w:lineRule="auto"/>
+        <w:ind w:firstLine="567"/>
+        <w:jc w:val="both"/>
+      </w:pPr>
+      <w:r>
+        <w:rPr/>
+        <w:t xml:space="preserve">Ztráty a nálezy ČZU je web, kde jsou všechny ztracené a nalezené věci z kampusu na jednom místě. Každá věc má vlastní inzerát s popisem, fotkou, budovou, přesným místem na mapě a datem. Inzeráty jde filtrovat podle typu (ztráta, nebo nález), kategorie a budovy a hledat v nich podle textu.</w:t>
+      </w:r>
+    </w:p>
+    <w:p>
+      <w:pPr>
+        <w:spacing w:line="360" w:lineRule="auto"/>
+        <w:ind w:firstLine="567"/>
+        <w:jc w:val="both"/>
+      </w:pPr>
+      <w:r>
+        <w:rPr/>
+        <w:t xml:space="preserve">Kdo věc našel, založí inzerát a majitel ho kontaktuje přes formulář. Funguje to i obráceně: kdo něco ztratil, založí inzerát a nálezce mu napíše. E-mailové adresy se v inzerátech nezobrazují. Když se věc vrátí, autor ji označí jako vrácenou.</w:t>
+      </w:r>
+    </w:p>
+    <w:p>
+      <w:pPr>
+        <w:spacing w:line="360" w:lineRule="auto"/>
+        <w:ind w:firstLine="567"/>
+        <w:jc w:val="both"/>
+      </w:pPr>
+      <w:r>
+        <w:rPr/>
+        <w:t xml:space="preserve">Web je hlavně pro studenty ČZU, ale použít ho můžou i zaměstnanci a návštěvníci kampusu. Do budoucna by se mohla zapojit i pracoviště, která nálezy schraňují už dnes, třeba knihovna nebo Správa učeben.</w:t>
+      </w:r>
+    </w:p>
+    <w:p>
+      <w:pPr>
+        <w:spacing w:line="360" w:lineRule="auto"/>
+        <w:ind w:firstLine="567"/>
+        <w:jc w:val="both"/>
+      </w:pPr>
+      <w:r>
+        <w:rPr/>
+        <w:t xml:space="preserve">U dokladů (ISIC, občanský průkaz) web fotku nikdy nezobrazí. Fotka by prozradila osobní údaje a komukoliv by usnadnila vyzvednout si cizí doklad.</w:t>
+      </w:r>
+    </w:p>
+    <w:p>
+      <w:pPr>
+        <w:pStyle w:val="Nadpis2"/>
+        <w:keepNext/>
+      </w:pPr>
+      <w:r>
+        <w:rPr/>
+        <w:t xml:space="preserve">Uživatelské role</w:t>
+      </w:r>
+    </w:p>
+    <w:p>
+      <w:pPr>
+        <w:spacing w:line="360" w:lineRule="auto"/>
+        <w:ind w:firstLine="567"/>
+        <w:jc w:val="both"/>
+      </w:pPr>
+      <w:r>
+        <w:rPr/>
+        <w:t xml:space="preserve">Web rozlišuje tři úrovně uživatelů. Co která role smí, je v tabulce 1.</w:t>
       </w:r>
     </w:p>
     <w:p>
@@ -1455,528 +1491,6 @@
           <w:b/>
         </w:rPr>
         <w:t xml:space="preserve">Tabulka 1: </w:t>
-      </w:r>
-      <w:r>
-        <w:rPr>
-          <w:sz w:val="22"/>
-        </w:rPr>
-        <w:t xml:space="preserve">Rozdělení práce</w:t>
-      </w:r>
-    </w:p>
-    <w:tbl>
-      <w:tblPr>
-        <w:tblStyle w:val="Mkatabulky"/>
-        <w:tblW w:w="8788" w:type="dxa"/>
-        <w:tblLayout w:type="fixed"/>
-      </w:tblPr>
-      <w:tblGrid>
-        <w:gridCol w:w="2636"/>
-        <w:gridCol w:w="6152"/>
-      </w:tblGrid>
-      <w:tr>
-        <w:trPr>
-          <w:tblHeader/>
-        </w:trPr>
-        <w:tc>
-          <w:tcPr>
-            <w:tcW w:w="2636" w:type="dxa"/>
-            <w:shd w:val="clear" w:color="auto" w:fill="EDEBE4"/>
-          </w:tcPr>
-          <w:p>
-            <w:pPr>
-              <w:spacing w:before="40" w:after="40"/>
-            </w:pPr>
-            <w:r>
-              <w:rPr>
-                <w:sz w:val="22"/>
-                <w:b/>
-              </w:rPr>
-              <w:t xml:space="preserve">Člen týmu</w:t>
-            </w:r>
-          </w:p>
-        </w:tc>
-        <w:tc>
-          <w:tcPr>
-            <w:tcW w:w="6152" w:type="dxa"/>
-            <w:shd w:val="clear" w:color="auto" w:fill="EDEBE4"/>
-          </w:tcPr>
-          <w:p>
-            <w:pPr>
-              <w:spacing w:before="40" w:after="40"/>
-            </w:pPr>
-            <w:r>
-              <w:rPr>
-                <w:sz w:val="22"/>
-                <w:b/>
-              </w:rPr>
-              <w:t xml:space="preserve">Na čem pracuje</w:t>
-            </w:r>
-          </w:p>
-        </w:tc>
-      </w:tr>
-      <w:tr>
-        <w:tc>
-          <w:tcPr>
-            <w:tcW w:w="2636" w:type="dxa"/>
-          </w:tcPr>
-          <w:p>
-            <w:pPr>
-              <w:spacing w:before="40" w:after="40"/>
-            </w:pPr>
-            <w:r>
-              <w:rPr>
-                <w:sz w:val="22"/>
-              </w:rPr>
-              <w:t xml:space="preserve">Tomáš Štveráček</w:t>
-            </w:r>
-          </w:p>
-        </w:tc>
-        <w:tc>
-          <w:tcPr>
-            <w:tcW w:w="6152" w:type="dxa"/>
-          </w:tcPr>
-          <w:p>
-            <w:pPr>
-              <w:spacing w:before="40" w:after="40"/>
-            </w:pPr>
-            <w:r>
-              <w:rPr>
-                <w:sz w:val="22"/>
-              </w:rPr>
-              <w:t xml:space="preserve">úvodní studie, návrh vzhledu, frontend, část serverové části (výpis, detail, AJAX, mapa, SEO)</w:t>
-            </w:r>
-          </w:p>
-        </w:tc>
-      </w:tr>
-      <w:tr>
-        <w:tc>
-          <w:tcPr>
-            <w:tcW w:w="2636" w:type="dxa"/>
-          </w:tcPr>
-          <w:p>
-            <w:pPr>
-              <w:spacing w:before="40" w:after="40"/>
-            </w:pPr>
-            <w:r>
-              <w:rPr>
-                <w:sz w:val="22"/>
-              </w:rPr>
-              <w:t xml:space="preserve">Adam Cinke</w:t>
-            </w:r>
-          </w:p>
-        </w:tc>
-        <w:tc>
-          <w:tcPr>
-            <w:tcW w:w="6152" w:type="dxa"/>
-          </w:tcPr>
-          <w:p>
-            <w:pPr>
-              <w:spacing w:before="40" w:after="40"/>
-            </w:pPr>
-            <w:r>
-              <w:rPr>
-                <w:sz w:val="22"/>
-                <w:highlight w:val="yellow"/>
-              </w:rPr>
-              <w:t xml:space="preserve">DOPLNIT</w:t>
-            </w:r>
-          </w:p>
-        </w:tc>
-      </w:tr>
-      <w:tr>
-        <w:tc>
-          <w:tcPr>
-            <w:tcW w:w="2636" w:type="dxa"/>
-          </w:tcPr>
-          <w:p>
-            <w:pPr>
-              <w:spacing w:before="40" w:after="40"/>
-            </w:pPr>
-            <w:r>
-              <w:rPr>
-                <w:sz w:val="22"/>
-              </w:rPr>
-              <w:t xml:space="preserve">Josef Fryč</w:t>
-            </w:r>
-          </w:p>
-        </w:tc>
-        <w:tc>
-          <w:tcPr>
-            <w:tcW w:w="6152" w:type="dxa"/>
-          </w:tcPr>
-          <w:p>
-            <w:pPr>
-              <w:spacing w:before="40" w:after="40"/>
-            </w:pPr>
-            <w:r>
-              <w:rPr>
-                <w:sz w:val="22"/>
-                <w:highlight w:val="yellow"/>
-              </w:rPr>
-              <w:t xml:space="preserve">DOPLNIT</w:t>
-            </w:r>
-          </w:p>
-        </w:tc>
-      </w:tr>
-      <w:tr>
-        <w:tc>
-          <w:tcPr>
-            <w:tcW w:w="2636" w:type="dxa"/>
-          </w:tcPr>
-          <w:p>
-            <w:pPr>
-              <w:spacing w:before="40" w:after="40"/>
-            </w:pPr>
-            <w:r>
-              <w:rPr>
-                <w:sz w:val="22"/>
-              </w:rPr>
-              <w:t xml:space="preserve">Lukáš Hanek</w:t>
-            </w:r>
-          </w:p>
-        </w:tc>
-        <w:tc>
-          <w:tcPr>
-            <w:tcW w:w="6152" w:type="dxa"/>
-          </w:tcPr>
-          <w:p>
-            <w:pPr>
-              <w:spacing w:before="40" w:after="40"/>
-            </w:pPr>
-            <w:r>
-              <w:rPr>
-                <w:sz w:val="22"/>
-                <w:highlight w:val="yellow"/>
-              </w:rPr>
-              <w:t xml:space="preserve">DOPLNIT</w:t>
-            </w:r>
-          </w:p>
-        </w:tc>
-      </w:tr>
-      <w:tr>
-        <w:tc>
-          <w:tcPr>
-            <w:tcW w:w="2636" w:type="dxa"/>
-          </w:tcPr>
-          <w:p>
-            <w:pPr>
-              <w:spacing w:before="40" w:after="40"/>
-            </w:pPr>
-            <w:r>
-              <w:rPr>
-                <w:sz w:val="22"/>
-              </w:rPr>
-              <w:t xml:space="preserve">Ahmad Altallaa</w:t>
-            </w:r>
-          </w:p>
-        </w:tc>
-        <w:tc>
-          <w:tcPr>
-            <w:tcW w:w="6152" w:type="dxa"/>
-          </w:tcPr>
-          <w:p>
-            <w:pPr>
-              <w:spacing w:before="40" w:after="40"/>
-            </w:pPr>
-            <w:r>
-              <w:rPr>
-                <w:sz w:val="22"/>
-                <w:highlight w:val="yellow"/>
-              </w:rPr>
-              <w:t xml:space="preserve">DOPLNIT</w:t>
-            </w:r>
-          </w:p>
-        </w:tc>
-      </w:tr>
-    </w:tbl>
-    <w:p>
-      <w:pPr>
-        <w:spacing w:line="360" w:lineRule="auto"/>
-        <w:ind w:firstLine="567"/>
-        <w:jc w:val="both"/>
-      </w:pPr>
-      <w:r>
-        <w:rPr/>
-        <w:t xml:space="preserve">Přihlášení uživatelů, role a administraci si bere na starost kolega z týmu, který se věnuje backendu. </w:t>
-      </w:r>
-      <w:r>
-        <w:rPr>
-          <w:highlight w:val="yellow"/>
-        </w:rPr>
-        <w:t xml:space="preserve">DOPLNIT: jméno</w:t>
-      </w:r>
-    </w:p>
-    <w:p>
-      <w:pPr>
-        <w:pStyle w:val="Nadpis1"/>
-        <w:keepNext/>
-      </w:pPr>
-      <w:r>
-        <w:br w:type="page"/>
-      </w:r>
-      <w:r>
-        <w:rPr/>
-        <w:t xml:space="preserve">Úvodní studie</w:t>
-      </w:r>
-    </w:p>
-    <w:p>
-      <w:pPr>
-        <w:pStyle w:val="Nadpis2"/>
-        <w:keepNext/>
-      </w:pPr>
-      <w:r>
-        <w:rPr/>
-        <w:t xml:space="preserve">Analýza současného stavu</w:t>
-      </w:r>
-    </w:p>
-    <w:p>
-      <w:pPr>
-        <w:spacing w:line="360" w:lineRule="auto"/>
-        <w:ind w:firstLine="567"/>
-        <w:jc w:val="both"/>
-      </w:pPr>
-      <w:r>
-        <w:rPr/>
-        <w:t xml:space="preserve">Než jsme začali cokoliv navrhovat, podívali jsme se, jak to na ČZU funguje teď. Našli jsme tři místa, kde se ztráty a nálezy řeší.</w:t>
-      </w:r>
-    </w:p>
-    <w:p>
-      <w:pPr>
-        <w:pStyle w:val="Nadpis3"/>
-        <w:keepNext/>
-      </w:pPr>
-      <w:r>
-        <w:rPr/>
-        <w:t xml:space="preserve">Knihovna ČZU</w:t>
-      </w:r>
-    </w:p>
-    <w:p>
-      <w:pPr>
-        <w:spacing w:line="360" w:lineRule="auto"/>
-        <w:ind w:firstLine="567"/>
-        <w:jc w:val="both"/>
-      </w:pPr>
-      <w:r>
-        <w:rPr/>
-        <w:t xml:space="preserve">Knihovna má na svém webu stránku se seznamem nalezených věcí. Je to tabulka s pořadovým číslem, popisem předmětu, místem a datem nálezu a sloupcem Kontrola, podle kterého se knihovna při výdeji ptá, aby věc dostal opravdu majitel. Seznam ale vede jen knihovna a týká se jen jejích prostor. Nedá se v něm vyhledávat ani filtrovat a ztrátu do něj student nahlásit nemůže.</w:t>
-      </w:r>
-    </w:p>
-    <w:p>
-      <w:pPr>
-        <w:pStyle w:val="Nadpis3"/>
-        <w:keepNext/>
-      </w:pPr>
-      <w:r>
-        <w:rPr/>
-        <w:t xml:space="preserve">Správa učeben PEF</w:t>
-      </w:r>
-    </w:p>
-    <w:p>
-      <w:pPr>
-        <w:spacing w:line="360" w:lineRule="auto"/>
-        <w:ind w:firstLine="567"/>
-        <w:jc w:val="both"/>
-      </w:pPr>
-      <w:r>
-        <w:rPr/>
-        <w:t xml:space="preserve">Na webu PEF je jen krátká informace, že nalezené věci z budovy fakulty se schraňují v kanceláři E250 a po roce se likvidují. Seznam věcí online není, takže student musí přijít osobně nebo napsat a zeptat se.</w:t>
-      </w:r>
-    </w:p>
-    <w:p>
-      <w:pPr>
-        <w:pStyle w:val="Nadpis3"/>
-        <w:keepNext/>
-      </w:pPr>
-      <w:r>
-        <w:rPr/>
-        <w:t xml:space="preserve">Facebooková skupina</w:t>
-      </w:r>
-    </w:p>
-    <w:p>
-      <w:pPr>
-        <w:spacing w:line="360" w:lineRule="auto"/>
-        <w:ind w:firstLine="567"/>
-        <w:jc w:val="both"/>
-      </w:pPr>
-      <w:r>
-        <w:rPr/>
-        <w:t xml:space="preserve">Nejvíc se toho děje ve facebookové skupině, kam studenti píšou, co ztratili nebo našli. Příspěvky ale rychle zapadnou mezi ostatní, nejde je filtrovat podle místa ani typu věci a ne každý student Facebook používá.</w:t>
-      </w:r>
-    </w:p>
-    <w:p>
-      <w:pPr>
-        <w:pStyle w:val="Nadpis3"/>
-        <w:keepNext/>
-      </w:pPr>
-      <w:r>
-        <w:rPr/>
-        <w:t xml:space="preserve">Shrnutí</w:t>
-      </w:r>
-    </w:p>
-    <w:p>
-      <w:pPr>
-        <w:spacing w:line="360" w:lineRule="auto"/>
-        <w:ind w:firstLine="567"/>
-        <w:jc w:val="both"/>
-      </w:pPr>
-      <w:r>
-        <w:rPr/>
-        <w:t xml:space="preserve">Z analýzy vychází tyto problémy:</w:t>
-      </w:r>
-    </w:p>
-    <w:p>
-      <w:pPr>
-        <w:pStyle w:val="Odstavecseseznamem"/>
-        <w:numPr>
-          <w:ilvl w:val="0"/>
-          <w:numId w:val="2"/>
-        </w:numPr>
-        <w:spacing w:line="360" w:lineRule="auto"/>
-      </w:pPr>
-      <w:r>
-        <w:rPr/>
-        <w:t xml:space="preserve">informace jsou rozházené po budovách a různých kanálech,</w:t>
-      </w:r>
-    </w:p>
-    <w:p>
-      <w:pPr>
-        <w:pStyle w:val="Odstavecseseznamem"/>
-        <w:numPr>
-          <w:ilvl w:val="0"/>
-          <w:numId w:val="2"/>
-        </w:numPr>
-        <w:spacing w:line="360" w:lineRule="auto"/>
-      </w:pPr>
-      <w:r>
-        <w:rPr/>
-        <w:t xml:space="preserve">vyhledávat se dá jen ručně a v každém zdroji zvlášť,</w:t>
-      </w:r>
-    </w:p>
-    <w:p>
-      <w:pPr>
-        <w:pStyle w:val="Odstavecseseznamem"/>
-        <w:numPr>
-          <w:ilvl w:val="0"/>
-          <w:numId w:val="2"/>
-        </w:numPr>
-        <w:spacing w:line="360" w:lineRule="auto"/>
-      </w:pPr>
-      <w:r>
-        <w:rPr/>
-        <w:t xml:space="preserve">ztrátu jde nahlásit jen na Facebooku, oficiální stránky řeší jen nálezy,</w:t>
-      </w:r>
-    </w:p>
-    <w:p>
-      <w:pPr>
-        <w:pStyle w:val="Odstavecseseznamem"/>
-        <w:numPr>
-          <w:ilvl w:val="0"/>
-          <w:numId w:val="2"/>
-        </w:numPr>
-        <w:spacing w:line="360" w:lineRule="auto"/>
-      </w:pPr>
-      <w:r>
-        <w:rPr/>
-        <w:t xml:space="preserve">chybí mapa a není poznat, jestli se věc už vrátila majiteli.</w:t>
-      </w:r>
-    </w:p>
-    <w:p>
-      <w:pPr>
-        <w:spacing w:line="360" w:lineRule="auto"/>
-        <w:ind w:firstLine="567"/>
-        <w:jc w:val="both"/>
-      </w:pPr>
-      <w:r>
-        <w:rPr/>
-        <w:t xml:space="preserve">Z knihovny jsme si naopak vzali dvě dobré věci: evidenční číslo u každé věci a kontrolní otázku, podle které se ověří majitel.</w:t>
-      </w:r>
-    </w:p>
-    <w:p>
-      <w:pPr>
-        <w:pStyle w:val="Nadpis2"/>
-        <w:keepNext/>
-      </w:pPr>
-      <w:r>
-        <w:rPr/>
-        <w:t xml:space="preserve">Idea projektu</w:t>
-      </w:r>
-    </w:p>
-    <w:p>
-      <w:pPr>
-        <w:spacing w:line="360" w:lineRule="auto"/>
-        <w:ind w:firstLine="567"/>
-        <w:jc w:val="both"/>
-      </w:pPr>
-      <w:r>
-        <w:rPr/>
-        <w:t xml:space="preserve">Ztráty a nálezy ČZU je web, kde jsou všechny ztracené a nalezené věci z kampusu na jednom místě. Každá věc má vlastní inzerát s popisem, fotkou, budovou, přesným místem na mapě a datem. Inzeráty jde filtrovat podle typu (ztráta, nebo nález), kategorie a budovy a hledat v nich podle textu.</w:t>
-      </w:r>
-    </w:p>
-    <w:p>
-      <w:pPr>
-        <w:spacing w:line="360" w:lineRule="auto"/>
-        <w:ind w:firstLine="567"/>
-        <w:jc w:val="both"/>
-      </w:pPr>
-      <w:r>
-        <w:rPr/>
-        <w:t xml:space="preserve">Kdo věc našel, založí inzerát a majitel ho kontaktuje přes formulář. Funguje to i obráceně: kdo něco ztratil, založí inzerát a nálezce mu napíše. E-mailové adresy se v inzerátech nezobrazují. Když se věc vrátí, autor ji označí jako vrácenou.</w:t>
-      </w:r>
-    </w:p>
-    <w:p>
-      <w:pPr>
-        <w:spacing w:line="360" w:lineRule="auto"/>
-        <w:ind w:firstLine="567"/>
-        <w:jc w:val="both"/>
-      </w:pPr>
-      <w:r>
-        <w:rPr/>
-        <w:t xml:space="preserve">Web je hlavně pro studenty ČZU, ale použít ho můžou i zaměstnanci a návštěvníci kampusu. Do budoucna by se mohla zapojit i pracoviště, která nálezy schraňují už dnes, třeba knihovna nebo Správa učeben.</w:t>
-      </w:r>
-    </w:p>
-    <w:p>
-      <w:pPr>
-        <w:spacing w:line="360" w:lineRule="auto"/>
-        <w:ind w:firstLine="567"/>
-        <w:jc w:val="both"/>
-      </w:pPr>
-      <w:r>
-        <w:rPr/>
-        <w:t xml:space="preserve">U dokladů (ISIC, občanský průkaz) web fotku nikdy nezobrazí. Fotka by prozradila osobní údaje a komukoliv by usnadnila vyzvednout si cizí doklad.</w:t>
-      </w:r>
-    </w:p>
-    <w:p>
-      <w:pPr>
-        <w:pStyle w:val="Nadpis2"/>
-        <w:keepNext/>
-      </w:pPr>
-      <w:r>
-        <w:rPr/>
-        <w:t xml:space="preserve">Uživatelské role</w:t>
-      </w:r>
-    </w:p>
-    <w:p>
-      <w:pPr>
-        <w:spacing w:line="360" w:lineRule="auto"/>
-        <w:ind w:firstLine="567"/>
-        <w:jc w:val="both"/>
-      </w:pPr>
-      <w:r>
-        <w:rPr/>
-        <w:t xml:space="preserve">Web rozlišuje tři úrovně uživatelů. Co která role smí, je v tabulce 2.</w:t>
-      </w:r>
-    </w:p>
-    <w:p>
-      <w:pPr>
-        <w:keepNext/>
-        <w:spacing w:before="240" w:after="120"/>
-      </w:pPr>
-      <w:r>
-        <w:rPr>
-          <w:sz w:val="22"/>
-          <w:b/>
-        </w:rPr>
-        <w:t xml:space="preserve">Tabulka 2: </w:t>
       </w:r>
       <w:r>
         <w:rPr>
@@ -2848,7 +2362,7 @@
       </w:pPr>
       <w:r>
         <w:rPr/>
-        <w:t xml:space="preserve">Data budou uložená v MariaDB. Přehled tabulek je v tabulce 3, celé schéma je v repozitáři v souboru database/schema.sql.</w:t>
+        <w:t xml:space="preserve">Data budou uložená v MariaDB. Přehled tabulek je v tabulce 2, celé schéma je v repozitáři v souboru database/schema.sql.</w:t>
       </w:r>
     </w:p>
     <w:p>
@@ -2861,7 +2375,7 @@
           <w:sz w:val="22"/>
           <w:b/>
         </w:rPr>
-        <w:t xml:space="preserve">Tabulka 3: </w:t>
+        <w:t xml:space="preserve">Tabulka 2: </w:t>
       </w:r>
       <w:r>
         <w:rPr>
@@ -3191,7 +2705,7 @@
           <w:sz w:val="22"/>
           <w:b/>
         </w:rPr>
-        <w:t xml:space="preserve">Tabulka 4: </w:t>
+        <w:t xml:space="preserve">Tabulka 3: </w:t>
       </w:r>
       <w:r>
         <w:rPr>
@@ -3867,7 +3381,7 @@
           <w:sz w:val="22"/>
           <w:b/>
         </w:rPr>
-        <w:t xml:space="preserve">Tabulka 5: </w:t>
+        <w:t xml:space="preserve">Tabulka 4: </w:t>
       </w:r>
       <w:r>
         <w:rPr>
@@ -4980,7 +4494,7 @@
           <w:sz w:val="22"/>
           <w:b/>
         </w:rPr>
-        <w:t xml:space="preserve">Tabulka 6: </w:t>
+        <w:t xml:space="preserve">Tabulka 5: </w:t>
       </w:r>
       <w:r>
         <w:rPr>
@@ -5843,7 +5357,7 @@
       </w:pPr>
       <w:r>
         <w:rPr/>
-        <w:t xml:space="preserve">Tabulka 1: Rozdělení práce</w:t>
+        <w:t xml:space="preserve">Tabulka 1: Role a jejich oprávnění</w:t>
       </w:r>
     </w:p>
     <w:p>
@@ -5854,7 +5368,7 @@
       </w:pPr>
       <w:r>
         <w:rPr/>
-        <w:t xml:space="preserve">Tabulka 2: Role a jejich oprávnění</w:t>
+        <w:t xml:space="preserve">Tabulka 2: Tabulky v databázi</w:t>
       </w:r>
     </w:p>
     <w:p>
@@ -5865,7 +5379,7 @@
       </w:pPr>
       <w:r>
         <w:rPr/>
-        <w:t xml:space="preserve">Tabulka 3: Tabulky v databázi</w:t>
+        <w:t xml:space="preserve">Tabulka 3: Vybrané fráze a cílové stránky</w:t>
       </w:r>
     </w:p>
     <w:p>
@@ -5876,7 +5390,7 @@
       </w:pPr>
       <w:r>
         <w:rPr/>
-        <w:t xml:space="preserve">Tabulka 4: Vybrané fráze a cílové stránky</w:t>
+        <w:t xml:space="preserve">Tabulka 4: Použité technologie</w:t>
       </w:r>
     </w:p>
     <w:p>
@@ -5887,18 +5401,7 @@
       </w:pPr>
       <w:r>
         <w:rPr/>
-        <w:t xml:space="preserve">Tabulka 5: Použité technologie</w:t>
-      </w:r>
-    </w:p>
-    <w:p>
-      <w:pPr>
-        <w:spacing w:line="360" w:lineRule="auto"/>
-        <w:ind w:firstLine="567"/>
-        <w:jc w:val="both"/>
-      </w:pPr>
-      <w:r>
-        <w:rPr/>
-        <w:t xml:space="preserve">Tabulka 6: Úkoly pro test použitelnosti</w:t>
+        <w:t xml:space="preserve">Tabulka 5: Úkoly pro test použitelnosti</w:t>
       </w:r>
     </w:p>
     <w:p>

</xml_diff>

<commit_message>
Update documentation for database, auth, admin and tests
Co-Authored-By: Claude Opus 5.5 <noreply@anthropic.com>
</commit_message>
<xml_diff>
--- a/docs/dokumentace-tym-07.docx
+++ b/docs/dokumentace-tym-07.docx
@@ -902,6 +902,22 @@
     </w:p>
     <w:p>
       <w:pPr>
+        <w:pStyle w:val="Obsah3"/>
+      </w:pPr>
+      <w:r>
+        <w:rPr/>
+        <w:t xml:space="preserve">3.4.1</w:t>
+      </w:r>
+      <w:r>
+        <w:tab/>
+      </w:r>
+      <w:r>
+        <w:rPr/>
+        <w:t xml:space="preserve">Zabezpečení</w:t>
+      </w:r>
+    </w:p>
+    <w:p>
+      <w:pPr>
         <w:pStyle w:val="Obsah2"/>
       </w:pPr>
       <w:r>
@@ -1026,6 +1042,22 @@
       <w:r>
         <w:rPr/>
         <w:t xml:space="preserve">Validita kódu</w:t>
+      </w:r>
+    </w:p>
+    <w:p>
+      <w:pPr>
+        <w:pStyle w:val="Obsah2"/>
+      </w:pPr>
+      <w:r>
+        <w:rPr/>
+        <w:t xml:space="preserve">4.5</w:t>
+      </w:r>
+      <w:r>
+        <w:tab/>
+      </w:r>
+      <w:r>
+        <w:rPr/>
+        <w:t xml:space="preserve">Automatické testy</w:t>
       </w:r>
     </w:p>
     <w:p>
@@ -2063,7 +2095,7 @@
               <w:rPr>
                 <w:sz w:val="22"/>
               </w:rPr>
-              <w:t xml:space="preserve">Správa uživatelů, blokování účtů</w:t>
+              <w:t xml:space="preserve">Správa uživatelů, blokování účtů, změna role</w:t>
             </w:r>
           </w:p>
         </w:tc>
@@ -2183,6 +2215,17 @@
         </w:tc>
       </w:tr>
     </w:tbl>
+    <w:p>
+      <w:pPr>
+        <w:spacing w:line="360" w:lineRule="auto"/>
+        <w:ind w:firstLine="567"/>
+        <w:jc w:val="both"/>
+      </w:pPr>
+      <w:r>
+        <w:rPr/>
+        <w:t xml:space="preserve">Administrátor není v systému předem vytvořený. Po nasazení se první účet zaregistruje přes web a roli mu nastavíme v databázi, další administrátory už jde nastavit přímo v administraci.</w:t>
+      </w:r>
+    </w:p>
     <w:p>
       <w:pPr>
         <w:pStyle w:val="Nadpis2"/>
@@ -2253,7 +2296,7 @@
       </w:pPr>
       <w:r>
         <w:rPr/>
-        <w:t xml:space="preserve">Detail inzerátu (/inzerat/číslo/název)</w:t>
+        <w:t xml:space="preserve">Detail inzerátu (/inzerat/číslo/název) s kontaktním formulářem</w:t>
       </w:r>
     </w:p>
     <w:p>
@@ -2267,7 +2310,7 @@
       </w:pPr>
       <w:r>
         <w:rPr/>
-        <w:t xml:space="preserve">Nahlásit věc (/nahlasit)</w:t>
+        <w:t xml:space="preserve">Nahlásit věc (/nahlasit), formulář pro přidání ztráty nebo nálezu</w:t>
       </w:r>
     </w:p>
     <w:p>
@@ -2281,7 +2324,7 @@
       </w:pPr>
       <w:r>
         <w:rPr/>
-        <w:t xml:space="preserve">Přihlášení a registrace</w:t>
+        <w:t xml:space="preserve">Přihlášení (/prihlaseni) a registrace (/registrace)</w:t>
       </w:r>
     </w:p>
     <w:p>
@@ -2295,7 +2338,7 @@
       </w:pPr>
       <w:r>
         <w:rPr/>
-        <w:t xml:space="preserve">Můj účet: moje inzeráty, úprava inzerátu</w:t>
+        <w:t xml:space="preserve">Můj účet (/ucet): moje inzeráty, úprava, označení jako vrácené, smazání</w:t>
       </w:r>
     </w:p>
     <w:p>
@@ -2309,7 +2352,7 @@
       </w:pPr>
       <w:r>
         <w:rPr/>
-        <w:t xml:space="preserve">Administrace: inzeráty, uživatelé, kategorie, budovy</w:t>
+        <w:t xml:space="preserve">Administrace (/admin): inzeráty, uživatelé, kategorie, budovy</w:t>
       </w:r>
     </w:p>
     <w:p>
@@ -2341,7 +2384,7 @@
       </w:pPr>
       <w:r>
         <w:rPr/>
-        <w:t xml:space="preserve">V hlavičce je logo s odkazem na úvod, odkazy Všechny inzeráty, Ztráty a Nálezy a výrazné tlačítko Nahlásit věc. Po přihlášení přibude odkaz na účet a administrátor uvidí i administraci. V patičce jsou odkazy na oficiální místa pro odevzdání věcí, tedy na Správu učeben PEF a knihovnu. Na detailu inzerátu je drobečková navigace.</w:t>
+        <w:t xml:space="preserve">V hlavičce je logo s odkazem na úvod, odkazy Všechny inzeráty, Ztráty a Nálezy, odkaz na přihlášení a výrazné tlačítko Nahlásit věc. Po přihlášení se místo přihlášení zobrazí Můj účet a Odhlásit, administrátor uvidí i Administraci. Na mobilu je menu schované pod tlačítkem Menu, aby hlavička zůstala na jednom řádku. V patičce jsou odkazy na oficiální místa pro odevzdání věcí, tedy na Správu učeben PEF a knihovnu. Na detailu inzerátu je drobečková navigace.</w:t>
       </w:r>
     </w:p>
     <w:p>
@@ -2362,7 +2405,7 @@
       </w:pPr>
       <w:r>
         <w:rPr/>
-        <w:t xml:space="preserve">Data budou uložená v MariaDB. Přehled tabulek je v tabulce 2, celé schéma je v repozitáři v souboru database/schema.sql.</w:t>
+        <w:t xml:space="preserve">Data jsou uložená v MariaDB. Přehled tabulek je v tabulce 2, celé schéma je v repozitáři v souboru database/schema.sql.</w:t>
       </w:r>
     </w:p>
     <w:p>
@@ -2532,7 +2575,7 @@
               <w:rPr>
                 <w:sz w:val="22"/>
               </w:rPr>
-              <w:t xml:space="preserve">budovy kampusu se souřadnicemi pro mapu</w:t>
+              <w:t xml:space="preserve">budovy kampusu se zkratkou a souřadnicemi pro mapu</w:t>
             </w:r>
           </w:p>
         </w:tc>
@@ -2566,7 +2609,7 @@
               <w:rPr>
                 <w:sz w:val="22"/>
               </w:rPr>
-              <w:t xml:space="preserve">inzeráty: typ, stav, název, popis, místo, souřadnice, datum, autor</w:t>
+              <w:t xml:space="preserve">inzeráty: typ, stav (aktivní, vrácený, skrytý), název, popis, místo, souřadnice, datum, autor a text pro hledání bez diakritiky</w:t>
             </w:r>
           </w:p>
         </w:tc>
@@ -2600,7 +2643,7 @@
               <w:rPr>
                 <w:sz w:val="22"/>
               </w:rPr>
-              <w:t xml:space="preserve">fotky k inzerátům</w:t>
+              <w:t xml:space="preserve">fotka k inzerátu (jedna na inzerát)</w:t>
             </w:r>
           </w:p>
         </w:tc>
@@ -3286,6 +3329,20 @@
       </w:pPr>
       <w:r>
         <w:rPr/>
+        <w:t xml:space="preserve">soukromé stránky (účet, administrace, přihlášení) mají noindex a v robots.txt jsou zakázané,</w:t>
+      </w:r>
+    </w:p>
+    <w:p>
+      <w:pPr>
+        <w:pStyle w:val="Odstavecseseznamem"/>
+        <w:numPr>
+          <w:ilvl w:val="0"/>
+          <w:numId w:val="2"/>
+        </w:numPr>
+        <w:spacing w:line="360" w:lineRule="auto"/>
+      </w:pPr>
+      <w:r>
+        <w:rPr/>
         <w:t xml:space="preserve">sitemap.xml a robots.txt se generují automaticky,</w:t>
       </w:r>
     </w:p>
@@ -3504,7 +3561,7 @@
               <w:rPr>
                 <w:sz w:val="22"/>
               </w:rPr>
-              <w:t xml:space="preserve">MariaDB (zatím testovací data v JSON)</w:t>
+              <w:t xml:space="preserve">MariaDB, přístup přes PDO s připravenými dotazy</w:t>
             </w:r>
           </w:p>
         </w:tc>
@@ -3538,7 +3595,7 @@
               <w:rPr>
                 <w:sz w:val="22"/>
               </w:rPr>
-              <w:t xml:space="preserve">HTML5, vlastní CSS bez frameworku, JavaScript</w:t>
+              <w:t xml:space="preserve">HTML5, vlastní CSS bez frameworku, JavaScript bez knihoven typu jQuery</w:t>
             </w:r>
           </w:p>
         </w:tc>
@@ -3606,7 +3663,7 @@
               <w:rPr>
                 <w:sz w:val="22"/>
               </w:rPr>
-              <w:t xml:space="preserve">Leaflet, OpenStreetMap</w:t>
+              <w:t xml:space="preserve">Leaflet, Leaflet.markercluster, OpenStreetMap</w:t>
             </w:r>
           </w:p>
         </w:tc>
@@ -3624,7 +3681,7 @@
               <w:rPr>
                 <w:sz w:val="22"/>
               </w:rPr>
-              <w:t xml:space="preserve">Písmo</w:t>
+              <w:t xml:space="preserve">Fotky</w:t>
             </w:r>
           </w:p>
         </w:tc>
@@ -3640,7 +3697,7 @@
               <w:rPr>
                 <w:sz w:val="22"/>
               </w:rPr>
-              <w:t xml:space="preserve">IBM Plex Sans a IBM Plex Mono, uložené přímo na webu</w:t>
+              <w:t xml:space="preserve">knihovna GD, převod do WebP</w:t>
             </w:r>
           </w:p>
         </w:tc>
@@ -3658,6 +3715,74 @@
               <w:rPr>
                 <w:sz w:val="22"/>
               </w:rPr>
+              <w:t xml:space="preserve">Písmo</w:t>
+            </w:r>
+          </w:p>
+        </w:tc>
+        <w:tc>
+          <w:tcPr>
+            <w:tcW w:w="6152" w:type="dxa"/>
+          </w:tcPr>
+          <w:p>
+            <w:pPr>
+              <w:spacing w:before="40" w:after="40"/>
+            </w:pPr>
+            <w:r>
+              <w:rPr>
+                <w:sz w:val="22"/>
+              </w:rPr>
+              <w:t xml:space="preserve">IBM Plex Sans a IBM Plex Mono, uložené přímo na webu</w:t>
+            </w:r>
+          </w:p>
+        </w:tc>
+      </w:tr>
+      <w:tr>
+        <w:tc>
+          <w:tcPr>
+            <w:tcW w:w="2636" w:type="dxa"/>
+          </w:tcPr>
+          <w:p>
+            <w:pPr>
+              <w:spacing w:before="40" w:after="40"/>
+            </w:pPr>
+            <w:r>
+              <w:rPr>
+                <w:sz w:val="22"/>
+              </w:rPr>
+              <w:t xml:space="preserve">Testy</w:t>
+            </w:r>
+          </w:p>
+        </w:tc>
+        <w:tc>
+          <w:tcPr>
+            <w:tcW w:w="6152" w:type="dxa"/>
+          </w:tcPr>
+          <w:p>
+            <w:pPr>
+              <w:spacing w:before="40" w:after="40"/>
+            </w:pPr>
+            <w:r>
+              <w:rPr>
+                <w:sz w:val="22"/>
+              </w:rPr>
+              <w:t xml:space="preserve">PHPUnit (instalace přes Composer)</w:t>
+            </w:r>
+          </w:p>
+        </w:tc>
+      </w:tr>
+      <w:tr>
+        <w:tc>
+          <w:tcPr>
+            <w:tcW w:w="2636" w:type="dxa"/>
+          </w:tcPr>
+          <w:p>
+            <w:pPr>
+              <w:spacing w:before="40" w:after="40"/>
+            </w:pPr>
+            <w:r>
+              <w:rPr>
+                <w:sz w:val="22"/>
+              </w:rPr>
               <w:t xml:space="preserve">Verzování</w:t>
             </w:r>
           </w:p>
@@ -3688,7 +3813,7 @@
       </w:pPr>
       <w:r>
         <w:rPr/>
-        <w:t xml:space="preserve">Hotové CMS jako WordPress zadání nepovoluje, a nepoužili jsme ani PHP framework. Router, šablony a napojení na Vite jsme napsali sami.</w:t>
+        <w:t xml:space="preserve">Hotové CMS jako WordPress zadání nepovoluje, a nepoužili jsme ani PHP framework. Router, šablony, přihlašování, formuláře a napojení na Vite jsme napsali sami.</w:t>
       </w:r>
     </w:p>
     <w:p>
@@ -3723,7 +3848,7 @@
       </w:pPr>
       <w:r>
         <w:rPr/>
-        <w:t xml:space="preserve">public: veřejná složka na serveru se vstupním souborem index.php, obrázky a sestaveným CSS a JS,</w:t>
+        <w:t xml:space="preserve">public: veřejná složka na serveru se vstupním souborem index.php, obrázky, nahranými fotkami a sestaveným CSS a JS,</w:t>
       </w:r>
     </w:p>
     <w:p>
@@ -3737,7 +3862,7 @@
       </w:pPr>
       <w:r>
         <w:rPr/>
-        <w:t xml:space="preserve">src: PHP kód (router, controllery, práce s daty, SEO),</w:t>
+        <w:t xml:space="preserve">src: PHP kód (router, controllery, formuláře, přihlašování, práce s databází, e-maily, SEO),</w:t>
       </w:r>
     </w:p>
     <w:p>
@@ -3779,7 +3904,7 @@
       </w:pPr>
       <w:r>
         <w:rPr/>
-        <w:t xml:space="preserve">database: návrh databáze a testovací data,</w:t>
+        <w:t xml:space="preserve">database: schéma databáze, skript seed.php a testovací data,</w:t>
       </w:r>
     </w:p>
     <w:p>
@@ -3793,6 +3918,20 @@
       </w:pPr>
       <w:r>
         <w:rPr/>
+        <w:t xml:space="preserve">tests: automatické testy PHPUnit,</w:t>
+      </w:r>
+    </w:p>
+    <w:p>
+      <w:pPr>
+        <w:pStyle w:val="Odstavecseseznamem"/>
+        <w:numPr>
+          <w:ilvl w:val="0"/>
+          <w:numId w:val="2"/>
+        </w:numPr>
+        <w:spacing w:line="360" w:lineRule="auto"/>
+      </w:pPr>
+      <w:r>
+        <w:rPr/>
         <w:t xml:space="preserve">docs: tato dokumentace a obrázky.</w:t>
       </w:r>
     </w:p>
@@ -3804,7 +3943,7 @@
       </w:pPr>
       <w:r>
         <w:rPr/>
-        <w:t xml:space="preserve">Data se načítají přes rozhraní ItemRepository. Teď za ním jsou testovací data v JSON souborech (12 inzerátů, 6 kategorií, 10 budov). Po napojení databáze se vymění jedna třída a zbytek kódu zůstane stejný.</w:t>
+        <w:t xml:space="preserve">S databází pracují třídy v src/Repositories (inzeráty, uživatelé, kategorie, budovy, zprávy). Skript database/seed.php vytvoří tabulky a nahraje testovací data: 12 inzerátů, 6 kategorií a 10 budov.</w:t>
       </w:r>
     </w:p>
     <w:p>
@@ -3825,7 +3964,7 @@
       </w:pPr>
       <w:r>
         <w:rPr/>
-        <w:t xml:space="preserve">Web je navržený nejdřív pro mobil a pro větší obrazovky se rozšiřuje. Na mobilu jsou inzeráty pod sebou a mapa pod seznamem. Na počítači jsou inzeráty ve dvou sloupcích a mapa vedle nich zůstává při posouvání na místě. Hlavička se na mobilu zalomí do dvou řádků a tlačítko Nahlásit věc je vždy vidět.</w:t>
+        <w:t xml:space="preserve">Web je navržený nejdřív pro mobil a pro větší obrazovky se rozšiřuje. Na mobilu jsou inzeráty pod sebou a mapa pod seznamem. Na počítači jsou inzeráty ve dvou sloupcích a mapa vedle nich zůstává při posouvání na místě. Na mobilu je navigace schovaná pod tlačítkem Menu a tlačítko Nahlásit věc je vždy vidět.</w:t>
       </w:r>
     </w:p>
     <w:p>
@@ -4158,7 +4297,7 @@
       </w:pPr>
       <w:r>
         <w:rPr/>
-        <w:t xml:space="preserve">Všechny stránky vykresluje PHP na serveru, takže web funguje i bez JavaScriptu a vyhledávače vidí celý obsah. Požadavky jdou přes jeden vstupní soubor public/index.php a jednoduchý router. Hotové je zatím:</w:t>
+        <w:t xml:space="preserve">Všechny stránky vykresluje PHP na serveru, takže web funguje i bez JavaScriptu a vyhledávače vidí celý obsah. Požadavky jdou přes jeden vstupní soubor public/index.php a jednoduchý router. Hotové je:</w:t>
       </w:r>
     </w:p>
     <w:p>
@@ -4200,7 +4339,7 @@
       </w:pPr>
       <w:r>
         <w:rPr/>
-        <w:t xml:space="preserve">detail inzerátu s fotkou, mapou, podobnými inzeráty a kontaktním formulářem, který se kontroluje na serveru,</w:t>
+        <w:t xml:space="preserve">detail inzerátu s fotkou, mapou, podobnými inzeráty a kontaktním formulářem,</w:t>
       </w:r>
     </w:p>
     <w:p>
@@ -4214,7 +4353,7 @@
       </w:pPr>
       <w:r>
         <w:rPr/>
-        <w:t xml:space="preserve">stránka Nahlásit věc s výběrem, jestli jde o ztrátu, nebo nález,</w:t>
+        <w:t xml:space="preserve">registrace, přihlášení a odhlášení,</w:t>
       </w:r>
     </w:p>
     <w:p>
@@ -4228,125 +4367,7 @@
       </w:pPr>
       <w:r>
         <w:rPr/>
-        <w:t xml:space="preserve">sitemap.xml a robots.txt.</w:t>
-      </w:r>
-    </w:p>
-    <w:p>
-      <w:pPr>
-        <w:spacing w:line="360" w:lineRule="auto"/>
-        <w:ind w:firstLine="567"/>
-        <w:jc w:val="both"/>
-      </w:pPr>
-      <w:r>
-        <w:rPr/>
-        <w:t xml:space="preserve">Všechny výstupy jdou přes funkci e(), která převádí speciální znaky, aby nešlo do stránky vložit cizí kód (XSS).</w:t>
-      </w:r>
-    </w:p>
-    <w:p>
-      <w:pPr>
-        <w:pStyle w:val="Nadpis2"/>
-        <w:keepNext/>
-      </w:pPr>
-      <w:r>
-        <w:rPr/>
-        <w:t xml:space="preserve">AJAX</w:t>
-      </w:r>
-    </w:p>
-    <w:p>
-      <w:pPr>
-        <w:spacing w:line="360" w:lineRule="auto"/>
-        <w:ind w:firstLine="567"/>
-        <w:jc w:val="both"/>
-      </w:pPr>
-      <w:r>
-        <w:rPr/>
-        <w:t xml:space="preserve">Filtry ve výpisu fungují přes AJAX. Po změně filtru nebo při psaní do vyhledávání zavolá JavaScript adresu /api/items. Server vrátí JSON s hotovým HTML karet, počtem výsledků, nadpisem a body pro mapu a stránka se aktualizuje bez načtení. Stejně funguje tlačítko Načíst další. Adresa v prohlížeči se přitom mění, takže jde výsledek poslat odkazem nebo obnovit stránku.</w:t>
-      </w:r>
-    </w:p>
-    <w:p>
-      <w:pPr>
-        <w:spacing w:line="360" w:lineRule="auto"/>
-        <w:ind w:firstLine="567"/>
-        <w:jc w:val="both"/>
-      </w:pPr>
-      <w:r>
-        <w:rPr/>
-        <w:t xml:space="preserve">Karty pro stránku i pro AJAX se generují ze stejné šablony, takže vypadají vždy stejně. Když JavaScript nefunguje, formulář se normálně odešle a server vrátí celou stránku.</w:t>
-      </w:r>
-    </w:p>
-    <w:p>
-      <w:pPr>
-        <w:pStyle w:val="Nadpis2"/>
-        <w:keepNext/>
-      </w:pPr>
-      <w:r>
-        <w:rPr/>
-        <w:t xml:space="preserve">API třetích stran</w:t>
-      </w:r>
-    </w:p>
-    <w:p>
-      <w:pPr>
-        <w:spacing w:line="360" w:lineRule="auto"/>
-        <w:ind w:firstLine="567"/>
-        <w:jc w:val="both"/>
-      </w:pPr>
-      <w:r>
-        <w:rPr/>
-        <w:t xml:space="preserve">Mapu zajišťuje knihovna Leaflet s podklady z OpenStreetMap. Mapa je ve výpisu, kde ukazuje všechny nalezené inzeráty, a na detailu inzerátu. Body, které jsou blízko u sebe, se spojují do skupin s číslem, aby se nepřekrývaly. Mapa se načítá jen na stránkách, kde je potřeba.</w:t>
-      </w:r>
-    </w:p>
-    <w:p>
-      <w:pPr>
-        <w:spacing w:line="360" w:lineRule="auto"/>
-        <w:ind w:firstLine="567"/>
-        <w:jc w:val="both"/>
-      </w:pPr>
-      <w:r>
-        <w:rPr/>
-        <w:t xml:space="preserve">Souřadnice budov jsme převzali z OpenStreetMap přes služby Nominatim a Overpass API, aby body na mapě opravdu seděly na budovy.</w:t>
-      </w:r>
-    </w:p>
-    <w:p>
-      <w:pPr>
-        <w:spacing w:line="360" w:lineRule="auto"/>
-        <w:ind w:firstLine="567"/>
-        <w:jc w:val="both"/>
-      </w:pPr>
-      <w:r>
-        <w:rPr/>
-        <w:t xml:space="preserve">Na detailu je tlačítko Sdílet. Na mobilu otevře systémové sdílení (Web Share API), na počítači zkopíruje odkaz do schránky.</w:t>
-      </w:r>
-    </w:p>
-    <w:p>
-      <w:pPr>
-        <w:spacing w:line="360" w:lineRule="auto"/>
-        <w:ind w:firstLine="567"/>
-        <w:jc w:val="both"/>
-      </w:pPr>
-      <w:r>
-        <w:rPr/>
-        <w:t xml:space="preserve">Fotky v testovacích inzerátech jsou z Unsplash pod volnou licencí, oříznuté a převedené do formátu WebP.</w:t>
-      </w:r>
-    </w:p>
-    <w:p>
-      <w:pPr>
-        <w:pStyle w:val="Nadpis2"/>
-        <w:keepNext/>
-      </w:pPr>
-      <w:r>
-        <w:rPr/>
-        <w:t xml:space="preserve">Co zbývá dokončit</w:t>
-      </w:r>
-    </w:p>
-    <w:p>
-      <w:pPr>
-        <w:spacing w:line="360" w:lineRule="auto"/>
-        <w:ind w:firstLine="567"/>
-        <w:jc w:val="both"/>
-      </w:pPr>
-      <w:r>
-        <w:rPr/>
-        <w:t xml:space="preserve">Do odevzdání 20. 11. zbývá:</w:t>
+        <w:t xml:space="preserve">přidání, úprava a smazání inzerátu včetně fotky a výběru místa na mapě,</w:t>
       </w:r>
     </w:p>
     <w:p>
@@ -4360,7 +4381,7 @@
       </w:pPr>
       <w:r>
         <w:rPr/>
-        <w:t xml:space="preserve">registrace, přihlášení a role uživatelů,</w:t>
+        <w:t xml:space="preserve">stránka Můj účet s vlastními inzeráty a označením věci jako vrácené,</w:t>
       </w:r>
     </w:p>
     <w:p>
@@ -4374,7 +4395,7 @@
       </w:pPr>
       <w:r>
         <w:rPr/>
-        <w:t xml:space="preserve">formulář pro přidání a úpravu inzerátu včetně nahrání fotky a výběru místa na mapě,</w:t>
+        <w:t xml:space="preserve">administrace inzerátů (skrytí, smazání), uživatelů (blokace, role), kategorií a budov,</w:t>
       </w:r>
     </w:p>
     <w:p>
@@ -4388,7 +4409,7 @@
       </w:pPr>
       <w:r>
         <w:rPr/>
-        <w:t xml:space="preserve">administrace,</w:t>
+        <w:t xml:space="preserve">odeslání zprávy autorovi inzerátu e-mailem, odpověď jde přímo na e-mail odesílatele,</w:t>
       </w:r>
     </w:p>
     <w:p>
@@ -4402,7 +4423,147 @@
       </w:pPr>
       <w:r>
         <w:rPr/>
-        <w:t xml:space="preserve">napojení na MariaDB místo testovacích dat,</w:t>
+        <w:t xml:space="preserve">sitemap.xml a robots.txt.</w:t>
+      </w:r>
+    </w:p>
+    <w:p>
+      <w:pPr>
+        <w:keepNext/>
+        <w:spacing w:before="240"/>
+        <w:jc w:val="center"/>
+      </w:pPr>
+      <w:r>
+        <w:drawing>
+          <wp:inline distT="0" distB="0" distL="0" distR="0">
+            <wp:extent cx="5580380" cy="3487738"/>
+            <wp:docPr id="106" name="Obrázek 106" descr="Formulář pro přidání nálezu"/>
+            <a:graphic xmlns:a="http://schemas.openxmlformats.org/drawingml/2006/main">
+              <a:graphicData uri="http://schemas.openxmlformats.org/drawingml/2006/picture">
+                <pic:pic xmlns:pic="http://schemas.openxmlformats.org/drawingml/2006/picture">
+                  <pic:nvPicPr>
+                    <pic:cNvPr id="106" name="formular-desktop.jpg"/>
+                    <pic:cNvPicPr/>
+                  </pic:nvPicPr>
+                  <pic:blipFill>
+                    <a:blip r:embed="rIdImg6"/>
+                    <a:stretch>
+                      <a:fillRect/>
+                    </a:stretch>
+                  </pic:blipFill>
+                  <pic:spPr>
+                    <a:xfrm>
+                      <a:off x="0" y="0"/>
+                      <a:ext cx="5580380" cy="3487738"/>
+                    </a:xfrm>
+                    <a:prstGeom prst="rect">
+                      <a:avLst/>
+                    </a:prstGeom>
+                    <a:ln w="6350">
+                      <a:solidFill>
+                        <a:srgbClr val="CDC6B8"/>
+                      </a:solidFill>
+                    </a:ln>
+                  </pic:spPr>
+                </pic:pic>
+              </a:graphicData>
+            </a:graphic>
+          </wp:inline>
+        </w:drawing>
+      </w:r>
+    </w:p>
+    <w:p>
+      <w:pPr>
+        <w:keepNext/>
+        <w:spacing w:before="60" w:after="240"/>
+        <w:jc w:val="center"/>
+      </w:pPr>
+      <w:r>
+        <w:rPr>
+          <w:sz w:val="22"/>
+          <w:b/>
+        </w:rPr>
+        <w:t xml:space="preserve">Obrázek 5: </w:t>
+      </w:r>
+      <w:r>
+        <w:rPr>
+          <w:sz w:val="22"/>
+        </w:rPr>
+        <w:t xml:space="preserve">Formulář pro přidání nálezu</w:t>
+      </w:r>
+    </w:p>
+    <w:p>
+      <w:pPr>
+        <w:keepNext/>
+        <w:spacing w:before="240"/>
+        <w:jc w:val="center"/>
+      </w:pPr>
+      <w:r>
+        <w:drawing>
+          <wp:inline distT="0" distB="0" distL="0" distR="0">
+            <wp:extent cx="5580380" cy="3487738"/>
+            <wp:docPr id="107" name="Obrázek 107" descr="Administrace inzerátů"/>
+            <a:graphic xmlns:a="http://schemas.openxmlformats.org/drawingml/2006/main">
+              <a:graphicData uri="http://schemas.openxmlformats.org/drawingml/2006/picture">
+                <pic:pic xmlns:pic="http://schemas.openxmlformats.org/drawingml/2006/picture">
+                  <pic:nvPicPr>
+                    <pic:cNvPr id="107" name="admin-desktop.jpg"/>
+                    <pic:cNvPicPr/>
+                  </pic:nvPicPr>
+                  <pic:blipFill>
+                    <a:blip r:embed="rIdImg7"/>
+                    <a:stretch>
+                      <a:fillRect/>
+                    </a:stretch>
+                  </pic:blipFill>
+                  <pic:spPr>
+                    <a:xfrm>
+                      <a:off x="0" y="0"/>
+                      <a:ext cx="5580380" cy="3487738"/>
+                    </a:xfrm>
+                    <a:prstGeom prst="rect">
+                      <a:avLst/>
+                    </a:prstGeom>
+                    <a:ln w="6350">
+                      <a:solidFill>
+                        <a:srgbClr val="CDC6B8"/>
+                      </a:solidFill>
+                    </a:ln>
+                  </pic:spPr>
+                </pic:pic>
+              </a:graphicData>
+            </a:graphic>
+          </wp:inline>
+        </w:drawing>
+      </w:r>
+    </w:p>
+    <w:p>
+      <w:pPr>
+        <w:keepNext/>
+        <w:spacing w:before="60" w:after="240"/>
+        <w:jc w:val="center"/>
+      </w:pPr>
+      <w:r>
+        <w:rPr>
+          <w:sz w:val="22"/>
+          <w:b/>
+        </w:rPr>
+        <w:t xml:space="preserve">Obrázek 6: </w:t>
+      </w:r>
+      <w:r>
+        <w:rPr>
+          <w:sz w:val="22"/>
+        </w:rPr>
+        <w:t xml:space="preserve">Administrace inzerátů</w:t>
+      </w:r>
+    </w:p>
+    <w:p>
+      <w:pPr>
+        <w:pStyle w:val="Nadpis3"/>
+        <w:keepNext/>
+      </w:pPr>
+      <w:r>
+        <w:rPr/>
+        <w:t xml:space="preserve">Zabezpečení</w:t>
       </w:r>
     </w:p>
     <w:p>
@@ -4416,7 +4577,7 @@
       </w:pPr>
       <w:r>
         <w:rPr/>
-        <w:t xml:space="preserve">odesílání zpráv z kontaktního formuláře e-mailem a ochrana formulářů tokenem proti CSRF,</w:t>
+        <w:t xml:space="preserve">hesla se ukládají jen jako hash (password_hash), po přihlášení se obnoví identifikátor session,</w:t>
       </w:r>
     </w:p>
     <w:p>
@@ -4430,7 +4591,251 @@
       </w:pPr>
       <w:r>
         <w:rPr/>
-        <w:t xml:space="preserve">nasazení na školní server.</w:t>
+        <w:t xml:space="preserve">session cookie je dostupná jen serveru (HttpOnly) a neposílá se z cizích webů (SameSite),</w:t>
+      </w:r>
+    </w:p>
+    <w:p>
+      <w:pPr>
+        <w:pStyle w:val="Odstavecseseznamem"/>
+        <w:numPr>
+          <w:ilvl w:val="0"/>
+          <w:numId w:val="2"/>
+        </w:numPr>
+        <w:spacing w:line="360" w:lineRule="auto"/>
+      </w:pPr>
+      <w:r>
+        <w:rPr/>
+        <w:t xml:space="preserve">všechny formuláře mají CSRF token, bez něj server požadavek odmítne,</w:t>
+      </w:r>
+    </w:p>
+    <w:p>
+      <w:pPr>
+        <w:pStyle w:val="Odstavecseseznamem"/>
+        <w:numPr>
+          <w:ilvl w:val="0"/>
+          <w:numId w:val="2"/>
+        </w:numPr>
+        <w:spacing w:line="360" w:lineRule="auto"/>
+      </w:pPr>
+      <w:r>
+        <w:rPr/>
+        <w:t xml:space="preserve">upravit nebo smazat inzerát může jen jeho autor nebo administrátor, ostatní dostanou chybu 403,</w:t>
+      </w:r>
+    </w:p>
+    <w:p>
+      <w:pPr>
+        <w:pStyle w:val="Odstavecseseznamem"/>
+        <w:numPr>
+          <w:ilvl w:val="0"/>
+          <w:numId w:val="2"/>
+        </w:numPr>
+        <w:spacing w:line="360" w:lineRule="auto"/>
+      </w:pPr>
+      <w:r>
+        <w:rPr/>
+        <w:t xml:space="preserve">databázové dotazy používají připravené dotazy (prepared statements), takže nejde podstrčit vlastní SQL,</w:t>
+      </w:r>
+    </w:p>
+    <w:p>
+      <w:pPr>
+        <w:pStyle w:val="Odstavecseseznamem"/>
+        <w:numPr>
+          <w:ilvl w:val="0"/>
+          <w:numId w:val="2"/>
+        </w:numPr>
+        <w:spacing w:line="360" w:lineRule="auto"/>
+      </w:pPr>
+      <w:r>
+        <w:rPr/>
+        <w:t xml:space="preserve">všechny výstupy jdou přes funkci e(), která převádí speciální znaky (ochrana proti XSS),</w:t>
+      </w:r>
+    </w:p>
+    <w:p>
+      <w:pPr>
+        <w:pStyle w:val="Odstavecseseznamem"/>
+        <w:numPr>
+          <w:ilvl w:val="0"/>
+          <w:numId w:val="2"/>
+        </w:numPr>
+        <w:spacing w:line="360" w:lineRule="auto"/>
+      </w:pPr>
+      <w:r>
+        <w:rPr/>
+        <w:t xml:space="preserve">nahrané fotky se znovu uloží jako WebP, tím se odstraní metadata (třeba GPS poloha z mobilu) a nejde nahrát nic jiného než obrázek.</w:t>
+      </w:r>
+    </w:p>
+    <w:p>
+      <w:pPr>
+        <w:spacing w:line="360" w:lineRule="auto"/>
+        <w:ind w:firstLine="567"/>
+        <w:jc w:val="both"/>
+      </w:pPr>
+      <w:r>
+        <w:rPr/>
+        <w:t xml:space="preserve">Přihlášení zatím nemá omezení počtu pokusů, heslo by tedy šlo zkoušet opakovaně. Pro školní projekt to nevadí, ve skutečném provozu bychom to doplnili.</w:t>
+      </w:r>
+    </w:p>
+    <w:p>
+      <w:pPr>
+        <w:pStyle w:val="Nadpis2"/>
+        <w:keepNext/>
+      </w:pPr>
+      <w:r>
+        <w:rPr/>
+        <w:t xml:space="preserve">AJAX</w:t>
+      </w:r>
+    </w:p>
+    <w:p>
+      <w:pPr>
+        <w:spacing w:line="360" w:lineRule="auto"/>
+        <w:ind w:firstLine="567"/>
+        <w:jc w:val="both"/>
+      </w:pPr>
+      <w:r>
+        <w:rPr/>
+        <w:t xml:space="preserve">Filtry ve výpisu fungují přes AJAX. Po změně filtru nebo při psaní do vyhledávání zavolá JavaScript adresu /api/items. Server vrátí JSON s hotovým HTML karet, počtem výsledků, nadpisem a body pro mapu a stránka se aktualizuje bez načtení. Stejně funguje tlačítko Načíst další. Adresa v prohlížeči se přitom mění, takže jde výsledek poslat odkazem nebo obnovit stránku.</w:t>
+      </w:r>
+    </w:p>
+    <w:p>
+      <w:pPr>
+        <w:spacing w:line="360" w:lineRule="auto"/>
+        <w:ind w:firstLine="567"/>
+        <w:jc w:val="both"/>
+      </w:pPr>
+      <w:r>
+        <w:rPr/>
+        <w:t xml:space="preserve">Karty pro stránku i pro AJAX se generují ze stejné šablony, takže vypadají vždy stejně. Když JavaScript nefunguje, formulář se normálně odešle a server vrátí celou stránku.</w:t>
+      </w:r>
+    </w:p>
+    <w:p>
+      <w:pPr>
+        <w:pStyle w:val="Nadpis2"/>
+        <w:keepNext/>
+      </w:pPr>
+      <w:r>
+        <w:rPr/>
+        <w:t xml:space="preserve">API třetích stran</w:t>
+      </w:r>
+    </w:p>
+    <w:p>
+      <w:pPr>
+        <w:spacing w:line="360" w:lineRule="auto"/>
+        <w:ind w:firstLine="567"/>
+        <w:jc w:val="both"/>
+      </w:pPr>
+      <w:r>
+        <w:rPr/>
+        <w:t xml:space="preserve">Mapu zajišťuje knihovna Leaflet s podklady z OpenStreetMap. Mapa je ve výpisu, kde ukazuje všechny nalezené inzeráty, na detailu inzerátu a ve formuláři pro přidání inzerátu, kde se kliknutím do mapy vybere přesné místo. Body, které jsou blízko u sebe, se spojují do skupin s číslem, aby se nepřekrývaly. Mapa se načítá jen na stránkách, kde je potřeba.</w:t>
+      </w:r>
+    </w:p>
+    <w:p>
+      <w:pPr>
+        <w:spacing w:line="360" w:lineRule="auto"/>
+        <w:ind w:firstLine="567"/>
+        <w:jc w:val="both"/>
+      </w:pPr>
+      <w:r>
+        <w:rPr/>
+        <w:t xml:space="preserve">Souřadnice budov jsme převzali z OpenStreetMap přes služby Nominatim a Overpass API, aby body na mapě opravdu seděly na budovy.</w:t>
+      </w:r>
+    </w:p>
+    <w:p>
+      <w:pPr>
+        <w:spacing w:line="360" w:lineRule="auto"/>
+        <w:ind w:firstLine="567"/>
+        <w:jc w:val="both"/>
+      </w:pPr>
+      <w:r>
+        <w:rPr/>
+        <w:t xml:space="preserve">Na detailu je tlačítko Sdílet. Na mobilu otevře systémové sdílení (Web Share API), na počítači zkopíruje odkaz do schránky.</w:t>
+      </w:r>
+    </w:p>
+    <w:p>
+      <w:pPr>
+        <w:spacing w:line="360" w:lineRule="auto"/>
+        <w:ind w:firstLine="567"/>
+        <w:jc w:val="both"/>
+      </w:pPr>
+      <w:r>
+        <w:rPr/>
+        <w:t xml:space="preserve">Fotky v testovacích inzerátech jsou z Unsplash pod volnou licencí, oříznuté a převedené do formátu WebP.</w:t>
+      </w:r>
+    </w:p>
+    <w:p>
+      <w:pPr>
+        <w:pStyle w:val="Nadpis2"/>
+        <w:keepNext/>
+      </w:pPr>
+      <w:r>
+        <w:rPr/>
+        <w:t xml:space="preserve">Co zbývá dokončit</w:t>
+      </w:r>
+    </w:p>
+    <w:p>
+      <w:pPr>
+        <w:spacing w:line="360" w:lineRule="auto"/>
+        <w:ind w:firstLine="567"/>
+        <w:jc w:val="both"/>
+      </w:pPr>
+      <w:r>
+        <w:rPr/>
+        <w:t xml:space="preserve">Do odevzdání 20. 11. zbývá:</w:t>
+      </w:r>
+    </w:p>
+    <w:p>
+      <w:pPr>
+        <w:pStyle w:val="Odstavecseseznamem"/>
+        <w:numPr>
+          <w:ilvl w:val="0"/>
+          <w:numId w:val="2"/>
+        </w:numPr>
+        <w:spacing w:line="360" w:lineRule="auto"/>
+      </w:pPr>
+      <w:r>
+        <w:rPr/>
+        <w:t xml:space="preserve">nasazení na školní server (ověřit verzi PHP, rozšíření pdo_mysql a GD s podporou WebP),</w:t>
+      </w:r>
+    </w:p>
+    <w:p>
+      <w:pPr>
+        <w:pStyle w:val="Odstavecseseznamem"/>
+        <w:numPr>
+          <w:ilvl w:val="0"/>
+          <w:numId w:val="2"/>
+        </w:numPr>
+        <w:spacing w:line="360" w:lineRule="auto"/>
+      </w:pPr>
+      <w:r>
+        <w:rPr/>
+        <w:t xml:space="preserve">nastavení odesílání e-mailů na serveru (lokálně se e-maily jen zapisují do logu),</w:t>
+      </w:r>
+    </w:p>
+    <w:p>
+      <w:pPr>
+        <w:pStyle w:val="Odstavecseseznamem"/>
+        <w:numPr>
+          <w:ilvl w:val="0"/>
+          <w:numId w:val="2"/>
+        </w:numPr>
+        <w:spacing w:line="360" w:lineRule="auto"/>
+      </w:pPr>
+      <w:r>
+        <w:rPr/>
+        <w:t xml:space="preserve">vytvoření prvního administrátora na serveru,</w:t>
+      </w:r>
+    </w:p>
+    <w:p>
+      <w:pPr>
+        <w:pStyle w:val="Odstavecseseznamem"/>
+        <w:numPr>
+          <w:ilvl w:val="0"/>
+          <w:numId w:val="2"/>
+        </w:numPr>
+        <w:spacing w:line="360" w:lineRule="auto"/>
+      </w:pPr>
+      <w:r>
+        <w:rPr/>
+        <w:t xml:space="preserve">test použitelnosti se spolužáky, kontrola validity kódu a měření rychlosti na serveru.</w:t>
       </w:r>
     </w:p>
     <w:p>
@@ -4755,7 +5160,7 @@
               <w:rPr>
                 <w:sz w:val="22"/>
               </w:rPr>
-              <w:t xml:space="preserve">Našel jsi v učebně deštník. Zkus ho nahlásit.</w:t>
+              <w:t xml:space="preserve">Našel jsi v učebně deštník. Zaregistruj se a nahlas ho.</w:t>
             </w:r>
           </w:p>
         </w:tc>
@@ -4791,6 +5196,57 @@
                 <w:sz w:val="22"/>
               </w:rPr>
               <w:t xml:space="preserve">5</w:t>
+            </w:r>
+          </w:p>
+        </w:tc>
+        <w:tc>
+          <w:tcPr>
+            <w:tcW w:w="5592" w:type="dxa"/>
+          </w:tcPr>
+          <w:p>
+            <w:pPr>
+              <w:spacing w:before="40" w:after="40"/>
+            </w:pPr>
+            <w:r>
+              <w:rPr>
+                <w:sz w:val="22"/>
+              </w:rPr>
+              <w:t xml:space="preserve">Deštník se vrátil majiteli. Označ inzerát jako vrácený.</w:t>
+            </w:r>
+          </w:p>
+        </w:tc>
+        <w:tc>
+          <w:tcPr>
+            <w:tcW w:w="2397" w:type="dxa"/>
+          </w:tcPr>
+          <w:p>
+            <w:pPr>
+              <w:spacing w:before="40" w:after="40"/>
+            </w:pPr>
+            <w:r>
+              <w:rPr>
+                <w:sz w:val="22"/>
+                <w:highlight w:val="yellow"/>
+              </w:rPr>
+              <w:t xml:space="preserve">DOPLNIT</w:t>
+            </w:r>
+          </w:p>
+        </w:tc>
+      </w:tr>
+      <w:tr>
+        <w:tc>
+          <w:tcPr>
+            <w:tcW w:w="799" w:type="dxa"/>
+          </w:tcPr>
+          <w:p>
+            <w:pPr>
+              <w:spacing w:before="40" w:after="40"/>
+            </w:pPr>
+            <w:r>
+              <w:rPr>
+                <w:sz w:val="22"/>
+              </w:rPr>
+              <w:t xml:space="preserve">6</w:t>
             </w:r>
           </w:p>
         </w:tc>
@@ -4860,7 +5316,7 @@
       </w:pPr>
       <w:r>
         <w:rPr/>
-        <w:t xml:space="preserve">Cílem je úroveň WCAG 2.1 AA. Lighthouse hlásí v kategorii přístupnost 100 bodů ze 100 na úvodu, výpisu, detailu i stránce Nahlásit věc, na počítači i na mobilu. Během vývoje jsme opravili například:</w:t>
+        <w:t xml:space="preserve">Cílem je úroveň WCAG 2.1 AA. Lighthouse hlásí v kategorii přístupnost 100 bodů ze 100 na všech stránkách, které jsme měřili: úvod, výpis, detail, formulář pro přidání inzerátu, Můj účet a administrace, na počítači i na mobilu. Během vývoje jsme opravili například:</w:t>
       </w:r>
     </w:p>
     <w:p>
@@ -4941,7 +5397,7 @@
       </w:pPr>
       <w:r>
         <w:rPr/>
-        <w:t xml:space="preserve">Web jde celý ovládat klávesnicí, má odkaz Přeskočit na obsah, viditelný fokus a popisky u všech polí formulářů. Počet výsledků po filtrování přečte i čtečka obrazovky a kontrast barev odpovídá WCAG AA. </w:t>
+        <w:t xml:space="preserve">Web jde celý ovládat klávesnicí, má odkaz Přeskočit na obsah, viditelný fokus a popisky u všech polí formulářů. Chyby ve formulářích se zobrazí přímo u pole a čtečka obrazovky je přečte. Mobilní menu jde zavřít klávesou Escape. Kontrast barev odpovídá WCAG AA. </w:t>
       </w:r>
       <w:r>
         <w:rPr>
@@ -5035,7 +5491,7 @@
       </w:pPr>
       <w:r>
         <w:rPr/>
-        <w:t xml:space="preserve">Lighthouse dává 100 bodů i v kategoriích Best Practices a SEO. </w:t>
+        <w:t xml:space="preserve">Lighthouse dává 100 bodů i v kategoriích Best Practices a SEO na veřejných stránkách. Soukromé stránky mají v SEO méně bodů schválně, protože mají nastavené noindex. </w:t>
       </w:r>
       <w:r>
         <w:rPr>
@@ -5073,6 +5529,80 @@
     </w:p>
     <w:p>
       <w:pPr>
+        <w:pStyle w:val="Nadpis2"/>
+        <w:keepNext/>
+      </w:pPr>
+      <w:r>
+        <w:rPr/>
+        <w:t xml:space="preserve">Automatické testy</w:t>
+      </w:r>
+    </w:p>
+    <w:p>
+      <w:pPr>
+        <w:spacing w:line="360" w:lineRule="auto"/>
+        <w:ind w:firstLine="567"/>
+        <w:jc w:val="both"/>
+      </w:pPr>
+      <w:r>
+        <w:rPr/>
+        <w:t xml:space="preserve">Serverovou část hlídá 281 automatických testů v PHPUnit (675 kontrol). Testy běží proti samostatné testovací databázi, která se při každém spuštění vytvoří znovu. Spouštějí se příkazem composer test.</w:t>
+      </w:r>
+    </w:p>
+    <w:p>
+      <w:pPr>
+        <w:pStyle w:val="Odstavecseseznamem"/>
+        <w:numPr>
+          <w:ilvl w:val="0"/>
+          <w:numId w:val="2"/>
+        </w:numPr>
+        <w:spacing w:line="360" w:lineRule="auto"/>
+      </w:pPr>
+      <w:r>
+        <w:rPr/>
+        <w:t xml:space="preserve">jednotkové testy kontrolují pomocné funkce, filtry výpisu a validaci formulářů,</w:t>
+      </w:r>
+    </w:p>
+    <w:p>
+      <w:pPr>
+        <w:pStyle w:val="Odstavecseseznamem"/>
+        <w:numPr>
+          <w:ilvl w:val="0"/>
+          <w:numId w:val="2"/>
+        </w:numPr>
+        <w:spacing w:line="360" w:lineRule="auto"/>
+      </w:pPr>
+      <w:r>
+        <w:rPr/>
+        <w:t xml:space="preserve">testy celých požadavků procházejí registraci a přihlášení, Můj účet, kontaktní formulář, administraci inzerátů, uživatelů, kategorií a budov,</w:t>
+      </w:r>
+    </w:p>
+    <w:p>
+      <w:pPr>
+        <w:pStyle w:val="Odstavecseseznamem"/>
+        <w:numPr>
+          <w:ilvl w:val="0"/>
+          <w:numId w:val="2"/>
+        </w:numPr>
+        <w:spacing w:line="360" w:lineRule="auto"/>
+      </w:pPr>
+      <w:r>
+        <w:rPr/>
+        <w:t xml:space="preserve">zvlášť se testuje, že bez CSRF tokenu formulář neprojde a že cizí inzerát nejde upravit.</w:t>
+      </w:r>
+    </w:p>
+    <w:p>
+      <w:pPr>
+        <w:spacing w:line="360" w:lineRule="auto"/>
+        <w:ind w:firstLine="567"/>
+        <w:jc w:val="both"/>
+      </w:pPr>
+      <w:r>
+        <w:rPr/>
+        <w:t xml:space="preserve">Při posledním spuštění prošly všechny testy.</w:t>
+      </w:r>
+    </w:p>
+    <w:p>
+      <w:pPr>
         <w:pStyle w:val="Nadpis1"/>
         <w:keepNext/>
       </w:pPr>
@@ -5092,7 +5622,7 @@
       </w:pPr>
       <w:r>
         <w:rPr/>
-        <w:t xml:space="preserve">Zatím máme hotovou úvodní studii a velkou část realizace. Web běží, umí výpis s filtry a mapou a detail inzerátu s kontaktním formulářem a je připravený pro vyhledávače. Do odevzdání zbývá hlavně přihlášení, přidávání inzerátů, administrace a napojení databáze.</w:t>
+        <w:t xml:space="preserve">Máme hotovou úvodní studii i realizaci. Web umí výpis s filtry a mapou, detail inzerátu s kontaktním formulářem, registraci a přihlášení, přidávání inzerátů s fotkou a místem na mapě a administraci. Data jsou v MariaDB a serverovou část hlídají automatické testy. Do odevzdání zbývá nasazení na školní server, testy na serveru a test použitelnosti.</w:t>
       </w:r>
     </w:p>
     <w:p>
@@ -5103,7 +5633,7 @@
       </w:pPr>
       <w:r>
         <w:rPr/>
-        <w:t xml:space="preserve">Do budoucna by se dalo přidat upozornění e-mailem, když přibude nález podobný hledané věci, přihlášení přes účet ČZU, automatické archivování inzerátů starších než rok nebo zapojení knihovny a Správy učeben jako samostatných pracovišť.</w:t>
+        <w:t xml:space="preserve">Do budoucna by se dalo přidat upozornění e-mailem, když přibude nález podobný hledané věci, přihlášení přes účet ČZU, omezení počtu pokusů o přihlášení, automatické archivování inzerátů starších než rok nebo zapojení knihovny a Správy učeben jako samostatných pracovišť.</w:t>
       </w:r>
     </w:p>
     <w:p>
@@ -5269,6 +5799,34 @@
       </w:pPr>
       <w:r>
         <w:rPr/>
+        <w:t xml:space="preserve">PHPUnit [online]. [cit. 2026-10-19]. Dostupné z: https://phpunit.de</w:t>
+      </w:r>
+    </w:p>
+    <w:p>
+      <w:pPr>
+        <w:pStyle w:val="Odstavecseseznamem"/>
+        <w:numPr>
+          <w:ilvl w:val="0"/>
+          <w:numId w:val="18"/>
+        </w:numPr>
+        <w:spacing w:line="360" w:lineRule="auto"/>
+      </w:pPr>
+      <w:r>
+        <w:rPr/>
+        <w:t xml:space="preserve">OWASP. Cross-Site Request Forgery Prevention Cheat Sheet [online]. [cit. 2026-10-19]. Dostupné z: https://cheatsheetseries.owasp.org/cheatsheets/Cross-Site_Request_Forgery_Prevention_Cheat_Sheet.html</w:t>
+      </w:r>
+    </w:p>
+    <w:p>
+      <w:pPr>
+        <w:pStyle w:val="Odstavecseseznamem"/>
+        <w:numPr>
+          <w:ilvl w:val="0"/>
+          <w:numId w:val="18"/>
+        </w:numPr>
+        <w:spacing w:line="360" w:lineRule="auto"/>
+      </w:pPr>
+      <w:r>
+        <w:rPr/>
         <w:t xml:space="preserve">UNSPLASH. Unsplash License [online]. [cit. 2026-10-14]. Dostupné z: https://unsplash.com/license</w:t>
       </w:r>
     </w:p>
@@ -5337,6 +5895,28 @@
       <w:r>
         <w:rPr/>
         <w:t xml:space="preserve">Obrázek 4: Úvodní stránka a detail inzerátu na mobilu</w:t>
+      </w:r>
+    </w:p>
+    <w:p>
+      <w:pPr>
+        <w:spacing w:line="360" w:lineRule="auto"/>
+        <w:ind w:firstLine="567"/>
+        <w:jc w:val="both"/>
+      </w:pPr>
+      <w:r>
+        <w:rPr/>
+        <w:t xml:space="preserve">Obrázek 5: Formulář pro přidání nálezu</w:t>
+      </w:r>
+    </w:p>
+    <w:p>
+      <w:pPr>
+        <w:spacing w:line="360" w:lineRule="auto"/>
+        <w:ind w:firstLine="567"/>
+        <w:jc w:val="both"/>
+      </w:pPr>
+      <w:r>
+        <w:rPr/>
+        <w:t xml:space="preserve">Obrázek 6: Administrace inzerátů</w:t>
       </w:r>
     </w:p>
     <w:p>
@@ -5737,7 +6317,7 @@
               <w:rPr>
                 <w:sz w:val="22"/>
               </w:rPr>
-              <w:t xml:space="preserve">PEF</w:t>
+              <w:t xml:space="preserve">PDO</w:t>
             </w:r>
           </w:p>
         </w:tc>
@@ -5753,7 +6333,7 @@
               <w:rPr>
                 <w:sz w:val="22"/>
               </w:rPr>
-              <w:t xml:space="preserve">Provozně ekonomická fakulta</w:t>
+              <w:t xml:space="preserve">rozhraní PHP pro práci s databází</w:t>
             </w:r>
           </w:p>
         </w:tc>
@@ -5771,6 +6351,40 @@
               <w:rPr>
                 <w:sz w:val="22"/>
               </w:rPr>
+              <w:t xml:space="preserve">PEF</w:t>
+            </w:r>
+          </w:p>
+        </w:tc>
+        <w:tc>
+          <w:tcPr>
+            <w:tcW w:w="7030" w:type="dxa"/>
+          </w:tcPr>
+          <w:p>
+            <w:pPr>
+              <w:spacing w:before="40" w:after="40"/>
+            </w:pPr>
+            <w:r>
+              <w:rPr>
+                <w:sz w:val="22"/>
+              </w:rPr>
+              <w:t xml:space="preserve">Provozně ekonomická fakulta</w:t>
+            </w:r>
+          </w:p>
+        </w:tc>
+      </w:tr>
+      <w:tr>
+        <w:tc>
+          <w:tcPr>
+            <w:tcW w:w="1758" w:type="dxa"/>
+          </w:tcPr>
+          <w:p>
+            <w:pPr>
+              <w:spacing w:before="40" w:after="40"/>
+            </w:pPr>
+            <w:r>
+              <w:rPr>
+                <w:sz w:val="22"/>
+              </w:rPr>
               <w:t xml:space="preserve">SEO</w:t>
             </w:r>
           </w:p>
@@ -5788,6 +6402,40 @@
                 <w:sz w:val="22"/>
               </w:rPr>
               <w:t xml:space="preserve">optimalizace pro vyhledávače</w:t>
+            </w:r>
+          </w:p>
+        </w:tc>
+      </w:tr>
+      <w:tr>
+        <w:tc>
+          <w:tcPr>
+            <w:tcW w:w="1758" w:type="dxa"/>
+          </w:tcPr>
+          <w:p>
+            <w:pPr>
+              <w:spacing w:before="40" w:after="40"/>
+            </w:pPr>
+            <w:r>
+              <w:rPr>
+                <w:sz w:val="22"/>
+              </w:rPr>
+              <w:t xml:space="preserve">SQL</w:t>
+            </w:r>
+          </w:p>
+        </w:tc>
+        <w:tc>
+          <w:tcPr>
+            <w:tcW w:w="7030" w:type="dxa"/>
+          </w:tcPr>
+          <w:p>
+            <w:pPr>
+              <w:spacing w:before="40" w:after="40"/>
+            </w:pPr>
+            <w:r>
+              <w:rPr>
+                <w:sz w:val="22"/>
+              </w:rPr>
+              <w:t xml:space="preserve">jazyk pro dotazy do databáze</w:t>
             </w:r>
           </w:p>
         </w:tc>

</xml_diff>

<commit_message>
Add wireframes and include them in documentation
Co-Authored-By: Claude Opus 5.5 <noreply@anthropic.com>
</commit_message>
<xml_diff>
--- a/docs/dokumentace-tym-07.docx
+++ b/docs/dokumentace-tym-07.docx
@@ -2700,10 +2700,8 @@
         <w:jc w:val="both"/>
       </w:pPr>
       <w:r>
-        <w:rPr>
-          <w:highlight w:val="yellow"/>
-        </w:rPr>
-        <w:t xml:space="preserve">DOPLNIT: wireframy úvodní stránky, výpisu, detailu a formuláře pro přidání inzerátu, ve verzi pro počítač i mobil. Obrázky vložit sem.</w:t>
+        <w:rPr/>
+        <w:t xml:space="preserve">Než jsme začali s grafikou, nakreslili jsme drátěné modely hlavních obrazovek. Ukazují jen rozložení stránky: šedé bloky nahrazují text, přeškrtnuté obdélníky fotky a mapu, žluté poznámky vysvětlují chování. Barvy a písmo jsme řešili až potom.</w:t>
       </w:r>
     </w:p>
     <w:p>
@@ -2714,7 +2712,230 @@
       </w:pPr>
       <w:r>
         <w:rPr/>
-        <w:t xml:space="preserve">Při návrhu jsme počítali s tím, že většina lidí otevře web z mobilu hned ve chvíli, kdy zjistí, že něco ztratili. Proto je na úvodní stránce nahoře vyhledávání a hned pod ním nejnovější inzeráty.</w:t>
+        <w:t xml:space="preserve">Při návrhu jsme počítali s tím, že většina lidí otevře web z mobilu hned ve chvíli, kdy zjistí, že něco ztratili. Proto je na úvodní stránce nahoře vyhledávání a hned pod ním nejnovější inzeráty. Na mobilu je navigace schovaná pod tlačítkem menu a tlačítko Nahlásit věc zůstává vždy vidět.</w:t>
+      </w:r>
+    </w:p>
+    <w:p>
+      <w:pPr>
+        <w:spacing w:line="360" w:lineRule="auto"/>
+        <w:ind w:firstLine="567"/>
+        <w:jc w:val="both"/>
+      </w:pPr>
+      <w:r>
+        <w:rPr/>
+        <w:t xml:space="preserve">Celkem jsme připravili 12 wireframů: úvod, výpis, detail a formulář pro přidání inzerátu ve verzi pro počítač i mobil, dále přihlášení a registraci, Můj účet, administraci a list se společnými komponentami (hlavička, karta inzerátu, štítky, tlačítka, formulářová pole). Níže jsou úvod a detail, ostatní jsou v příloze 2. Zdrojové soubory SVG jsou v repozitáři ve složce docs/wireframes.</w:t>
+      </w:r>
+    </w:p>
+    <w:p>
+      <w:pPr>
+        <w:keepNext/>
+        <w:spacing w:before="240"/>
+        <w:jc w:val="center"/>
+      </w:pPr>
+      <w:r>
+        <w:drawing>
+          <wp:inline distT="0" distB="0" distL="0" distR="0">
+            <wp:extent cx="3556000" cy="3573869"/>
+            <wp:docPr id="101" name="Obrázek 101" descr="Wireframe úvodní stránky (počítač a mobil)"/>
+            <a:graphic xmlns:a="http://schemas.openxmlformats.org/drawingml/2006/main">
+              <a:graphicData uri="http://schemas.openxmlformats.org/drawingml/2006/picture">
+                <pic:pic xmlns:pic="http://schemas.openxmlformats.org/drawingml/2006/picture">
+                  <pic:nvPicPr>
+                    <pic:cNvPr id="101" name="01-uvod-pocitac.jpg"/>
+                    <pic:cNvPicPr/>
+                  </pic:nvPicPr>
+                  <pic:blipFill>
+                    <a:blip r:embed="rIdImg1"/>
+                    <a:stretch>
+                      <a:fillRect/>
+                    </a:stretch>
+                  </pic:blipFill>
+                  <pic:spPr>
+                    <a:xfrm>
+                      <a:off x="0" y="0"/>
+                      <a:ext cx="3556000" cy="3573869"/>
+                    </a:xfrm>
+                    <a:prstGeom prst="rect">
+                      <a:avLst/>
+                    </a:prstGeom>
+                    <a:ln w="6350">
+                      <a:solidFill>
+                        <a:srgbClr val="CDC6B8"/>
+                      </a:solidFill>
+                    </a:ln>
+                  </pic:spPr>
+                </pic:pic>
+              </a:graphicData>
+            </a:graphic>
+          </wp:inline>
+        </w:drawing>
+      </w:r>
+      <w:r>
+        <w:t xml:space="preserve">    </w:t>
+      </w:r>
+      <w:r>
+        <w:drawing>
+          <wp:inline distT="0" distB="0" distL="0" distR="0">
+            <wp:extent cx="1206500" cy="4778218"/>
+            <wp:docPr id="102" name="Obrázek 102" descr="Wireframe úvodní stránky (počítač a mobil)"/>
+            <a:graphic xmlns:a="http://schemas.openxmlformats.org/drawingml/2006/main">
+              <a:graphicData uri="http://schemas.openxmlformats.org/drawingml/2006/picture">
+                <pic:pic xmlns:pic="http://schemas.openxmlformats.org/drawingml/2006/picture">
+                  <pic:nvPicPr>
+                    <pic:cNvPr id="102" name="01-uvod-mobil.jpg"/>
+                    <pic:cNvPicPr/>
+                  </pic:nvPicPr>
+                  <pic:blipFill>
+                    <a:blip r:embed="rIdImg2"/>
+                    <a:stretch>
+                      <a:fillRect/>
+                    </a:stretch>
+                  </pic:blipFill>
+                  <pic:spPr>
+                    <a:xfrm>
+                      <a:off x="0" y="0"/>
+                      <a:ext cx="1206500" cy="4778218"/>
+                    </a:xfrm>
+                    <a:prstGeom prst="rect">
+                      <a:avLst/>
+                    </a:prstGeom>
+                    <a:ln w="6350">
+                      <a:solidFill>
+                        <a:srgbClr val="CDC6B8"/>
+                      </a:solidFill>
+                    </a:ln>
+                  </pic:spPr>
+                </pic:pic>
+              </a:graphicData>
+            </a:graphic>
+          </wp:inline>
+        </w:drawing>
+      </w:r>
+    </w:p>
+    <w:p>
+      <w:pPr>
+        <w:keepNext/>
+        <w:spacing w:before="60" w:after="240"/>
+        <w:jc w:val="center"/>
+      </w:pPr>
+      <w:r>
+        <w:rPr>
+          <w:sz w:val="22"/>
+          <w:b/>
+        </w:rPr>
+        <w:t xml:space="preserve">Obrázek 1: </w:t>
+      </w:r>
+      <w:r>
+        <w:rPr>
+          <w:sz w:val="22"/>
+        </w:rPr>
+        <w:t xml:space="preserve">Wireframe úvodní stránky (počítač a mobil)</w:t>
+      </w:r>
+    </w:p>
+    <w:p>
+      <w:pPr>
+        <w:keepNext/>
+        <w:spacing w:before="240"/>
+        <w:jc w:val="center"/>
+      </w:pPr>
+      <w:r>
+        <w:drawing>
+          <wp:inline distT="0" distB="0" distL="0" distR="0">
+            <wp:extent cx="3556000" cy="4652167"/>
+            <wp:docPr id="103" name="Obrázek 103" descr="Wireframe detailu inzerátu (počítač a mobil)"/>
+            <a:graphic xmlns:a="http://schemas.openxmlformats.org/drawingml/2006/main">
+              <a:graphicData uri="http://schemas.openxmlformats.org/drawingml/2006/picture">
+                <pic:pic xmlns:pic="http://schemas.openxmlformats.org/drawingml/2006/picture">
+                  <pic:nvPicPr>
+                    <pic:cNvPr id="103" name="03-detail-pocitac.jpg"/>
+                    <pic:cNvPicPr/>
+                  </pic:nvPicPr>
+                  <pic:blipFill>
+                    <a:blip r:embed="rIdImg3"/>
+                    <a:stretch>
+                      <a:fillRect/>
+                    </a:stretch>
+                  </pic:blipFill>
+                  <pic:spPr>
+                    <a:xfrm>
+                      <a:off x="0" y="0"/>
+                      <a:ext cx="3556000" cy="4652167"/>
+                    </a:xfrm>
+                    <a:prstGeom prst="rect">
+                      <a:avLst/>
+                    </a:prstGeom>
+                    <a:ln w="6350">
+                      <a:solidFill>
+                        <a:srgbClr val="CDC6B8"/>
+                      </a:solidFill>
+                    </a:ln>
+                  </pic:spPr>
+                </pic:pic>
+              </a:graphicData>
+            </a:graphic>
+          </wp:inline>
+        </w:drawing>
+      </w:r>
+      <w:r>
+        <w:t xml:space="preserve">    </w:t>
+      </w:r>
+      <w:r>
+        <w:drawing>
+          <wp:inline distT="0" distB="0" distL="0" distR="0">
+            <wp:extent cx="1206500" cy="5832024"/>
+            <wp:docPr id="104" name="Obrázek 104" descr="Wireframe detailu inzerátu (počítač a mobil)"/>
+            <a:graphic xmlns:a="http://schemas.openxmlformats.org/drawingml/2006/main">
+              <a:graphicData uri="http://schemas.openxmlformats.org/drawingml/2006/picture">
+                <pic:pic xmlns:pic="http://schemas.openxmlformats.org/drawingml/2006/picture">
+                  <pic:nvPicPr>
+                    <pic:cNvPr id="104" name="03-detail-mobil.jpg"/>
+                    <pic:cNvPicPr/>
+                  </pic:nvPicPr>
+                  <pic:blipFill>
+                    <a:blip r:embed="rIdImg4"/>
+                    <a:stretch>
+                      <a:fillRect/>
+                    </a:stretch>
+                  </pic:blipFill>
+                  <pic:spPr>
+                    <a:xfrm>
+                      <a:off x="0" y="0"/>
+                      <a:ext cx="1206500" cy="5832024"/>
+                    </a:xfrm>
+                    <a:prstGeom prst="rect">
+                      <a:avLst/>
+                    </a:prstGeom>
+                    <a:ln w="6350">
+                      <a:solidFill>
+                        <a:srgbClr val="CDC6B8"/>
+                      </a:solidFill>
+                    </a:ln>
+                  </pic:spPr>
+                </pic:pic>
+              </a:graphicData>
+            </a:graphic>
+          </wp:inline>
+        </w:drawing>
+      </w:r>
+    </w:p>
+    <w:p>
+      <w:pPr>
+        <w:keepNext/>
+        <w:spacing w:before="60" w:after="240"/>
+        <w:jc w:val="center"/>
+      </w:pPr>
+      <w:r>
+        <w:rPr>
+          <w:sz w:val="22"/>
+          <w:b/>
+        </w:rPr>
+        <w:t xml:space="preserve">Obrázek 2: </w:t>
+      </w:r>
+      <w:r>
+        <w:rPr>
+          <w:sz w:val="22"/>
+        </w:rPr>
+        <w:t xml:space="preserve">Wireframe detailu inzerátu (počítač a mobil)</w:t>
       </w:r>
     </w:p>
     <w:p>
@@ -3988,16 +4209,16 @@
         <w:drawing>
           <wp:inline distT="0" distB="0" distL="0" distR="0">
             <wp:extent cx="5580380" cy="3487738"/>
-            <wp:docPr id="101" name="Obrázek 101" descr="Úvodní stránka na počítači"/>
+            <wp:docPr id="105" name="Obrázek 105" descr="Úvodní stránka na počítači"/>
             <a:graphic xmlns:a="http://schemas.openxmlformats.org/drawingml/2006/main">
               <a:graphicData uri="http://schemas.openxmlformats.org/drawingml/2006/picture">
                 <pic:pic xmlns:pic="http://schemas.openxmlformats.org/drawingml/2006/picture">
                   <pic:nvPicPr>
-                    <pic:cNvPr id="101" name="homepage-desktop.jpg"/>
+                    <pic:cNvPr id="105" name="homepage-desktop.jpg"/>
                     <pic:cNvPicPr/>
                   </pic:nvPicPr>
                   <pic:blipFill>
-                    <a:blip r:embed="rIdImg1"/>
+                    <a:blip r:embed="rIdImg5"/>
                     <a:stretch>
                       <a:fillRect/>
                     </a:stretch>
@@ -4034,7 +4255,7 @@
           <w:sz w:val="22"/>
           <w:b/>
         </w:rPr>
-        <w:t xml:space="preserve">Obrázek 1: </w:t>
+        <w:t xml:space="preserve">Obrázek 3: </w:t>
       </w:r>
       <w:r>
         <w:rPr>
@@ -4053,395 +4274,12 @@
         <w:drawing>
           <wp:inline distT="0" distB="0" distL="0" distR="0">
             <wp:extent cx="5580380" cy="3487738"/>
-            <wp:docPr id="102" name="Obrázek 102" descr="Výpis inzerátů s filtry a mapou"/>
+            <wp:docPr id="106" name="Obrázek 106" descr="Výpis inzerátů s filtry a mapou"/>
             <a:graphic xmlns:a="http://schemas.openxmlformats.org/drawingml/2006/main">
               <a:graphicData uri="http://schemas.openxmlformats.org/drawingml/2006/picture">
                 <pic:pic xmlns:pic="http://schemas.openxmlformats.org/drawingml/2006/picture">
                   <pic:nvPicPr>
-                    <pic:cNvPr id="102" name="vypis-desktop.jpg"/>
-                    <pic:cNvPicPr/>
-                  </pic:nvPicPr>
-                  <pic:blipFill>
-                    <a:blip r:embed="rIdImg2"/>
-                    <a:stretch>
-                      <a:fillRect/>
-                    </a:stretch>
-                  </pic:blipFill>
-                  <pic:spPr>
-                    <a:xfrm>
-                      <a:off x="0" y="0"/>
-                      <a:ext cx="5580380" cy="3487738"/>
-                    </a:xfrm>
-                    <a:prstGeom prst="rect">
-                      <a:avLst/>
-                    </a:prstGeom>
-                    <a:ln w="6350">
-                      <a:solidFill>
-                        <a:srgbClr val="CDC6B8"/>
-                      </a:solidFill>
-                    </a:ln>
-                  </pic:spPr>
-                </pic:pic>
-              </a:graphicData>
-            </a:graphic>
-          </wp:inline>
-        </w:drawing>
-      </w:r>
-    </w:p>
-    <w:p>
-      <w:pPr>
-        <w:keepNext/>
-        <w:spacing w:before="60" w:after="240"/>
-        <w:jc w:val="center"/>
-      </w:pPr>
-      <w:r>
-        <w:rPr>
-          <w:sz w:val="22"/>
-          <w:b/>
-        </w:rPr>
-        <w:t xml:space="preserve">Obrázek 2: </w:t>
-      </w:r>
-      <w:r>
-        <w:rPr>
-          <w:sz w:val="22"/>
-        </w:rPr>
-        <w:t xml:space="preserve">Výpis inzerátů s filtry a mapou</w:t>
-      </w:r>
-    </w:p>
-    <w:p>
-      <w:pPr>
-        <w:keepNext/>
-        <w:spacing w:before="240"/>
-        <w:jc w:val="center"/>
-      </w:pPr>
-      <w:r>
-        <w:drawing>
-          <wp:inline distT="0" distB="0" distL="0" distR="0">
-            <wp:extent cx="5580380" cy="3487738"/>
-            <wp:docPr id="103" name="Obrázek 103" descr="Detail inzerátu"/>
-            <a:graphic xmlns:a="http://schemas.openxmlformats.org/drawingml/2006/main">
-              <a:graphicData uri="http://schemas.openxmlformats.org/drawingml/2006/picture">
-                <pic:pic xmlns:pic="http://schemas.openxmlformats.org/drawingml/2006/picture">
-                  <pic:nvPicPr>
-                    <pic:cNvPr id="103" name="detail-desktop.jpg"/>
-                    <pic:cNvPicPr/>
-                  </pic:nvPicPr>
-                  <pic:blipFill>
-                    <a:blip r:embed="rIdImg3"/>
-                    <a:stretch>
-                      <a:fillRect/>
-                    </a:stretch>
-                  </pic:blipFill>
-                  <pic:spPr>
-                    <a:xfrm>
-                      <a:off x="0" y="0"/>
-                      <a:ext cx="5580380" cy="3487738"/>
-                    </a:xfrm>
-                    <a:prstGeom prst="rect">
-                      <a:avLst/>
-                    </a:prstGeom>
-                    <a:ln w="6350">
-                      <a:solidFill>
-                        <a:srgbClr val="CDC6B8"/>
-                      </a:solidFill>
-                    </a:ln>
-                  </pic:spPr>
-                </pic:pic>
-              </a:graphicData>
-            </a:graphic>
-          </wp:inline>
-        </w:drawing>
-      </w:r>
-    </w:p>
-    <w:p>
-      <w:pPr>
-        <w:keepNext/>
-        <w:spacing w:before="60" w:after="240"/>
-        <w:jc w:val="center"/>
-      </w:pPr>
-      <w:r>
-        <w:rPr>
-          <w:sz w:val="22"/>
-          <w:b/>
-        </w:rPr>
-        <w:t xml:space="preserve">Obrázek 3: </w:t>
-      </w:r>
-      <w:r>
-        <w:rPr>
-          <w:sz w:val="22"/>
-        </w:rPr>
-        <w:t xml:space="preserve">Detail inzerátu</w:t>
-      </w:r>
-    </w:p>
-    <w:p>
-      <w:pPr>
-        <w:keepNext/>
-        <w:spacing w:before="240"/>
-        <w:jc w:val="center"/>
-      </w:pPr>
-      <w:r>
-        <w:drawing>
-          <wp:inline distT="0" distB="0" distL="0" distR="0">
-            <wp:extent cx="2159000" cy="3644392"/>
-            <wp:docPr id="104" name="Obrázek 104" descr="Úvodní stránka a detail inzerátu na mobilu"/>
-            <a:graphic xmlns:a="http://schemas.openxmlformats.org/drawingml/2006/main">
-              <a:graphicData uri="http://schemas.openxmlformats.org/drawingml/2006/picture">
-                <pic:pic xmlns:pic="http://schemas.openxmlformats.org/drawingml/2006/picture">
-                  <pic:nvPicPr>
-                    <pic:cNvPr id="104" name="homepage-mobil.jpg"/>
-                    <pic:cNvPicPr/>
-                  </pic:nvPicPr>
-                  <pic:blipFill>
-                    <a:blip r:embed="rIdImg4"/>
-                    <a:stretch>
-                      <a:fillRect/>
-                    </a:stretch>
-                  </pic:blipFill>
-                  <pic:spPr>
-                    <a:xfrm>
-                      <a:off x="0" y="0"/>
-                      <a:ext cx="2159000" cy="3644392"/>
-                    </a:xfrm>
-                    <a:prstGeom prst="rect">
-                      <a:avLst/>
-                    </a:prstGeom>
-                    <a:ln w="6350">
-                      <a:solidFill>
-                        <a:srgbClr val="CDC6B8"/>
-                      </a:solidFill>
-                    </a:ln>
-                  </pic:spPr>
-                </pic:pic>
-              </a:graphicData>
-            </a:graphic>
-          </wp:inline>
-        </w:drawing>
-      </w:r>
-      <w:r>
-        <w:t xml:space="preserve">    </w:t>
-      </w:r>
-      <w:r>
-        <w:drawing>
-          <wp:inline distT="0" distB="0" distL="0" distR="0">
-            <wp:extent cx="2159000" cy="3644392"/>
-            <wp:docPr id="105" name="Obrázek 105" descr="Úvodní stránka a detail inzerátu na mobilu"/>
-            <a:graphic xmlns:a="http://schemas.openxmlformats.org/drawingml/2006/main">
-              <a:graphicData uri="http://schemas.openxmlformats.org/drawingml/2006/picture">
-                <pic:pic xmlns:pic="http://schemas.openxmlformats.org/drawingml/2006/picture">
-                  <pic:nvPicPr>
-                    <pic:cNvPr id="105" name="detail-mobil.jpg"/>
-                    <pic:cNvPicPr/>
-                  </pic:nvPicPr>
-                  <pic:blipFill>
-                    <a:blip r:embed="rIdImg5"/>
-                    <a:stretch>
-                      <a:fillRect/>
-                    </a:stretch>
-                  </pic:blipFill>
-                  <pic:spPr>
-                    <a:xfrm>
-                      <a:off x="0" y="0"/>
-                      <a:ext cx="2159000" cy="3644392"/>
-                    </a:xfrm>
-                    <a:prstGeom prst="rect">
-                      <a:avLst/>
-                    </a:prstGeom>
-                    <a:ln w="6350">
-                      <a:solidFill>
-                        <a:srgbClr val="CDC6B8"/>
-                      </a:solidFill>
-                    </a:ln>
-                  </pic:spPr>
-                </pic:pic>
-              </a:graphicData>
-            </a:graphic>
-          </wp:inline>
-        </w:drawing>
-      </w:r>
-    </w:p>
-    <w:p>
-      <w:pPr>
-        <w:keepNext/>
-        <w:spacing w:before="60" w:after="240"/>
-        <w:jc w:val="center"/>
-      </w:pPr>
-      <w:r>
-        <w:rPr>
-          <w:sz w:val="22"/>
-          <w:b/>
-        </w:rPr>
-        <w:t xml:space="preserve">Obrázek 4: </w:t>
-      </w:r>
-      <w:r>
-        <w:rPr>
-          <w:sz w:val="22"/>
-        </w:rPr>
-        <w:t xml:space="preserve">Úvodní stránka a detail inzerátu na mobilu</w:t>
-      </w:r>
-    </w:p>
-    <w:p>
-      <w:pPr>
-        <w:pStyle w:val="Nadpis2"/>
-        <w:keepNext/>
-      </w:pPr>
-      <w:r>
-        <w:rPr/>
-        <w:t xml:space="preserve">Serverová část v PHP</w:t>
-      </w:r>
-    </w:p>
-    <w:p>
-      <w:pPr>
-        <w:spacing w:line="360" w:lineRule="auto"/>
-        <w:ind w:firstLine="567"/>
-        <w:jc w:val="both"/>
-      </w:pPr>
-      <w:r>
-        <w:rPr/>
-        <w:t xml:space="preserve">Všechny stránky vykresluje PHP na serveru, takže web funguje i bez JavaScriptu a vyhledávače vidí celý obsah. Požadavky jdou přes jeden vstupní soubor public/index.php a jednoduchý router. Hotové je:</w:t>
-      </w:r>
-    </w:p>
-    <w:p>
-      <w:pPr>
-        <w:pStyle w:val="Odstavecseseznamem"/>
-        <w:numPr>
-          <w:ilvl w:val="0"/>
-          <w:numId w:val="2"/>
-        </w:numPr>
-        <w:spacing w:line="360" w:lineRule="auto"/>
-      </w:pPr>
-      <w:r>
-        <w:rPr/>
-        <w:t xml:space="preserve">úvodní stránka s počty věcí a nejnovějšími inzeráty,</w:t>
-      </w:r>
-    </w:p>
-    <w:p>
-      <w:pPr>
-        <w:pStyle w:val="Odstavecseseznamem"/>
-        <w:numPr>
-          <w:ilvl w:val="0"/>
-          <w:numId w:val="2"/>
-        </w:numPr>
-        <w:spacing w:line="360" w:lineRule="auto"/>
-      </w:pPr>
-      <w:r>
-        <w:rPr/>
-        <w:t xml:space="preserve">výpis s filtry, stránkováním a vyhledáváním, které nerozlišuje diakritiku (klice najde i Klíče),</w:t>
-      </w:r>
-    </w:p>
-    <w:p>
-      <w:pPr>
-        <w:pStyle w:val="Odstavecseseznamem"/>
-        <w:numPr>
-          <w:ilvl w:val="0"/>
-          <w:numId w:val="2"/>
-        </w:numPr>
-        <w:spacing w:line="360" w:lineRule="auto"/>
-      </w:pPr>
-      <w:r>
-        <w:rPr/>
-        <w:t xml:space="preserve">detail inzerátu s fotkou, mapou, podobnými inzeráty a kontaktním formulářem,</w:t>
-      </w:r>
-    </w:p>
-    <w:p>
-      <w:pPr>
-        <w:pStyle w:val="Odstavecseseznamem"/>
-        <w:numPr>
-          <w:ilvl w:val="0"/>
-          <w:numId w:val="2"/>
-        </w:numPr>
-        <w:spacing w:line="360" w:lineRule="auto"/>
-      </w:pPr>
-      <w:r>
-        <w:rPr/>
-        <w:t xml:space="preserve">registrace, přihlášení a odhlášení,</w:t>
-      </w:r>
-    </w:p>
-    <w:p>
-      <w:pPr>
-        <w:pStyle w:val="Odstavecseseznamem"/>
-        <w:numPr>
-          <w:ilvl w:val="0"/>
-          <w:numId w:val="2"/>
-        </w:numPr>
-        <w:spacing w:line="360" w:lineRule="auto"/>
-      </w:pPr>
-      <w:r>
-        <w:rPr/>
-        <w:t xml:space="preserve">přidání, úprava a smazání inzerátu včetně fotky a výběru místa na mapě,</w:t>
-      </w:r>
-    </w:p>
-    <w:p>
-      <w:pPr>
-        <w:pStyle w:val="Odstavecseseznamem"/>
-        <w:numPr>
-          <w:ilvl w:val="0"/>
-          <w:numId w:val="2"/>
-        </w:numPr>
-        <w:spacing w:line="360" w:lineRule="auto"/>
-      </w:pPr>
-      <w:r>
-        <w:rPr/>
-        <w:t xml:space="preserve">stránka Můj účet s vlastními inzeráty a označením věci jako vrácené,</w:t>
-      </w:r>
-    </w:p>
-    <w:p>
-      <w:pPr>
-        <w:pStyle w:val="Odstavecseseznamem"/>
-        <w:numPr>
-          <w:ilvl w:val="0"/>
-          <w:numId w:val="2"/>
-        </w:numPr>
-        <w:spacing w:line="360" w:lineRule="auto"/>
-      </w:pPr>
-      <w:r>
-        <w:rPr/>
-        <w:t xml:space="preserve">administrace inzerátů (skrytí, smazání), uživatelů (blokace, role), kategorií a budov,</w:t>
-      </w:r>
-    </w:p>
-    <w:p>
-      <w:pPr>
-        <w:pStyle w:val="Odstavecseseznamem"/>
-        <w:numPr>
-          <w:ilvl w:val="0"/>
-          <w:numId w:val="2"/>
-        </w:numPr>
-        <w:spacing w:line="360" w:lineRule="auto"/>
-      </w:pPr>
-      <w:r>
-        <w:rPr/>
-        <w:t xml:space="preserve">odeslání zprávy autorovi inzerátu e-mailem, odpověď jde přímo na e-mail odesílatele,</w:t>
-      </w:r>
-    </w:p>
-    <w:p>
-      <w:pPr>
-        <w:pStyle w:val="Odstavecseseznamem"/>
-        <w:numPr>
-          <w:ilvl w:val="0"/>
-          <w:numId w:val="2"/>
-        </w:numPr>
-        <w:spacing w:line="360" w:lineRule="auto"/>
-      </w:pPr>
-      <w:r>
-        <w:rPr/>
-        <w:t xml:space="preserve">sitemap.xml a robots.txt.</w:t>
-      </w:r>
-    </w:p>
-    <w:p>
-      <w:pPr>
-        <w:keepNext/>
-        <w:spacing w:before="240"/>
-        <w:jc w:val="center"/>
-      </w:pPr>
-      <w:r>
-        <w:drawing>
-          <wp:inline distT="0" distB="0" distL="0" distR="0">
-            <wp:extent cx="5580380" cy="3487738"/>
-            <wp:docPr id="106" name="Obrázek 106" descr="Formulář pro přidání nálezu"/>
-            <a:graphic xmlns:a="http://schemas.openxmlformats.org/drawingml/2006/main">
-              <a:graphicData uri="http://schemas.openxmlformats.org/drawingml/2006/picture">
-                <pic:pic xmlns:pic="http://schemas.openxmlformats.org/drawingml/2006/picture">
-                  <pic:nvPicPr>
-                    <pic:cNvPr id="106" name="formular-desktop.jpg"/>
+                    <pic:cNvPr id="106" name="vypis-desktop.jpg"/>
                     <pic:cNvPicPr/>
                   </pic:nvPicPr>
                   <pic:blipFill>
@@ -4482,13 +4320,13 @@
           <w:sz w:val="22"/>
           <w:b/>
         </w:rPr>
-        <w:t xml:space="preserve">Obrázek 5: </w:t>
+        <w:t xml:space="preserve">Obrázek 4: </w:t>
       </w:r>
       <w:r>
         <w:rPr>
           <w:sz w:val="22"/>
         </w:rPr>
-        <w:t xml:space="preserve">Formulář pro přidání nálezu</w:t>
+        <w:t xml:space="preserve">Výpis inzerátů s filtry a mapou</w:t>
       </w:r>
     </w:p>
     <w:p>
@@ -4501,12 +4339,12 @@
         <w:drawing>
           <wp:inline distT="0" distB="0" distL="0" distR="0">
             <wp:extent cx="5580380" cy="3487738"/>
-            <wp:docPr id="107" name="Obrázek 107" descr="Administrace inzerátů"/>
+            <wp:docPr id="107" name="Obrázek 107" descr="Detail inzerátu"/>
             <a:graphic xmlns:a="http://schemas.openxmlformats.org/drawingml/2006/main">
               <a:graphicData uri="http://schemas.openxmlformats.org/drawingml/2006/picture">
                 <pic:pic xmlns:pic="http://schemas.openxmlformats.org/drawingml/2006/picture">
                   <pic:nvPicPr>
-                    <pic:cNvPr id="107" name="admin-desktop.jpg"/>
+                    <pic:cNvPr id="107" name="detail-desktop.jpg"/>
                     <pic:cNvPicPr/>
                   </pic:nvPicPr>
                   <pic:blipFill>
@@ -4547,7 +4385,390 @@
           <w:sz w:val="22"/>
           <w:b/>
         </w:rPr>
+        <w:t xml:space="preserve">Obrázek 5: </w:t>
+      </w:r>
+      <w:r>
+        <w:rPr>
+          <w:sz w:val="22"/>
+        </w:rPr>
+        <w:t xml:space="preserve">Detail inzerátu</w:t>
+      </w:r>
+    </w:p>
+    <w:p>
+      <w:pPr>
+        <w:keepNext/>
+        <w:spacing w:before="240"/>
+        <w:jc w:val="center"/>
+      </w:pPr>
+      <w:r>
+        <w:drawing>
+          <wp:inline distT="0" distB="0" distL="0" distR="0">
+            <wp:extent cx="2159000" cy="3644392"/>
+            <wp:docPr id="108" name="Obrázek 108" descr="Úvodní stránka a detail inzerátu na mobilu"/>
+            <a:graphic xmlns:a="http://schemas.openxmlformats.org/drawingml/2006/main">
+              <a:graphicData uri="http://schemas.openxmlformats.org/drawingml/2006/picture">
+                <pic:pic xmlns:pic="http://schemas.openxmlformats.org/drawingml/2006/picture">
+                  <pic:nvPicPr>
+                    <pic:cNvPr id="108" name="homepage-mobil.jpg"/>
+                    <pic:cNvPicPr/>
+                  </pic:nvPicPr>
+                  <pic:blipFill>
+                    <a:blip r:embed="rIdImg8"/>
+                    <a:stretch>
+                      <a:fillRect/>
+                    </a:stretch>
+                  </pic:blipFill>
+                  <pic:spPr>
+                    <a:xfrm>
+                      <a:off x="0" y="0"/>
+                      <a:ext cx="2159000" cy="3644392"/>
+                    </a:xfrm>
+                    <a:prstGeom prst="rect">
+                      <a:avLst/>
+                    </a:prstGeom>
+                    <a:ln w="6350">
+                      <a:solidFill>
+                        <a:srgbClr val="CDC6B8"/>
+                      </a:solidFill>
+                    </a:ln>
+                  </pic:spPr>
+                </pic:pic>
+              </a:graphicData>
+            </a:graphic>
+          </wp:inline>
+        </w:drawing>
+      </w:r>
+      <w:r>
+        <w:t xml:space="preserve">    </w:t>
+      </w:r>
+      <w:r>
+        <w:drawing>
+          <wp:inline distT="0" distB="0" distL="0" distR="0">
+            <wp:extent cx="2159000" cy="3644392"/>
+            <wp:docPr id="109" name="Obrázek 109" descr="Úvodní stránka a detail inzerátu na mobilu"/>
+            <a:graphic xmlns:a="http://schemas.openxmlformats.org/drawingml/2006/main">
+              <a:graphicData uri="http://schemas.openxmlformats.org/drawingml/2006/picture">
+                <pic:pic xmlns:pic="http://schemas.openxmlformats.org/drawingml/2006/picture">
+                  <pic:nvPicPr>
+                    <pic:cNvPr id="109" name="detail-mobil.jpg"/>
+                    <pic:cNvPicPr/>
+                  </pic:nvPicPr>
+                  <pic:blipFill>
+                    <a:blip r:embed="rIdImg9"/>
+                    <a:stretch>
+                      <a:fillRect/>
+                    </a:stretch>
+                  </pic:blipFill>
+                  <pic:spPr>
+                    <a:xfrm>
+                      <a:off x="0" y="0"/>
+                      <a:ext cx="2159000" cy="3644392"/>
+                    </a:xfrm>
+                    <a:prstGeom prst="rect">
+                      <a:avLst/>
+                    </a:prstGeom>
+                    <a:ln w="6350">
+                      <a:solidFill>
+                        <a:srgbClr val="CDC6B8"/>
+                      </a:solidFill>
+                    </a:ln>
+                  </pic:spPr>
+                </pic:pic>
+              </a:graphicData>
+            </a:graphic>
+          </wp:inline>
+        </w:drawing>
+      </w:r>
+    </w:p>
+    <w:p>
+      <w:pPr>
+        <w:keepNext/>
+        <w:spacing w:before="60" w:after="240"/>
+        <w:jc w:val="center"/>
+      </w:pPr>
+      <w:r>
+        <w:rPr>
+          <w:sz w:val="22"/>
+          <w:b/>
+        </w:rPr>
         <w:t xml:space="preserve">Obrázek 6: </w:t>
+      </w:r>
+      <w:r>
+        <w:rPr>
+          <w:sz w:val="22"/>
+        </w:rPr>
+        <w:t xml:space="preserve">Úvodní stránka a detail inzerátu na mobilu</w:t>
+      </w:r>
+    </w:p>
+    <w:p>
+      <w:pPr>
+        <w:pStyle w:val="Nadpis2"/>
+        <w:keepNext/>
+      </w:pPr>
+      <w:r>
+        <w:rPr/>
+        <w:t xml:space="preserve">Serverová část v PHP</w:t>
+      </w:r>
+    </w:p>
+    <w:p>
+      <w:pPr>
+        <w:spacing w:line="360" w:lineRule="auto"/>
+        <w:ind w:firstLine="567"/>
+        <w:jc w:val="both"/>
+      </w:pPr>
+      <w:r>
+        <w:rPr/>
+        <w:t xml:space="preserve">Všechny stránky vykresluje PHP na serveru, takže web funguje i bez JavaScriptu a vyhledávače vidí celý obsah. Požadavky jdou přes jeden vstupní soubor public/index.php a jednoduchý router. Hotové je:</w:t>
+      </w:r>
+    </w:p>
+    <w:p>
+      <w:pPr>
+        <w:pStyle w:val="Odstavecseseznamem"/>
+        <w:numPr>
+          <w:ilvl w:val="0"/>
+          <w:numId w:val="2"/>
+        </w:numPr>
+        <w:spacing w:line="360" w:lineRule="auto"/>
+      </w:pPr>
+      <w:r>
+        <w:rPr/>
+        <w:t xml:space="preserve">úvodní stránka s počty věcí a nejnovějšími inzeráty,</w:t>
+      </w:r>
+    </w:p>
+    <w:p>
+      <w:pPr>
+        <w:pStyle w:val="Odstavecseseznamem"/>
+        <w:numPr>
+          <w:ilvl w:val="0"/>
+          <w:numId w:val="2"/>
+        </w:numPr>
+        <w:spacing w:line="360" w:lineRule="auto"/>
+      </w:pPr>
+      <w:r>
+        <w:rPr/>
+        <w:t xml:space="preserve">výpis s filtry, stránkováním a vyhledáváním, které nerozlišuje diakritiku (klice najde i Klíče),</w:t>
+      </w:r>
+    </w:p>
+    <w:p>
+      <w:pPr>
+        <w:pStyle w:val="Odstavecseseznamem"/>
+        <w:numPr>
+          <w:ilvl w:val="0"/>
+          <w:numId w:val="2"/>
+        </w:numPr>
+        <w:spacing w:line="360" w:lineRule="auto"/>
+      </w:pPr>
+      <w:r>
+        <w:rPr/>
+        <w:t xml:space="preserve">detail inzerátu s fotkou, mapou, podobnými inzeráty a kontaktním formulářem,</w:t>
+      </w:r>
+    </w:p>
+    <w:p>
+      <w:pPr>
+        <w:pStyle w:val="Odstavecseseznamem"/>
+        <w:numPr>
+          <w:ilvl w:val="0"/>
+          <w:numId w:val="2"/>
+        </w:numPr>
+        <w:spacing w:line="360" w:lineRule="auto"/>
+      </w:pPr>
+      <w:r>
+        <w:rPr/>
+        <w:t xml:space="preserve">registrace, přihlášení a odhlášení,</w:t>
+      </w:r>
+    </w:p>
+    <w:p>
+      <w:pPr>
+        <w:pStyle w:val="Odstavecseseznamem"/>
+        <w:numPr>
+          <w:ilvl w:val="0"/>
+          <w:numId w:val="2"/>
+        </w:numPr>
+        <w:spacing w:line="360" w:lineRule="auto"/>
+      </w:pPr>
+      <w:r>
+        <w:rPr/>
+        <w:t xml:space="preserve">přidání, úprava a smazání inzerátu včetně fotky a výběru místa na mapě,</w:t>
+      </w:r>
+    </w:p>
+    <w:p>
+      <w:pPr>
+        <w:pStyle w:val="Odstavecseseznamem"/>
+        <w:numPr>
+          <w:ilvl w:val="0"/>
+          <w:numId w:val="2"/>
+        </w:numPr>
+        <w:spacing w:line="360" w:lineRule="auto"/>
+      </w:pPr>
+      <w:r>
+        <w:rPr/>
+        <w:t xml:space="preserve">stránka Můj účet s vlastními inzeráty a označením věci jako vrácené,</w:t>
+      </w:r>
+    </w:p>
+    <w:p>
+      <w:pPr>
+        <w:pStyle w:val="Odstavecseseznamem"/>
+        <w:numPr>
+          <w:ilvl w:val="0"/>
+          <w:numId w:val="2"/>
+        </w:numPr>
+        <w:spacing w:line="360" w:lineRule="auto"/>
+      </w:pPr>
+      <w:r>
+        <w:rPr/>
+        <w:t xml:space="preserve">administrace inzerátů (skrytí, smazání), uživatelů (blokace, role), kategorií a budov,</w:t>
+      </w:r>
+    </w:p>
+    <w:p>
+      <w:pPr>
+        <w:pStyle w:val="Odstavecseseznamem"/>
+        <w:numPr>
+          <w:ilvl w:val="0"/>
+          <w:numId w:val="2"/>
+        </w:numPr>
+        <w:spacing w:line="360" w:lineRule="auto"/>
+      </w:pPr>
+      <w:r>
+        <w:rPr/>
+        <w:t xml:space="preserve">odeslání zprávy autorovi inzerátu e-mailem, odpověď jde přímo na e-mail odesílatele,</w:t>
+      </w:r>
+    </w:p>
+    <w:p>
+      <w:pPr>
+        <w:pStyle w:val="Odstavecseseznamem"/>
+        <w:numPr>
+          <w:ilvl w:val="0"/>
+          <w:numId w:val="2"/>
+        </w:numPr>
+        <w:spacing w:line="360" w:lineRule="auto"/>
+      </w:pPr>
+      <w:r>
+        <w:rPr/>
+        <w:t xml:space="preserve">sitemap.xml a robots.txt.</w:t>
+      </w:r>
+    </w:p>
+    <w:p>
+      <w:pPr>
+        <w:keepNext/>
+        <w:spacing w:before="240"/>
+        <w:jc w:val="center"/>
+      </w:pPr>
+      <w:r>
+        <w:drawing>
+          <wp:inline distT="0" distB="0" distL="0" distR="0">
+            <wp:extent cx="5580380" cy="3487738"/>
+            <wp:docPr id="110" name="Obrázek 110" descr="Formulář pro přidání nálezu"/>
+            <a:graphic xmlns:a="http://schemas.openxmlformats.org/drawingml/2006/main">
+              <a:graphicData uri="http://schemas.openxmlformats.org/drawingml/2006/picture">
+                <pic:pic xmlns:pic="http://schemas.openxmlformats.org/drawingml/2006/picture">
+                  <pic:nvPicPr>
+                    <pic:cNvPr id="110" name="formular-desktop.jpg"/>
+                    <pic:cNvPicPr/>
+                  </pic:nvPicPr>
+                  <pic:blipFill>
+                    <a:blip r:embed="rIdImg10"/>
+                    <a:stretch>
+                      <a:fillRect/>
+                    </a:stretch>
+                  </pic:blipFill>
+                  <pic:spPr>
+                    <a:xfrm>
+                      <a:off x="0" y="0"/>
+                      <a:ext cx="5580380" cy="3487738"/>
+                    </a:xfrm>
+                    <a:prstGeom prst="rect">
+                      <a:avLst/>
+                    </a:prstGeom>
+                    <a:ln w="6350">
+                      <a:solidFill>
+                        <a:srgbClr val="CDC6B8"/>
+                      </a:solidFill>
+                    </a:ln>
+                  </pic:spPr>
+                </pic:pic>
+              </a:graphicData>
+            </a:graphic>
+          </wp:inline>
+        </w:drawing>
+      </w:r>
+    </w:p>
+    <w:p>
+      <w:pPr>
+        <w:keepNext/>
+        <w:spacing w:before="60" w:after="240"/>
+        <w:jc w:val="center"/>
+      </w:pPr>
+      <w:r>
+        <w:rPr>
+          <w:sz w:val="22"/>
+          <w:b/>
+        </w:rPr>
+        <w:t xml:space="preserve">Obrázek 7: </w:t>
+      </w:r>
+      <w:r>
+        <w:rPr>
+          <w:sz w:val="22"/>
+        </w:rPr>
+        <w:t xml:space="preserve">Formulář pro přidání nálezu</w:t>
+      </w:r>
+    </w:p>
+    <w:p>
+      <w:pPr>
+        <w:keepNext/>
+        <w:spacing w:before="240"/>
+        <w:jc w:val="center"/>
+      </w:pPr>
+      <w:r>
+        <w:drawing>
+          <wp:inline distT="0" distB="0" distL="0" distR="0">
+            <wp:extent cx="5580380" cy="3487738"/>
+            <wp:docPr id="111" name="Obrázek 111" descr="Administrace inzerátů"/>
+            <a:graphic xmlns:a="http://schemas.openxmlformats.org/drawingml/2006/main">
+              <a:graphicData uri="http://schemas.openxmlformats.org/drawingml/2006/picture">
+                <pic:pic xmlns:pic="http://schemas.openxmlformats.org/drawingml/2006/picture">
+                  <pic:nvPicPr>
+                    <pic:cNvPr id="111" name="admin-desktop.jpg"/>
+                    <pic:cNvPicPr/>
+                  </pic:nvPicPr>
+                  <pic:blipFill>
+                    <a:blip r:embed="rIdImg11"/>
+                    <a:stretch>
+                      <a:fillRect/>
+                    </a:stretch>
+                  </pic:blipFill>
+                  <pic:spPr>
+                    <a:xfrm>
+                      <a:off x="0" y="0"/>
+                      <a:ext cx="5580380" cy="3487738"/>
+                    </a:xfrm>
+                    <a:prstGeom prst="rect">
+                      <a:avLst/>
+                    </a:prstGeom>
+                    <a:ln w="6350">
+                      <a:solidFill>
+                        <a:srgbClr val="CDC6B8"/>
+                      </a:solidFill>
+                    </a:ln>
+                  </pic:spPr>
+                </pic:pic>
+              </a:graphicData>
+            </a:graphic>
+          </wp:inline>
+        </w:drawing>
+      </w:r>
+    </w:p>
+    <w:p>
+      <w:pPr>
+        <w:keepNext/>
+        <w:spacing w:before="60" w:after="240"/>
+        <w:jc w:val="center"/>
+      </w:pPr>
+      <w:r>
+        <w:rPr>
+          <w:sz w:val="22"/>
+          <w:b/>
+        </w:rPr>
+        <w:t xml:space="preserve">Obrázek 8: </w:t>
       </w:r>
       <w:r>
         <w:rPr>
@@ -5861,7 +6082,7 @@
       </w:pPr>
       <w:r>
         <w:rPr/>
-        <w:t xml:space="preserve">Obrázek 1: Úvodní stránka na počítači</w:t>
+        <w:t xml:space="preserve">Obrázek 1: Wireframe úvodní stránky (počítač a mobil)</w:t>
       </w:r>
     </w:p>
     <w:p>
@@ -5872,7 +6093,7 @@
       </w:pPr>
       <w:r>
         <w:rPr/>
-        <w:t xml:space="preserve">Obrázek 2: Výpis inzerátů s filtry a mapou</w:t>
+        <w:t xml:space="preserve">Obrázek 2: Wireframe detailu inzerátu (počítač a mobil)</w:t>
       </w:r>
     </w:p>
     <w:p>
@@ -5883,7 +6104,7 @@
       </w:pPr>
       <w:r>
         <w:rPr/>
-        <w:t xml:space="preserve">Obrázek 3: Detail inzerátu</w:t>
+        <w:t xml:space="preserve">Obrázek 3: Úvodní stránka na počítači</w:t>
       </w:r>
     </w:p>
     <w:p>
@@ -5894,7 +6115,7 @@
       </w:pPr>
       <w:r>
         <w:rPr/>
-        <w:t xml:space="preserve">Obrázek 4: Úvodní stránka a detail inzerátu na mobilu</w:t>
+        <w:t xml:space="preserve">Obrázek 4: Výpis inzerátů s filtry a mapou</w:t>
       </w:r>
     </w:p>
     <w:p>
@@ -5905,7 +6126,7 @@
       </w:pPr>
       <w:r>
         <w:rPr/>
-        <w:t xml:space="preserve">Obrázek 5: Formulář pro přidání nálezu</w:t>
+        <w:t xml:space="preserve">Obrázek 5: Detail inzerátu</w:t>
       </w:r>
     </w:p>
     <w:p>
@@ -5916,7 +6137,95 @@
       </w:pPr>
       <w:r>
         <w:rPr/>
-        <w:t xml:space="preserve">Obrázek 6: Administrace inzerátů</w:t>
+        <w:t xml:space="preserve">Obrázek 6: Úvodní stránka a detail inzerátu na mobilu</w:t>
+      </w:r>
+    </w:p>
+    <w:p>
+      <w:pPr>
+        <w:spacing w:line="360" w:lineRule="auto"/>
+        <w:ind w:firstLine="567"/>
+        <w:jc w:val="both"/>
+      </w:pPr>
+      <w:r>
+        <w:rPr/>
+        <w:t xml:space="preserve">Obrázek 7: Formulář pro přidání nálezu</w:t>
+      </w:r>
+    </w:p>
+    <w:p>
+      <w:pPr>
+        <w:spacing w:line="360" w:lineRule="auto"/>
+        <w:ind w:firstLine="567"/>
+        <w:jc w:val="both"/>
+      </w:pPr>
+      <w:r>
+        <w:rPr/>
+        <w:t xml:space="preserve">Obrázek 8: Administrace inzerátů</w:t>
+      </w:r>
+    </w:p>
+    <w:p>
+      <w:pPr>
+        <w:spacing w:line="360" w:lineRule="auto"/>
+        <w:ind w:firstLine="567"/>
+        <w:jc w:val="both"/>
+      </w:pPr>
+      <w:r>
+        <w:rPr/>
+        <w:t xml:space="preserve">Obrázek 9: Wireframe výpisu inzerátů (počítač a mobil)</w:t>
+      </w:r>
+    </w:p>
+    <w:p>
+      <w:pPr>
+        <w:spacing w:line="360" w:lineRule="auto"/>
+        <w:ind w:firstLine="567"/>
+        <w:jc w:val="both"/>
+      </w:pPr>
+      <w:r>
+        <w:rPr/>
+        <w:t xml:space="preserve">Obrázek 10: Wireframe formuláře Nahlásit věc (počítač a mobil)</w:t>
+      </w:r>
+    </w:p>
+    <w:p>
+      <w:pPr>
+        <w:spacing w:line="360" w:lineRule="auto"/>
+        <w:ind w:firstLine="567"/>
+        <w:jc w:val="both"/>
+      </w:pPr>
+      <w:r>
+        <w:rPr/>
+        <w:t xml:space="preserve">Obrázek 11: Wireframe přihlášení a registrace</w:t>
+      </w:r>
+    </w:p>
+    <w:p>
+      <w:pPr>
+        <w:spacing w:line="360" w:lineRule="auto"/>
+        <w:ind w:firstLine="567"/>
+        <w:jc w:val="both"/>
+      </w:pPr>
+      <w:r>
+        <w:rPr/>
+        <w:t xml:space="preserve">Obrázek 12: Wireframe stránky Můj účet</w:t>
+      </w:r>
+    </w:p>
+    <w:p>
+      <w:pPr>
+        <w:spacing w:line="360" w:lineRule="auto"/>
+        <w:ind w:firstLine="567"/>
+        <w:jc w:val="both"/>
+      </w:pPr>
+      <w:r>
+        <w:rPr/>
+        <w:t xml:space="preserve">Obrázek 13: Wireframe administrace</w:t>
+      </w:r>
+    </w:p>
+    <w:p>
+      <w:pPr>
+        <w:spacing w:line="360" w:lineRule="auto"/>
+        <w:ind w:firstLine="567"/>
+        <w:jc w:val="both"/>
+      </w:pPr>
+      <w:r>
+        <w:rPr/>
+        <w:t xml:space="preserve">Obrázek 14: Wireframe společných komponent</w:t>
       </w:r>
     </w:p>
     <w:p>
@@ -6552,6 +6861,8 @@
     <w:p>
       <w:pPr>
         <w:spacing w:line="360" w:lineRule="auto"/>
+        <w:ind w:firstLine="567"/>
+        <w:jc w:val="both"/>
       </w:pPr>
       <w:r>
         <w:rPr/>
@@ -6561,16 +6872,484 @@
     <w:p>
       <w:pPr>
         <w:spacing w:line="360" w:lineRule="auto"/>
-      </w:pPr>
-      <w:r>
-        <w:rPr/>
-        <w:t xml:space="preserve">Příloha 2: </w:t>
-      </w:r>
+        <w:ind w:firstLine="567"/>
+        <w:jc w:val="both"/>
+      </w:pPr>
+      <w:r>
+        <w:rPr/>
+        <w:t xml:space="preserve">Příloha 2: Wireframy</w:t>
+      </w:r>
+    </w:p>
+    <w:p>
+      <w:pPr>
+        <w:keepNext/>
+        <w:spacing w:before="240"/>
+        <w:jc w:val="center"/>
+      </w:pPr>
+      <w:r>
+        <w:drawing>
+          <wp:inline distT="0" distB="0" distL="0" distR="0">
+            <wp:extent cx="3556000" cy="3458210"/>
+            <wp:docPr id="112" name="Obrázek 112" descr="Wireframe výpisu inzerátů (počítač a mobil)"/>
+            <a:graphic xmlns:a="http://schemas.openxmlformats.org/drawingml/2006/main">
+              <a:graphicData uri="http://schemas.openxmlformats.org/drawingml/2006/picture">
+                <pic:pic xmlns:pic="http://schemas.openxmlformats.org/drawingml/2006/picture">
+                  <pic:nvPicPr>
+                    <pic:cNvPr id="112" name="02-vypis-pocitac.jpg"/>
+                    <pic:cNvPicPr/>
+                  </pic:nvPicPr>
+                  <pic:blipFill>
+                    <a:blip r:embed="rIdImg12"/>
+                    <a:stretch>
+                      <a:fillRect/>
+                    </a:stretch>
+                  </pic:blipFill>
+                  <pic:spPr>
+                    <a:xfrm>
+                      <a:off x="0" y="0"/>
+                      <a:ext cx="3556000" cy="3458210"/>
+                    </a:xfrm>
+                    <a:prstGeom prst="rect">
+                      <a:avLst/>
+                    </a:prstGeom>
+                    <a:ln w="6350">
+                      <a:solidFill>
+                        <a:srgbClr val="CDC6B8"/>
+                      </a:solidFill>
+                    </a:ln>
+                  </pic:spPr>
+                </pic:pic>
+              </a:graphicData>
+            </a:graphic>
+          </wp:inline>
+        </w:drawing>
+      </w:r>
+      <w:r>
+        <w:t xml:space="preserve">    </w:t>
+      </w:r>
+      <w:r>
+        <w:drawing>
+          <wp:inline distT="0" distB="0" distL="0" distR="0">
+            <wp:extent cx="1206500" cy="4585273"/>
+            <wp:docPr id="113" name="Obrázek 113" descr="Wireframe výpisu inzerátů (počítač a mobil)"/>
+            <a:graphic xmlns:a="http://schemas.openxmlformats.org/drawingml/2006/main">
+              <a:graphicData uri="http://schemas.openxmlformats.org/drawingml/2006/picture">
+                <pic:pic xmlns:pic="http://schemas.openxmlformats.org/drawingml/2006/picture">
+                  <pic:nvPicPr>
+                    <pic:cNvPr id="113" name="02-vypis-mobil.jpg"/>
+                    <pic:cNvPicPr/>
+                  </pic:nvPicPr>
+                  <pic:blipFill>
+                    <a:blip r:embed="rIdImg13"/>
+                    <a:stretch>
+                      <a:fillRect/>
+                    </a:stretch>
+                  </pic:blipFill>
+                  <pic:spPr>
+                    <a:xfrm>
+                      <a:off x="0" y="0"/>
+                      <a:ext cx="1206500" cy="4585273"/>
+                    </a:xfrm>
+                    <a:prstGeom prst="rect">
+                      <a:avLst/>
+                    </a:prstGeom>
+                    <a:ln w="6350">
+                      <a:solidFill>
+                        <a:srgbClr val="CDC6B8"/>
+                      </a:solidFill>
+                    </a:ln>
+                  </pic:spPr>
+                </pic:pic>
+              </a:graphicData>
+            </a:graphic>
+          </wp:inline>
+        </w:drawing>
+      </w:r>
+    </w:p>
+    <w:p>
+      <w:pPr>
+        <w:keepNext/>
+        <w:spacing w:before="60" w:after="240"/>
+        <w:jc w:val="center"/>
+      </w:pPr>
       <w:r>
         <w:rPr>
-          <w:highlight w:val="yellow"/>
+          <w:sz w:val="22"/>
+          <w:b/>
         </w:rPr>
-        <w:t xml:space="preserve">DOPLNIT: wireframy</w:t>
+        <w:t xml:space="preserve">Obrázek 9: </w:t>
+      </w:r>
+      <w:r>
+        <w:rPr>
+          <w:sz w:val="22"/>
+        </w:rPr>
+        <w:t xml:space="preserve">Wireframe výpisu inzerátů (počítač a mobil)</w:t>
+      </w:r>
+    </w:p>
+    <w:p>
+      <w:pPr>
+        <w:keepNext/>
+        <w:spacing w:before="240"/>
+        <w:jc w:val="center"/>
+      </w:pPr>
+      <w:r>
+        <w:drawing>
+          <wp:inline distT="0" distB="0" distL="0" distR="0">
+            <wp:extent cx="3556000" cy="4192778"/>
+            <wp:docPr id="114" name="Obrázek 114" descr="Wireframe formuláře Nahlásit věc (počítač a mobil)"/>
+            <a:graphic xmlns:a="http://schemas.openxmlformats.org/drawingml/2006/main">
+              <a:graphicData uri="http://schemas.openxmlformats.org/drawingml/2006/picture">
+                <pic:pic xmlns:pic="http://schemas.openxmlformats.org/drawingml/2006/picture">
+                  <pic:nvPicPr>
+                    <pic:cNvPr id="114" name="04-nahlasit-pocitac.jpg"/>
+                    <pic:cNvPicPr/>
+                  </pic:nvPicPr>
+                  <pic:blipFill>
+                    <a:blip r:embed="rIdImg14"/>
+                    <a:stretch>
+                      <a:fillRect/>
+                    </a:stretch>
+                  </pic:blipFill>
+                  <pic:spPr>
+                    <a:xfrm>
+                      <a:off x="0" y="0"/>
+                      <a:ext cx="3556000" cy="4192778"/>
+                    </a:xfrm>
+                    <a:prstGeom prst="rect">
+                      <a:avLst/>
+                    </a:prstGeom>
+                    <a:ln w="6350">
+                      <a:solidFill>
+                        <a:srgbClr val="CDC6B8"/>
+                      </a:solidFill>
+                    </a:ln>
+                  </pic:spPr>
+                </pic:pic>
+              </a:graphicData>
+            </a:graphic>
+          </wp:inline>
+        </w:drawing>
+      </w:r>
+      <w:r>
+        <w:t xml:space="preserve">    </w:t>
+      </w:r>
+      <w:r>
+        <w:drawing>
+          <wp:inline distT="0" distB="0" distL="0" distR="0">
+            <wp:extent cx="1206500" cy="5027083"/>
+            <wp:docPr id="115" name="Obrázek 115" descr="Wireframe formuláře Nahlásit věc (počítač a mobil)"/>
+            <a:graphic xmlns:a="http://schemas.openxmlformats.org/drawingml/2006/main">
+              <a:graphicData uri="http://schemas.openxmlformats.org/drawingml/2006/picture">
+                <pic:pic xmlns:pic="http://schemas.openxmlformats.org/drawingml/2006/picture">
+                  <pic:nvPicPr>
+                    <pic:cNvPr id="115" name="04-nahlasit-mobil.jpg"/>
+                    <pic:cNvPicPr/>
+                  </pic:nvPicPr>
+                  <pic:blipFill>
+                    <a:blip r:embed="rIdImg15"/>
+                    <a:stretch>
+                      <a:fillRect/>
+                    </a:stretch>
+                  </pic:blipFill>
+                  <pic:spPr>
+                    <a:xfrm>
+                      <a:off x="0" y="0"/>
+                      <a:ext cx="1206500" cy="5027083"/>
+                    </a:xfrm>
+                    <a:prstGeom prst="rect">
+                      <a:avLst/>
+                    </a:prstGeom>
+                    <a:ln w="6350">
+                      <a:solidFill>
+                        <a:srgbClr val="CDC6B8"/>
+                      </a:solidFill>
+                    </a:ln>
+                  </pic:spPr>
+                </pic:pic>
+              </a:graphicData>
+            </a:graphic>
+          </wp:inline>
+        </w:drawing>
+      </w:r>
+    </w:p>
+    <w:p>
+      <w:pPr>
+        <w:keepNext/>
+        <w:spacing w:before="60" w:after="240"/>
+        <w:jc w:val="center"/>
+      </w:pPr>
+      <w:r>
+        <w:rPr>
+          <w:sz w:val="22"/>
+          <w:b/>
+        </w:rPr>
+        <w:t xml:space="preserve">Obrázek 10: </w:t>
+      </w:r>
+      <w:r>
+        <w:rPr>
+          <w:sz w:val="22"/>
+        </w:rPr>
+        <w:t xml:space="preserve">Wireframe formuláře Nahlásit věc (počítač a mobil)</w:t>
+      </w:r>
+    </w:p>
+    <w:p>
+      <w:pPr>
+        <w:keepNext/>
+        <w:spacing w:before="240"/>
+        <w:jc w:val="center"/>
+      </w:pPr>
+      <w:r>
+        <w:drawing>
+          <wp:inline distT="0" distB="0" distL="0" distR="0">
+            <wp:extent cx="5580380" cy="3836511"/>
+            <wp:docPr id="116" name="Obrázek 116" descr="Wireframe přihlášení a registrace"/>
+            <a:graphic xmlns:a="http://schemas.openxmlformats.org/drawingml/2006/main">
+              <a:graphicData uri="http://schemas.openxmlformats.org/drawingml/2006/picture">
+                <pic:pic xmlns:pic="http://schemas.openxmlformats.org/drawingml/2006/picture">
+                  <pic:nvPicPr>
+                    <pic:cNvPr id="116" name="05-prihlaseni-registrace.jpg"/>
+                    <pic:cNvPicPr/>
+                  </pic:nvPicPr>
+                  <pic:blipFill>
+                    <a:blip r:embed="rIdImg16"/>
+                    <a:stretch>
+                      <a:fillRect/>
+                    </a:stretch>
+                  </pic:blipFill>
+                  <pic:spPr>
+                    <a:xfrm>
+                      <a:off x="0" y="0"/>
+                      <a:ext cx="5580380" cy="3836511"/>
+                    </a:xfrm>
+                    <a:prstGeom prst="rect">
+                      <a:avLst/>
+                    </a:prstGeom>
+                    <a:ln w="6350">
+                      <a:solidFill>
+                        <a:srgbClr val="CDC6B8"/>
+                      </a:solidFill>
+                    </a:ln>
+                  </pic:spPr>
+                </pic:pic>
+              </a:graphicData>
+            </a:graphic>
+          </wp:inline>
+        </w:drawing>
+      </w:r>
+    </w:p>
+    <w:p>
+      <w:pPr>
+        <w:keepNext/>
+        <w:spacing w:before="60" w:after="240"/>
+        <w:jc w:val="center"/>
+      </w:pPr>
+      <w:r>
+        <w:rPr>
+          <w:sz w:val="22"/>
+          <w:b/>
+        </w:rPr>
+        <w:t xml:space="preserve">Obrázek 11: </w:t>
+      </w:r>
+      <w:r>
+        <w:rPr>
+          <w:sz w:val="22"/>
+        </w:rPr>
+        <w:t xml:space="preserve">Wireframe přihlášení a registrace</w:t>
+      </w:r>
+    </w:p>
+    <w:p>
+      <w:pPr>
+        <w:keepNext/>
+        <w:spacing w:before="240"/>
+        <w:jc w:val="center"/>
+      </w:pPr>
+      <w:r>
+        <w:drawing>
+          <wp:inline distT="0" distB="0" distL="0" distR="0">
+            <wp:extent cx="5580380" cy="3592370"/>
+            <wp:docPr id="117" name="Obrázek 117" descr="Wireframe stránky Můj účet"/>
+            <a:graphic xmlns:a="http://schemas.openxmlformats.org/drawingml/2006/main">
+              <a:graphicData uri="http://schemas.openxmlformats.org/drawingml/2006/picture">
+                <pic:pic xmlns:pic="http://schemas.openxmlformats.org/drawingml/2006/picture">
+                  <pic:nvPicPr>
+                    <pic:cNvPr id="117" name="06-muj-ucet.jpg"/>
+                    <pic:cNvPicPr/>
+                  </pic:nvPicPr>
+                  <pic:blipFill>
+                    <a:blip r:embed="rIdImg17"/>
+                    <a:stretch>
+                      <a:fillRect/>
+                    </a:stretch>
+                  </pic:blipFill>
+                  <pic:spPr>
+                    <a:xfrm>
+                      <a:off x="0" y="0"/>
+                      <a:ext cx="5580380" cy="3592370"/>
+                    </a:xfrm>
+                    <a:prstGeom prst="rect">
+                      <a:avLst/>
+                    </a:prstGeom>
+                    <a:ln w="6350">
+                      <a:solidFill>
+                        <a:srgbClr val="CDC6B8"/>
+                      </a:solidFill>
+                    </a:ln>
+                  </pic:spPr>
+                </pic:pic>
+              </a:graphicData>
+            </a:graphic>
+          </wp:inline>
+        </w:drawing>
+      </w:r>
+    </w:p>
+    <w:p>
+      <w:pPr>
+        <w:keepNext/>
+        <w:spacing w:before="60" w:after="240"/>
+        <w:jc w:val="center"/>
+      </w:pPr>
+      <w:r>
+        <w:rPr>
+          <w:sz w:val="22"/>
+          <w:b/>
+        </w:rPr>
+        <w:t xml:space="preserve">Obrázek 12: </w:t>
+      </w:r>
+      <w:r>
+        <w:rPr>
+          <w:sz w:val="22"/>
+        </w:rPr>
+        <w:t xml:space="preserve">Wireframe stránky Můj účet</w:t>
+      </w:r>
+    </w:p>
+    <w:p>
+      <w:pPr>
+        <w:keepNext/>
+        <w:spacing w:before="240"/>
+        <w:jc w:val="center"/>
+      </w:pPr>
+      <w:r>
+        <w:drawing>
+          <wp:inline distT="0" distB="0" distL="0" distR="0">
+            <wp:extent cx="5580380" cy="3972533"/>
+            <wp:docPr id="118" name="Obrázek 118" descr="Wireframe administrace"/>
+            <a:graphic xmlns:a="http://schemas.openxmlformats.org/drawingml/2006/main">
+              <a:graphicData uri="http://schemas.openxmlformats.org/drawingml/2006/picture">
+                <pic:pic xmlns:pic="http://schemas.openxmlformats.org/drawingml/2006/picture">
+                  <pic:nvPicPr>
+                    <pic:cNvPr id="118" name="07-administrace.jpg"/>
+                    <pic:cNvPicPr/>
+                  </pic:nvPicPr>
+                  <pic:blipFill>
+                    <a:blip r:embed="rIdImg18"/>
+                    <a:stretch>
+                      <a:fillRect/>
+                    </a:stretch>
+                  </pic:blipFill>
+                  <pic:spPr>
+                    <a:xfrm>
+                      <a:off x="0" y="0"/>
+                      <a:ext cx="5580380" cy="3972533"/>
+                    </a:xfrm>
+                    <a:prstGeom prst="rect">
+                      <a:avLst/>
+                    </a:prstGeom>
+                    <a:ln w="6350">
+                      <a:solidFill>
+                        <a:srgbClr val="CDC6B8"/>
+                      </a:solidFill>
+                    </a:ln>
+                  </pic:spPr>
+                </pic:pic>
+              </a:graphicData>
+            </a:graphic>
+          </wp:inline>
+        </w:drawing>
+      </w:r>
+    </w:p>
+    <w:p>
+      <w:pPr>
+        <w:keepNext/>
+        <w:spacing w:before="60" w:after="240"/>
+        <w:jc w:val="center"/>
+      </w:pPr>
+      <w:r>
+        <w:rPr>
+          <w:sz w:val="22"/>
+          <w:b/>
+        </w:rPr>
+        <w:t xml:space="preserve">Obrázek 13: </w:t>
+      </w:r>
+      <w:r>
+        <w:rPr>
+          <w:sz w:val="22"/>
+        </w:rPr>
+        <w:t xml:space="preserve">Wireframe administrace</w:t>
+      </w:r>
+    </w:p>
+    <w:p>
+      <w:pPr>
+        <w:keepNext/>
+        <w:spacing w:before="240"/>
+        <w:jc w:val="center"/>
+      </w:pPr>
+      <w:r>
+        <w:drawing>
+          <wp:inline distT="0" distB="0" distL="0" distR="0">
+            <wp:extent cx="5580380" cy="4115530"/>
+            <wp:docPr id="119" name="Obrázek 119" descr="Wireframe společných komponent"/>
+            <a:graphic xmlns:a="http://schemas.openxmlformats.org/drawingml/2006/main">
+              <a:graphicData uri="http://schemas.openxmlformats.org/drawingml/2006/picture">
+                <pic:pic xmlns:pic="http://schemas.openxmlformats.org/drawingml/2006/picture">
+                  <pic:nvPicPr>
+                    <pic:cNvPr id="119" name="00-komponenty.jpg"/>
+                    <pic:cNvPicPr/>
+                  </pic:nvPicPr>
+                  <pic:blipFill>
+                    <a:blip r:embed="rIdImg19"/>
+                    <a:stretch>
+                      <a:fillRect/>
+                    </a:stretch>
+                  </pic:blipFill>
+                  <pic:spPr>
+                    <a:xfrm>
+                      <a:off x="0" y="0"/>
+                      <a:ext cx="5580380" cy="4115530"/>
+                    </a:xfrm>
+                    <a:prstGeom prst="rect">
+                      <a:avLst/>
+                    </a:prstGeom>
+                    <a:ln w="6350">
+                      <a:solidFill>
+                        <a:srgbClr val="CDC6B8"/>
+                      </a:solidFill>
+                    </a:ln>
+                  </pic:spPr>
+                </pic:pic>
+              </a:graphicData>
+            </a:graphic>
+          </wp:inline>
+        </w:drawing>
+      </w:r>
+    </w:p>
+    <w:p>
+      <w:pPr>
+        <w:keepNext/>
+        <w:spacing w:before="60" w:after="240"/>
+        <w:jc w:val="center"/>
+      </w:pPr>
+      <w:r>
+        <w:rPr>
+          <w:sz w:val="22"/>
+          <w:b/>
+        </w:rPr>
+        <w:t xml:space="preserve">Obrázek 14: </w:t>
+      </w:r>
+      <w:r>
+        <w:rPr>
+          <w:sz w:val="22"/>
+        </w:rPr>
+        <w:t xml:space="preserve">Wireframe společných komponent</w:t>
       </w:r>
     </w:p>
     <w:sectPr>

</xml_diff>

<commit_message>
Add W3C validation results to documentation
Co-Authored-By: Claude Opus 5.5 <noreply@anthropic.com>
</commit_message>
<xml_diff>
--- a/docs/dokumentace-tym-07.docx
+++ b/docs/dokumentace-tym-07.docx
@@ -5739,13 +5739,7 @@
       </w:pPr>
       <w:r>
         <w:rPr/>
-        <w:t xml:space="preserve">Při psaní jsme hlídali třeba to, aby v seznamu definic (dl) nebyly odkazy na místě, kde je HTML nepovoluje, což validátor hlásí jako chybu. </w:t>
-      </w:r>
-      <w:r>
-        <w:rPr>
-          <w:highlight w:val="yellow"/>
-        </w:rPr>
-        <w:t xml:space="preserve">DOPLNIT: výsledek W3C HTML validátoru a W3C CSS validátoru pro úvod, výpis a detail se screenshotem.</w:t>
+        <w:t xml:space="preserve">Kód jsme ověřili validátory W3C. HTML validátor (Nu HTML Checker) nehlásí žádnou chybu ani varování na deseti kontrolovaných stránkách: úvod, výpis, detail, přidání a úprava inzerátu, přihlášení, registrace, Můj účet a dvě stránky administrace. CSS validátor nenašel chybu v žádném ze čtyř souborů se styly, jen upozorňuje, že hodnoty CSS proměnných staticky nekontroluje.</w:t>
       </w:r>
     </w:p>
     <w:p>

</xml_diff>

<commit_message>
Document accessibility tests and fix duplicate landmark label
Co-Authored-By: Claude Opus 5.5 <noreply@anthropic.com>
</commit_message>
<xml_diff>
--- a/docs/dokumentace-tym-07.docx
+++ b/docs/dokumentace-tym-07.docx
@@ -3617,13 +3617,18 @@
       </w:pPr>
       <w:r>
         <w:rPr/>
-        <w:t xml:space="preserve">Odkazy zvenku chceme získat hlavně z facebookové skupiny, od studentských spolků a z webů knihovny a fakult. </w:t>
-      </w:r>
-      <w:r>
-        <w:rPr>
-          <w:highlight w:val="yellow"/>
-        </w:rPr>
-        <w:t xml:space="preserve">DOPLNIT: případně se domluvit s knihovnou nebo PEF na odkazu.</w:t>
+        <w:t xml:space="preserve">Kromě úprav na webu počítáme i s odkazy zvenku. Web chceme sdílet ve facebookové skupině, kde se ztráty a nálezy řeší dnes, a u studentských spolků. Nejcennější by byly odkazy ze stránek knihovny a PEF o ztrátách a nálezech, protože míří přesně na naše téma a mají u vyhledávačů důvěru.</w:t>
+      </w:r>
+    </w:p>
+    <w:p>
+      <w:pPr>
+        <w:spacing w:line="360" w:lineRule="auto"/>
+        <w:ind w:firstLine="567"/>
+        <w:jc w:val="both"/>
+      </w:pPr>
+      <w:r>
+        <w:rPr/>
+        <w:t xml:space="preserve">Po spuštění web přidáme do Google Search Console a Seznam Webmaster, odešleme sitemap.xml a budeme sledovat, na které fráze se web zobrazuje a kolik lidí z hledání přichází. Podle toho pak upravíme titulky a popisy stránek.</w:t>
       </w:r>
     </w:p>
     <w:p>
@@ -5537,7 +5542,599 @@
       </w:pPr>
       <w:r>
         <w:rPr/>
-        <w:t xml:space="preserve">Cílem je úroveň WCAG 2.1 AA. Lighthouse hlásí v kategorii přístupnost 100 bodů ze 100 na všech stránkách, které jsme měřili: úvod, výpis, detail, formulář pro přidání inzerátu, Můj účet a administrace, na počítači i na mobilu. Během vývoje jsme opravili například:</w:t>
+        <w:t xml:space="preserve">Cílem je úroveň WCAG 2.1 AA. Přístupnost jsme ověřovali dvěma automatickými nástroji a ručně. Lighthouse (součást prohlížeče Chrome) a knihovna axe-core, na které stojí většina nástrojů pro kontrolu přístupnosti, prošly deset stránek webu. Výsledky jsou v tabulce 6.</w:t>
+      </w:r>
+    </w:p>
+    <w:p>
+      <w:pPr>
+        <w:keepNext/>
+        <w:spacing w:before="240" w:after="120"/>
+      </w:pPr>
+      <w:r>
+        <w:rPr>
+          <w:sz w:val="22"/>
+          <w:b/>
+        </w:rPr>
+        <w:t xml:space="preserve">Tabulka 6: </w:t>
+      </w:r>
+      <w:r>
+        <w:rPr>
+          <w:sz w:val="22"/>
+        </w:rPr>
+        <w:t xml:space="preserve">Výsledky automatických testů přístupnosti</w:t>
+      </w:r>
+    </w:p>
+    <w:tbl>
+      <w:tblPr>
+        <w:tblStyle w:val="Mkatabulky"/>
+        <w:tblW w:w="8788" w:type="dxa"/>
+        <w:tblLayout w:type="fixed"/>
+      </w:tblPr>
+      <w:tblGrid>
+        <w:gridCol w:w="4394"/>
+        <w:gridCol w:w="1758"/>
+        <w:gridCol w:w="2636"/>
+      </w:tblGrid>
+      <w:tr>
+        <w:trPr>
+          <w:tblHeader/>
+        </w:trPr>
+        <w:tc>
+          <w:tcPr>
+            <w:tcW w:w="4394" w:type="dxa"/>
+            <w:shd w:val="clear" w:color="auto" w:fill="EDEBE4"/>
+          </w:tcPr>
+          <w:p>
+            <w:pPr>
+              <w:spacing w:before="40" w:after="40"/>
+            </w:pPr>
+            <w:r>
+              <w:rPr>
+                <w:sz w:val="22"/>
+                <w:b/>
+              </w:rPr>
+              <w:t xml:space="preserve">Stránka</w:t>
+            </w:r>
+          </w:p>
+        </w:tc>
+        <w:tc>
+          <w:tcPr>
+            <w:tcW w:w="1758" w:type="dxa"/>
+            <w:shd w:val="clear" w:color="auto" w:fill="EDEBE4"/>
+          </w:tcPr>
+          <w:p>
+            <w:pPr>
+              <w:spacing w:before="40" w:after="40"/>
+            </w:pPr>
+            <w:r>
+              <w:rPr>
+                <w:sz w:val="22"/>
+                <w:b/>
+              </w:rPr>
+              <w:t xml:space="preserve">Lighthouse</w:t>
+            </w:r>
+          </w:p>
+        </w:tc>
+        <w:tc>
+          <w:tcPr>
+            <w:tcW w:w="2636" w:type="dxa"/>
+            <w:shd w:val="clear" w:color="auto" w:fill="EDEBE4"/>
+          </w:tcPr>
+          <w:p>
+            <w:pPr>
+              <w:spacing w:before="40" w:after="40"/>
+            </w:pPr>
+            <w:r>
+              <w:rPr>
+                <w:sz w:val="22"/>
+                <w:b/>
+              </w:rPr>
+              <w:t xml:space="preserve">axe-core: chyby</w:t>
+            </w:r>
+          </w:p>
+        </w:tc>
+      </w:tr>
+      <w:tr>
+        <w:tc>
+          <w:tcPr>
+            <w:tcW w:w="4394" w:type="dxa"/>
+          </w:tcPr>
+          <w:p>
+            <w:pPr>
+              <w:spacing w:before="40" w:after="40"/>
+            </w:pPr>
+            <w:r>
+              <w:rPr>
+                <w:sz w:val="22"/>
+              </w:rPr>
+              <w:t xml:space="preserve">Úvod</w:t>
+            </w:r>
+          </w:p>
+        </w:tc>
+        <w:tc>
+          <w:tcPr>
+            <w:tcW w:w="1758" w:type="dxa"/>
+          </w:tcPr>
+          <w:p>
+            <w:pPr>
+              <w:spacing w:before="40" w:after="40"/>
+            </w:pPr>
+            <w:r>
+              <w:rPr>
+                <w:sz w:val="22"/>
+              </w:rPr>
+              <w:t xml:space="preserve">100</w:t>
+            </w:r>
+          </w:p>
+        </w:tc>
+        <w:tc>
+          <w:tcPr>
+            <w:tcW w:w="2636" w:type="dxa"/>
+          </w:tcPr>
+          <w:p>
+            <w:pPr>
+              <w:spacing w:before="40" w:after="40"/>
+            </w:pPr>
+            <w:r>
+              <w:rPr>
+                <w:sz w:val="22"/>
+              </w:rPr>
+              <w:t xml:space="preserve">0</w:t>
+            </w:r>
+          </w:p>
+        </w:tc>
+      </w:tr>
+      <w:tr>
+        <w:tc>
+          <w:tcPr>
+            <w:tcW w:w="4394" w:type="dxa"/>
+          </w:tcPr>
+          <w:p>
+            <w:pPr>
+              <w:spacing w:before="40" w:after="40"/>
+            </w:pPr>
+            <w:r>
+              <w:rPr>
+                <w:sz w:val="22"/>
+              </w:rPr>
+              <w:t xml:space="preserve">Výpis inzerátů</w:t>
+            </w:r>
+          </w:p>
+        </w:tc>
+        <w:tc>
+          <w:tcPr>
+            <w:tcW w:w="1758" w:type="dxa"/>
+          </w:tcPr>
+          <w:p>
+            <w:pPr>
+              <w:spacing w:before="40" w:after="40"/>
+            </w:pPr>
+            <w:r>
+              <w:rPr>
+                <w:sz w:val="22"/>
+              </w:rPr>
+              <w:t xml:space="preserve">100</w:t>
+            </w:r>
+          </w:p>
+        </w:tc>
+        <w:tc>
+          <w:tcPr>
+            <w:tcW w:w="2636" w:type="dxa"/>
+          </w:tcPr>
+          <w:p>
+            <w:pPr>
+              <w:spacing w:before="40" w:after="40"/>
+            </w:pPr>
+            <w:r>
+              <w:rPr>
+                <w:sz w:val="22"/>
+              </w:rPr>
+              <w:t xml:space="preserve">0</w:t>
+            </w:r>
+          </w:p>
+        </w:tc>
+      </w:tr>
+      <w:tr>
+        <w:tc>
+          <w:tcPr>
+            <w:tcW w:w="4394" w:type="dxa"/>
+          </w:tcPr>
+          <w:p>
+            <w:pPr>
+              <w:spacing w:before="40" w:after="40"/>
+            </w:pPr>
+            <w:r>
+              <w:rPr>
+                <w:sz w:val="22"/>
+              </w:rPr>
+              <w:t xml:space="preserve">Detail inzerátu</w:t>
+            </w:r>
+          </w:p>
+        </w:tc>
+        <w:tc>
+          <w:tcPr>
+            <w:tcW w:w="1758" w:type="dxa"/>
+          </w:tcPr>
+          <w:p>
+            <w:pPr>
+              <w:spacing w:before="40" w:after="40"/>
+            </w:pPr>
+            <w:r>
+              <w:rPr>
+                <w:sz w:val="22"/>
+              </w:rPr>
+              <w:t xml:space="preserve">100</w:t>
+            </w:r>
+          </w:p>
+        </w:tc>
+        <w:tc>
+          <w:tcPr>
+            <w:tcW w:w="2636" w:type="dxa"/>
+          </w:tcPr>
+          <w:p>
+            <w:pPr>
+              <w:spacing w:before="40" w:after="40"/>
+            </w:pPr>
+            <w:r>
+              <w:rPr>
+                <w:sz w:val="22"/>
+              </w:rPr>
+              <w:t xml:space="preserve">0</w:t>
+            </w:r>
+          </w:p>
+        </w:tc>
+      </w:tr>
+      <w:tr>
+        <w:tc>
+          <w:tcPr>
+            <w:tcW w:w="4394" w:type="dxa"/>
+          </w:tcPr>
+          <w:p>
+            <w:pPr>
+              <w:spacing w:before="40" w:after="40"/>
+            </w:pPr>
+            <w:r>
+              <w:rPr>
+                <w:sz w:val="22"/>
+              </w:rPr>
+              <w:t xml:space="preserve">Nahlásit věc a úprava inzerátu</w:t>
+            </w:r>
+          </w:p>
+        </w:tc>
+        <w:tc>
+          <w:tcPr>
+            <w:tcW w:w="1758" w:type="dxa"/>
+          </w:tcPr>
+          <w:p>
+            <w:pPr>
+              <w:spacing w:before="40" w:after="40"/>
+            </w:pPr>
+            <w:r>
+              <w:rPr>
+                <w:sz w:val="22"/>
+              </w:rPr>
+              <w:t xml:space="preserve">100</w:t>
+            </w:r>
+          </w:p>
+        </w:tc>
+        <w:tc>
+          <w:tcPr>
+            <w:tcW w:w="2636" w:type="dxa"/>
+          </w:tcPr>
+          <w:p>
+            <w:pPr>
+              <w:spacing w:before="40" w:after="40"/>
+            </w:pPr>
+            <w:r>
+              <w:rPr>
+                <w:sz w:val="22"/>
+              </w:rPr>
+              <w:t xml:space="preserve">0</w:t>
+            </w:r>
+          </w:p>
+        </w:tc>
+      </w:tr>
+      <w:tr>
+        <w:tc>
+          <w:tcPr>
+            <w:tcW w:w="4394" w:type="dxa"/>
+          </w:tcPr>
+          <w:p>
+            <w:pPr>
+              <w:spacing w:before="40" w:after="40"/>
+            </w:pPr>
+            <w:r>
+              <w:rPr>
+                <w:sz w:val="22"/>
+              </w:rPr>
+              <w:t xml:space="preserve">Přihlášení a registrace</w:t>
+            </w:r>
+          </w:p>
+        </w:tc>
+        <w:tc>
+          <w:tcPr>
+            <w:tcW w:w="1758" w:type="dxa"/>
+          </w:tcPr>
+          <w:p>
+            <w:pPr>
+              <w:spacing w:before="40" w:after="40"/>
+            </w:pPr>
+            <w:r>
+              <w:rPr>
+                <w:sz w:val="22"/>
+              </w:rPr>
+              <w:t xml:space="preserve">100</w:t>
+            </w:r>
+          </w:p>
+        </w:tc>
+        <w:tc>
+          <w:tcPr>
+            <w:tcW w:w="2636" w:type="dxa"/>
+          </w:tcPr>
+          <w:p>
+            <w:pPr>
+              <w:spacing w:before="40" w:after="40"/>
+            </w:pPr>
+            <w:r>
+              <w:rPr>
+                <w:sz w:val="22"/>
+              </w:rPr>
+              <w:t xml:space="preserve">0</w:t>
+            </w:r>
+          </w:p>
+        </w:tc>
+      </w:tr>
+      <w:tr>
+        <w:tc>
+          <w:tcPr>
+            <w:tcW w:w="4394" w:type="dxa"/>
+          </w:tcPr>
+          <w:p>
+            <w:pPr>
+              <w:spacing w:before="40" w:after="40"/>
+            </w:pPr>
+            <w:r>
+              <w:rPr>
+                <w:sz w:val="22"/>
+              </w:rPr>
+              <w:t xml:space="preserve">Můj účet</w:t>
+            </w:r>
+          </w:p>
+        </w:tc>
+        <w:tc>
+          <w:tcPr>
+            <w:tcW w:w="1758" w:type="dxa"/>
+          </w:tcPr>
+          <w:p>
+            <w:pPr>
+              <w:spacing w:before="40" w:after="40"/>
+            </w:pPr>
+            <w:r>
+              <w:rPr>
+                <w:sz w:val="22"/>
+              </w:rPr>
+              <w:t xml:space="preserve">100</w:t>
+            </w:r>
+          </w:p>
+        </w:tc>
+        <w:tc>
+          <w:tcPr>
+            <w:tcW w:w="2636" w:type="dxa"/>
+          </w:tcPr>
+          <w:p>
+            <w:pPr>
+              <w:spacing w:before="40" w:after="40"/>
+            </w:pPr>
+            <w:r>
+              <w:rPr>
+                <w:sz w:val="22"/>
+              </w:rPr>
+              <w:t xml:space="preserve">0</w:t>
+            </w:r>
+          </w:p>
+        </w:tc>
+      </w:tr>
+      <w:tr>
+        <w:tc>
+          <w:tcPr>
+            <w:tcW w:w="4394" w:type="dxa"/>
+          </w:tcPr>
+          <w:p>
+            <w:pPr>
+              <w:spacing w:before="40" w:after="40"/>
+            </w:pPr>
+            <w:r>
+              <w:rPr>
+                <w:sz w:val="22"/>
+              </w:rPr>
+              <w:t xml:space="preserve">Administrace (inzeráty, budovy)</w:t>
+            </w:r>
+          </w:p>
+        </w:tc>
+        <w:tc>
+          <w:tcPr>
+            <w:tcW w:w="1758" w:type="dxa"/>
+          </w:tcPr>
+          <w:p>
+            <w:pPr>
+              <w:spacing w:before="40" w:after="40"/>
+            </w:pPr>
+            <w:r>
+              <w:rPr>
+                <w:sz w:val="22"/>
+              </w:rPr>
+              <w:t xml:space="preserve">100</w:t>
+            </w:r>
+          </w:p>
+        </w:tc>
+        <w:tc>
+          <w:tcPr>
+            <w:tcW w:w="2636" w:type="dxa"/>
+          </w:tcPr>
+          <w:p>
+            <w:pPr>
+              <w:spacing w:before="40" w:after="40"/>
+            </w:pPr>
+            <w:r>
+              <w:rPr>
+                <w:sz w:val="22"/>
+              </w:rPr>
+              <w:t xml:space="preserve">0</w:t>
+            </w:r>
+          </w:p>
+        </w:tc>
+      </w:tr>
+    </w:tbl>
+    <w:p>
+      <w:pPr>
+        <w:keepNext/>
+        <w:spacing w:before="240"/>
+        <w:jc w:val="center"/>
+      </w:pPr>
+      <w:r>
+        <w:drawing>
+          <wp:inline distT="0" distB="0" distL="0" distR="0">
+            <wp:extent cx="3048000" cy="1175657"/>
+            <wp:docPr id="112" name="Obrázek 112" descr="Výsledek Lighthouse v kategorii přístupnost (detail inzerátu)"/>
+            <a:graphic xmlns:a="http://schemas.openxmlformats.org/drawingml/2006/main">
+              <a:graphicData uri="http://schemas.openxmlformats.org/drawingml/2006/picture">
+                <pic:pic xmlns:pic="http://schemas.openxmlformats.org/drawingml/2006/picture">
+                  <pic:nvPicPr>
+                    <pic:cNvPr id="112" name="a11y-lighthouse.jpg"/>
+                    <pic:cNvPicPr/>
+                  </pic:nvPicPr>
+                  <pic:blipFill>
+                    <a:blip r:embed="rIdImg12"/>
+                    <a:stretch>
+                      <a:fillRect/>
+                    </a:stretch>
+                  </pic:blipFill>
+                  <pic:spPr>
+                    <a:xfrm>
+                      <a:off x="0" y="0"/>
+                      <a:ext cx="3048000" cy="1175657"/>
+                    </a:xfrm>
+                    <a:prstGeom prst="rect">
+                      <a:avLst/>
+                    </a:prstGeom>
+                    <a:ln w="6350">
+                      <a:solidFill>
+                        <a:srgbClr val="CDC6B8"/>
+                      </a:solidFill>
+                    </a:ln>
+                  </pic:spPr>
+                </pic:pic>
+              </a:graphicData>
+            </a:graphic>
+          </wp:inline>
+        </w:drawing>
+      </w:r>
+    </w:p>
+    <w:p>
+      <w:pPr>
+        <w:keepNext/>
+        <w:spacing w:before="60" w:after="240"/>
+        <w:jc w:val="center"/>
+      </w:pPr>
+      <w:r>
+        <w:rPr>
+          <w:sz w:val="22"/>
+          <w:b/>
+        </w:rPr>
+        <w:t xml:space="preserve">Obrázek 9: </w:t>
+      </w:r>
+      <w:r>
+        <w:rPr>
+          <w:sz w:val="22"/>
+        </w:rPr>
+        <w:t xml:space="preserve">Výsledek Lighthouse v kategorii přístupnost (detail inzerátu)</w:t>
+      </w:r>
+    </w:p>
+    <w:p>
+      <w:pPr>
+        <w:spacing w:line="360" w:lineRule="auto"/>
+        <w:ind w:firstLine="567"/>
+        <w:jc w:val="both"/>
+      </w:pPr>
+      <w:r>
+        <w:rPr/>
+        <w:t xml:space="preserve">Automatické nástroje ale neodhalí všechno, proto jsme web prošli i ručně. Celý jde ovládat klávesnicí, první stisk Tab ukáže odkaz Přeskočit na obsah a prvek, na kterém je fokus, má zelený rámeček. U karty inzerátu se orámuje celá karta, ne jen nadpis. Mobilní menu jde zavřít klávesou Escape a po zrušení filtrů zůstane fokus ve formuláři.</w:t>
+      </w:r>
+    </w:p>
+    <w:p>
+      <w:pPr>
+        <w:keepNext/>
+        <w:spacing w:before="240"/>
+        <w:jc w:val="center"/>
+      </w:pPr>
+      <w:r>
+        <w:drawing>
+          <wp:inline distT="0" distB="0" distL="0" distR="0">
+            <wp:extent cx="5580380" cy="3487738"/>
+            <wp:docPr id="113" name="Obrázek 113" descr="Fokus na kartě inzerátu při ovládání klávesnicí"/>
+            <a:graphic xmlns:a="http://schemas.openxmlformats.org/drawingml/2006/main">
+              <a:graphicData uri="http://schemas.openxmlformats.org/drawingml/2006/picture">
+                <pic:pic xmlns:pic="http://schemas.openxmlformats.org/drawingml/2006/picture">
+                  <pic:nvPicPr>
+                    <pic:cNvPr id="113" name="a11y-fokus.jpg"/>
+                    <pic:cNvPicPr/>
+                  </pic:nvPicPr>
+                  <pic:blipFill>
+                    <a:blip r:embed="rIdImg13"/>
+                    <a:stretch>
+                      <a:fillRect/>
+                    </a:stretch>
+                  </pic:blipFill>
+                  <pic:spPr>
+                    <a:xfrm>
+                      <a:off x="0" y="0"/>
+                      <a:ext cx="5580380" cy="3487738"/>
+                    </a:xfrm>
+                    <a:prstGeom prst="rect">
+                      <a:avLst/>
+                    </a:prstGeom>
+                    <a:ln w="6350">
+                      <a:solidFill>
+                        <a:srgbClr val="CDC6B8"/>
+                      </a:solidFill>
+                    </a:ln>
+                  </pic:spPr>
+                </pic:pic>
+              </a:graphicData>
+            </a:graphic>
+          </wp:inline>
+        </w:drawing>
+      </w:r>
+    </w:p>
+    <w:p>
+      <w:pPr>
+        <w:keepNext/>
+        <w:spacing w:before="60" w:after="240"/>
+        <w:jc w:val="center"/>
+      </w:pPr>
+      <w:r>
+        <w:rPr>
+          <w:sz w:val="22"/>
+          <w:b/>
+        </w:rPr>
+        <w:t xml:space="preserve">Obrázek 10: </w:t>
+      </w:r>
+      <w:r>
+        <w:rPr>
+          <w:sz w:val="22"/>
+        </w:rPr>
+        <w:t xml:space="preserve">Fokus na kartě inzerátu při ovládání klávesnicí</w:t>
+      </w:r>
+    </w:p>
+    <w:p>
+      <w:pPr>
+        <w:spacing w:line="360" w:lineRule="auto"/>
+        <w:ind w:firstLine="567"/>
+        <w:jc w:val="both"/>
+      </w:pPr>
+      <w:r>
+        <w:rPr/>
+        <w:t xml:space="preserve">V kódu to vypadá takto (ukázky jsou z hotového webu):</w:t>
       </w:r>
     </w:p>
     <w:p>
@@ -5551,7 +6148,49 @@
       </w:pPr>
       <w:r>
         <w:rPr/>
-        <w:t xml:space="preserve">přeskočenou úroveň nadpisu ve výpisu,</w:t>
+        <w:t xml:space="preserve">odkaz pro přeskočení navigace a tlačítko mobilního menu, které čtečce oznamuje, jestli je menu otevřené:</w:t>
+      </w:r>
+    </w:p>
+    <w:p>
+      <w:pPr>
+        <w:shd w:val="clear" w:color="auto" w:fill="F2F2F2"/>
+        <w:spacing w:before="120" w:after="0" w:line="240" w:lineRule="auto"/>
+        <w:ind w:left="284" w:right="284"/>
+      </w:pPr>
+      <w:r>
+        <w:rPr>
+          <w:rFonts w:ascii="Courier New" w:hAnsi="Courier New" w:cs="Courier New"/>
+          <w:sz w:val="17"/>
+        </w:rPr>
+        <w:t xml:space="preserve">&lt;a class="skip-link" href="#main"&gt;Přeskočit na obsah&lt;/a&gt;</w:t>
+      </w:r>
+    </w:p>
+    <w:p>
+      <w:pPr>
+        <w:shd w:val="clear" w:color="auto" w:fill="F2F2F2"/>
+        <w:spacing w:before="0" w:after="0" w:line="240" w:lineRule="auto"/>
+        <w:ind w:left="284" w:right="284"/>
+      </w:pPr>
+      <w:r>
+        <w:rPr>
+          <w:rFonts w:ascii="Courier New" w:hAnsi="Courier New" w:cs="Courier New"/>
+          <w:sz w:val="17"/>
+        </w:rPr>
+        <w:t xml:space="preserve">&lt;button class="menu-toggle" type="button" aria-expanded="false"</w:t>
+      </w:r>
+    </w:p>
+    <w:p>
+      <w:pPr>
+        <w:shd w:val="clear" w:color="auto" w:fill="F2F2F2"/>
+        <w:spacing w:before="0" w:after="160" w:line="240" w:lineRule="auto"/>
+        <w:ind w:left="284" w:right="284"/>
+      </w:pPr>
+      <w:r>
+        <w:rPr>
+          <w:rFonts w:ascii="Courier New" w:hAnsi="Courier New" w:cs="Courier New"/>
+          <w:sz w:val="17"/>
+        </w:rPr>
+        <w:t xml:space="preserve">        aria-controls="main-nav"&gt;</w:t>
       </w:r>
     </w:p>
     <w:p>
@@ -5565,7 +6204,91 @@
       </w:pPr>
       <w:r>
         <w:rPr/>
-        <w:t xml:space="preserve">malé body na mapě, které neměly minimální velikost 24 px pro kliknutí,</w:t>
+        <w:t xml:space="preserve">pole formuláře má popisek, nápovědu a při chybě i hlášku, kterou čtečka přečte spolu s polem:</w:t>
+      </w:r>
+    </w:p>
+    <w:p>
+      <w:pPr>
+        <w:shd w:val="clear" w:color="auto" w:fill="F2F2F2"/>
+        <w:spacing w:before="120" w:after="0" w:line="240" w:lineRule="auto"/>
+        <w:ind w:left="284" w:right="284"/>
+      </w:pPr>
+      <w:r>
+        <w:rPr>
+          <w:rFonts w:ascii="Courier New" w:hAnsi="Courier New" w:cs="Courier New"/>
+          <w:sz w:val="17"/>
+        </w:rPr>
+        <w:t xml:space="preserve">&lt;label for="field-email"&gt;E-mail&lt;/label&gt;</w:t>
+      </w:r>
+    </w:p>
+    <w:p>
+      <w:pPr>
+        <w:shd w:val="clear" w:color="auto" w:fill="F2F2F2"/>
+        <w:spacing w:before="0" w:after="0" w:line="240" w:lineRule="auto"/>
+        <w:ind w:left="284" w:right="284"/>
+      </w:pPr>
+      <w:r>
+        <w:rPr>
+          <w:rFonts w:ascii="Courier New" w:hAnsi="Courier New" w:cs="Courier New"/>
+          <w:sz w:val="17"/>
+        </w:rPr>
+        <w:t xml:space="preserve">&lt;p class="field__hint" id="field-email-hint"&gt;V inzerátech se nezobrazuje.&lt;/p&gt;</w:t>
+      </w:r>
+    </w:p>
+    <w:p>
+      <w:pPr>
+        <w:shd w:val="clear" w:color="auto" w:fill="F2F2F2"/>
+        <w:spacing w:before="0" w:after="0" w:line="240" w:lineRule="auto"/>
+        <w:ind w:left="284" w:right="284"/>
+      </w:pPr>
+      <w:r>
+        <w:rPr>
+          <w:rFonts w:ascii="Courier New" w:hAnsi="Courier New" w:cs="Courier New"/>
+          <w:sz w:val="17"/>
+        </w:rPr>
+        <w:t xml:space="preserve">&lt;input type="email" id="field-email" name="email" required</w:t>
+      </w:r>
+    </w:p>
+    <w:p>
+      <w:pPr>
+        <w:shd w:val="clear" w:color="auto" w:fill="F2F2F2"/>
+        <w:spacing w:before="0" w:after="0" w:line="240" w:lineRule="auto"/>
+        <w:ind w:left="284" w:right="284"/>
+      </w:pPr>
+      <w:r>
+        <w:rPr>
+          <w:rFonts w:ascii="Courier New" w:hAnsi="Courier New" w:cs="Courier New"/>
+          <w:sz w:val="17"/>
+        </w:rPr>
+        <w:t xml:space="preserve">       aria-invalid="true" autocomplete="email"</w:t>
+      </w:r>
+    </w:p>
+    <w:p>
+      <w:pPr>
+        <w:shd w:val="clear" w:color="auto" w:fill="F2F2F2"/>
+        <w:spacing w:before="0" w:after="0" w:line="240" w:lineRule="auto"/>
+        <w:ind w:left="284" w:right="284"/>
+      </w:pPr>
+      <w:r>
+        <w:rPr>
+          <w:rFonts w:ascii="Courier New" w:hAnsi="Courier New" w:cs="Courier New"/>
+          <w:sz w:val="17"/>
+        </w:rPr>
+        <w:t xml:space="preserve">       aria-describedby="field-email-hint field-email-error"&gt;</w:t>
+      </w:r>
+    </w:p>
+    <w:p>
+      <w:pPr>
+        <w:shd w:val="clear" w:color="auto" w:fill="F2F2F2"/>
+        <w:spacing w:before="0" w:after="160" w:line="240" w:lineRule="auto"/>
+        <w:ind w:left="284" w:right="284"/>
+      </w:pPr>
+      <w:r>
+        <w:rPr>
+          <w:rFonts w:ascii="Courier New" w:hAnsi="Courier New" w:cs="Courier New"/>
+          <w:sz w:val="17"/>
+        </w:rPr>
+        <w:t xml:space="preserve">&lt;p class="field__error" id="field-email-error"&gt;Zadejte platný e-mail…&lt;/p&gt;</w:t>
       </w:r>
     </w:p>
     <w:p>
@@ -5579,7 +6302,95 @@
       </w:pPr>
       <w:r>
         <w:rPr/>
-        <w:t xml:space="preserve">pořadí při ovládání klávesnicí, kdy se tabulátorem šlo nejdřív přes celou mapu a až pak na výsledky,</w:t>
+        <w:t xml:space="preserve">počet výsledků se po filtrování přes AJAX přečte sám, fotka má popis a mapa je pojmenovaná oblast:</w:t>
+      </w:r>
+    </w:p>
+    <w:p>
+      <w:pPr>
+        <w:shd w:val="clear" w:color="auto" w:fill="F2F2F2"/>
+        <w:spacing w:before="120" w:after="0" w:line="240" w:lineRule="auto"/>
+        <w:ind w:left="284" w:right="284"/>
+      </w:pPr>
+      <w:r>
+        <w:rPr>
+          <w:rFonts w:ascii="Courier New" w:hAnsi="Courier New" w:cs="Courier New"/>
+          <w:sz w:val="17"/>
+        </w:rPr>
+        <w:t xml:space="preserve">&lt;p class="listing__count" aria-live="polite"&gt;14 inzerátů&lt;/p&gt;</w:t>
+      </w:r>
+    </w:p>
+    <w:p>
+      <w:pPr>
+        <w:shd w:val="clear" w:color="auto" w:fill="F2F2F2"/>
+        <w:spacing w:before="0" w:after="0" w:line="240" w:lineRule="auto"/>
+        <w:ind w:left="284" w:right="284"/>
+      </w:pPr>
+      <w:r>
+        <w:rPr>
+          <w:rFonts w:ascii="Courier New" w:hAnsi="Courier New" w:cs="Courier New"/>
+          <w:sz w:val="17"/>
+        </w:rPr>
+        <w:t xml:space="preserve">&lt;img src="/images/items/3.webp" alt="Fotka: Bezdrátová sluchátka v pouzdře"</w:t>
+      </w:r>
+    </w:p>
+    <w:p>
+      <w:pPr>
+        <w:shd w:val="clear" w:color="auto" w:fill="F2F2F2"/>
+        <w:spacing w:before="0" w:after="0" w:line="240" w:lineRule="auto"/>
+        <w:ind w:left="284" w:right="284"/>
+      </w:pPr>
+      <w:r>
+        <w:rPr>
+          <w:rFonts w:ascii="Courier New" w:hAnsi="Courier New" w:cs="Courier New"/>
+          <w:sz w:val="17"/>
+        </w:rPr>
+        <w:t xml:space="preserve">     width="1000" height="750"&gt;</w:t>
+      </w:r>
+    </w:p>
+    <w:p>
+      <w:pPr>
+        <w:shd w:val="clear" w:color="auto" w:fill="F2F2F2"/>
+        <w:spacing w:before="0" w:after="160" w:line="240" w:lineRule="auto"/>
+        <w:ind w:left="284" w:right="284"/>
+      </w:pPr>
+      <w:r>
+        <w:rPr>
+          <w:rFonts w:ascii="Courier New" w:hAnsi="Courier New" w:cs="Courier New"/>
+          <w:sz w:val="17"/>
+        </w:rPr>
+        <w:t xml:space="preserve">&lt;div class="map" role="region" aria-label="Místo na mapě"&gt;</w:t>
+      </w:r>
+    </w:p>
+    <w:p>
+      <w:pPr>
+        <w:spacing w:line="360" w:lineRule="auto"/>
+        <w:ind w:firstLine="567"/>
+        <w:jc w:val="both"/>
+      </w:pPr>
+      <w:r>
+        <w:rPr/>
+        <w:t xml:space="preserve">Dále web respektuje nastavení omezení pohybu v systému (prefers-reduced-motion), kontrast textu odpovídá WCAG AA a body na mapě mají kvůli kliknutí na mobilu velikost aspoň 24 × 24 px. Během vývoje jsme podle testů opravili například přeskočenou úroveň nadpisu, pořadí prvků při procházení tabulátorem a dvě oblasti stránky se stejným názvem na stránce Můj účet.</w:t>
+      </w:r>
+    </w:p>
+    <w:p>
+      <w:pPr>
+        <w:pStyle w:val="Nadpis2"/>
+        <w:keepNext/>
+      </w:pPr>
+      <w:r>
+        <w:rPr/>
+        <w:t xml:space="preserve">Rychlost</w:t>
+      </w:r>
+    </w:p>
+    <w:p>
+      <w:pPr>
+        <w:spacing w:line="360" w:lineRule="auto"/>
+        <w:ind w:firstLine="567"/>
+        <w:jc w:val="both"/>
+      </w:pPr>
+      <w:r>
+        <w:rPr/>
+        <w:t xml:space="preserve">Na rychlost jsme mysleli od začátku:</w:t>
       </w:r>
     </w:p>
     <w:p>
@@ -5593,7 +6404,7 @@
       </w:pPr>
       <w:r>
         <w:rPr/>
-        <w:t xml:space="preserve">ztrátu fokusu po zrušení filtrů,</w:t>
+        <w:t xml:space="preserve">fotky jsou ve formátu WebP ve dvou velikostech, náhled na kartě má jen pár kilobajtů,</w:t>
       </w:r>
     </w:p>
     <w:p>
@@ -5607,45 +6418,7 @@
       </w:pPr>
       <w:r>
         <w:rPr/>
-        <w:t xml:space="preserve">anglické popisky ovládání mapy.</w:t>
-      </w:r>
-    </w:p>
-    <w:p>
-      <w:pPr>
-        <w:spacing w:line="360" w:lineRule="auto"/>
-        <w:ind w:firstLine="567"/>
-        <w:jc w:val="both"/>
-      </w:pPr>
-      <w:r>
-        <w:rPr/>
-        <w:t xml:space="preserve">Web jde celý ovládat klávesnicí, má odkaz Přeskočit na obsah, viditelný fokus a popisky u všech polí formulářů. Chyby ve formulářích se zobrazí přímo u pole a čtečka obrazovky je přečte. Mobilní menu jde zavřít klávesou Escape. Kontrast barev odpovídá WCAG AA. </w:t>
-      </w:r>
-      <w:r>
-        <w:rPr>
-          <w:highlight w:val="yellow"/>
-        </w:rPr>
-        <w:t xml:space="preserve">DOPLNIT: test nástrojem WAVE nebo axe a screenshot výsledku.</w:t>
-      </w:r>
-    </w:p>
-    <w:p>
-      <w:pPr>
-        <w:pStyle w:val="Nadpis2"/>
-        <w:keepNext/>
-      </w:pPr>
-      <w:r>
-        <w:rPr/>
-        <w:t xml:space="preserve">Rychlost</w:t>
-      </w:r>
-    </w:p>
-    <w:p>
-      <w:pPr>
-        <w:spacing w:line="360" w:lineRule="auto"/>
-        <w:ind w:firstLine="567"/>
-        <w:jc w:val="both"/>
-      </w:pPr>
-      <w:r>
-        <w:rPr/>
-        <w:t xml:space="preserve">Na rychlost jsme mysleli od začátku:</w:t>
+        <w:t xml:space="preserve">obrázky mimo obrazovku se načítají až při posouvání (lazy loading),</w:t>
       </w:r>
     </w:p>
     <w:p>
@@ -5659,7 +6432,7 @@
       </w:pPr>
       <w:r>
         <w:rPr/>
-        <w:t xml:space="preserve">fotky jsou ve formátu WebP ve dvou velikostech, náhled na kartě má jen pár kilobajtů,</w:t>
+        <w:t xml:space="preserve">Vite zmenšuje CSS a JavaScript a kód mapy se načte jen na stránkách, kde mapa je,</w:t>
       </w:r>
     </w:p>
     <w:p>
@@ -5673,7 +6446,66 @@
       </w:pPr>
       <w:r>
         <w:rPr/>
-        <w:t xml:space="preserve">obrázky mimo obrazovku se načítají až při posouvání (lazy loading),</w:t>
+        <w:t xml:space="preserve">písmo je uložené přímo na webu, takže se nic nenačítá z Google Fonts.</w:t>
+      </w:r>
+    </w:p>
+    <w:p>
+      <w:pPr>
+        <w:spacing w:line="360" w:lineRule="auto"/>
+        <w:ind w:firstLine="567"/>
+        <w:jc w:val="both"/>
+      </w:pPr>
+      <w:r>
+        <w:rPr/>
+        <w:t xml:space="preserve">Lighthouse dává 100 bodů i v kategoriích Best Practices a SEO na veřejných stránkách. Soukromé stránky mají v SEO méně bodů schválně, protože mají nastavené noindex. </w:t>
+      </w:r>
+      <w:r>
+        <w:rPr>
+          <w:highlight w:val="yellow"/>
+        </w:rPr>
+        <w:t xml:space="preserve">DOPLNIT: výsledek PageSpeed Insights pro mobil a počítač po nasazení na server (skóre, LCP, CLS).</w:t>
+      </w:r>
+    </w:p>
+    <w:p>
+      <w:pPr>
+        <w:pStyle w:val="Nadpis2"/>
+        <w:keepNext/>
+      </w:pPr>
+      <w:r>
+        <w:rPr/>
+        <w:t xml:space="preserve">Validita kódu</w:t>
+      </w:r>
+    </w:p>
+    <w:p>
+      <w:pPr>
+        <w:spacing w:line="360" w:lineRule="auto"/>
+        <w:ind w:firstLine="567"/>
+        <w:jc w:val="both"/>
+      </w:pPr>
+      <w:r>
+        <w:rPr/>
+        <w:t xml:space="preserve">Kód jsme ověřili validátory W3C. HTML validátor (Nu HTML Checker) nehlásí žádnou chybu ani varování na deseti kontrolovaných stránkách: úvod, výpis, detail, přidání a úprava inzerátu, přihlášení, registrace, Můj účet a dvě stránky administrace. CSS validátor nenašel chybu v žádném ze čtyř souborů se styly, jen upozorňuje, že hodnoty CSS proměnných staticky nekontroluje.</w:t>
+      </w:r>
+    </w:p>
+    <w:p>
+      <w:pPr>
+        <w:pStyle w:val="Nadpis2"/>
+        <w:keepNext/>
+      </w:pPr>
+      <w:r>
+        <w:rPr/>
+        <w:t xml:space="preserve">Automatické testy</w:t>
+      </w:r>
+    </w:p>
+    <w:p>
+      <w:pPr>
+        <w:spacing w:line="360" w:lineRule="auto"/>
+        <w:ind w:firstLine="567"/>
+        <w:jc w:val="both"/>
+      </w:pPr>
+      <w:r>
+        <w:rPr/>
+        <w:t xml:space="preserve">Serverovou část hlídá 281 automatických testů v PHPUnit (675 kontrol). Testy běží proti samostatné testovací databázi, která se při každém spuštění vytvoří znovu. Spouštějí se příkazem composer test.</w:t>
       </w:r>
     </w:p>
     <w:p>
@@ -5687,7 +6519,7 @@
       </w:pPr>
       <w:r>
         <w:rPr/>
-        <w:t xml:space="preserve">Vite zmenšuje CSS a JavaScript a kód mapy se načte jen na stránkách, kde mapa je,</w:t>
+        <w:t xml:space="preserve">jednotkové testy kontrolují pomocné funkce, filtry výpisu a validaci formulářů,</w:t>
       </w:r>
     </w:p>
     <w:p>
@@ -5701,66 +6533,7 @@
       </w:pPr>
       <w:r>
         <w:rPr/>
-        <w:t xml:space="preserve">písmo je uložené přímo na webu, takže se nic nenačítá z Google Fonts.</w:t>
-      </w:r>
-    </w:p>
-    <w:p>
-      <w:pPr>
-        <w:spacing w:line="360" w:lineRule="auto"/>
-        <w:ind w:firstLine="567"/>
-        <w:jc w:val="both"/>
-      </w:pPr>
-      <w:r>
-        <w:rPr/>
-        <w:t xml:space="preserve">Lighthouse dává 100 bodů i v kategoriích Best Practices a SEO na veřejných stránkách. Soukromé stránky mají v SEO méně bodů schválně, protože mají nastavené noindex. </w:t>
-      </w:r>
-      <w:r>
-        <w:rPr>
-          <w:highlight w:val="yellow"/>
-        </w:rPr>
-        <w:t xml:space="preserve">DOPLNIT: výsledek PageSpeed Insights pro mobil a počítač po nasazení na server (skóre, LCP, CLS).</w:t>
-      </w:r>
-    </w:p>
-    <w:p>
-      <w:pPr>
-        <w:pStyle w:val="Nadpis2"/>
-        <w:keepNext/>
-      </w:pPr>
-      <w:r>
-        <w:rPr/>
-        <w:t xml:space="preserve">Validita kódu</w:t>
-      </w:r>
-    </w:p>
-    <w:p>
-      <w:pPr>
-        <w:spacing w:line="360" w:lineRule="auto"/>
-        <w:ind w:firstLine="567"/>
-        <w:jc w:val="both"/>
-      </w:pPr>
-      <w:r>
-        <w:rPr/>
-        <w:t xml:space="preserve">Kód jsme ověřili validátory W3C. HTML validátor (Nu HTML Checker) nehlásí žádnou chybu ani varování na deseti kontrolovaných stránkách: úvod, výpis, detail, přidání a úprava inzerátu, přihlášení, registrace, Můj účet a dvě stránky administrace. CSS validátor nenašel chybu v žádném ze čtyř souborů se styly, jen upozorňuje, že hodnoty CSS proměnných staticky nekontroluje.</w:t>
-      </w:r>
-    </w:p>
-    <w:p>
-      <w:pPr>
-        <w:pStyle w:val="Nadpis2"/>
-        <w:keepNext/>
-      </w:pPr>
-      <w:r>
-        <w:rPr/>
-        <w:t xml:space="preserve">Automatické testy</w:t>
-      </w:r>
-    </w:p>
-    <w:p>
-      <w:pPr>
-        <w:spacing w:line="360" w:lineRule="auto"/>
-        <w:ind w:firstLine="567"/>
-        <w:jc w:val="both"/>
-      </w:pPr>
-      <w:r>
-        <w:rPr/>
-        <w:t xml:space="preserve">Serverovou část hlídá 281 automatických testů v PHPUnit (675 kontrol). Testy běží proti samostatné testovací databázi, která se při každém spuštění vytvoří znovu. Spouštějí se příkazem composer test.</w:t>
+        <w:t xml:space="preserve">testy celých požadavků procházejí registraci a přihlášení, Můj účet, kontaktní formulář, administraci inzerátů, uživatelů, kategorií a budov,</w:t>
       </w:r>
     </w:p>
     <w:p>
@@ -5774,34 +6547,6 @@
       </w:pPr>
       <w:r>
         <w:rPr/>
-        <w:t xml:space="preserve">jednotkové testy kontrolují pomocné funkce, filtry výpisu a validaci formulářů,</w:t>
-      </w:r>
-    </w:p>
-    <w:p>
-      <w:pPr>
-        <w:pStyle w:val="Odstavecseseznamem"/>
-        <w:numPr>
-          <w:ilvl w:val="0"/>
-          <w:numId w:val="2"/>
-        </w:numPr>
-        <w:spacing w:line="360" w:lineRule="auto"/>
-      </w:pPr>
-      <w:r>
-        <w:rPr/>
-        <w:t xml:space="preserve">testy celých požadavků procházejí registraci a přihlášení, Můj účet, kontaktní formulář, administraci inzerátů, uživatelů, kategorií a budov,</w:t>
-      </w:r>
-    </w:p>
-    <w:p>
-      <w:pPr>
-        <w:pStyle w:val="Odstavecseseznamem"/>
-        <w:numPr>
-          <w:ilvl w:val="0"/>
-          <w:numId w:val="2"/>
-        </w:numPr>
-        <w:spacing w:line="360" w:lineRule="auto"/>
-      </w:pPr>
-      <w:r>
-        <w:rPr/>
         <w:t xml:space="preserve">zvlášť se testuje, že bez CSRF tokenu formulář neprojde a že cizí inzerát nejde upravit.</w:t>
       </w:r>
     </w:p>
@@ -6028,7 +6773,7 @@
       </w:pPr>
       <w:r>
         <w:rPr/>
-        <w:t xml:space="preserve">OWASP. Cross-Site Request Forgery Prevention Cheat Sheet [online]. [cit. 2026-10-19]. Dostupné z: https://cheatsheetseries.owasp.org/cheatsheets/Cross-Site_Request_Forgery_Prevention_Cheat_Sheet.html</w:t>
+        <w:t xml:space="preserve">DEQUE SYSTEMS. axe-core: accessibility engine [online]. [cit. 2026-10-19]. Dostupné z: https://github.com/dequelabs/axe-core</w:t>
       </w:r>
     </w:p>
     <w:p>
@@ -6042,6 +6787,48 @@
       </w:pPr>
       <w:r>
         <w:rPr/>
+        <w:t xml:space="preserve">GOOGLE. Lighthouse [online]. [cit. 2026-10-19]. Dostupné z: https://developer.chrome.com/docs/lighthouse</w:t>
+      </w:r>
+    </w:p>
+    <w:p>
+      <w:pPr>
+        <w:pStyle w:val="Odstavecseseznamem"/>
+        <w:numPr>
+          <w:ilvl w:val="0"/>
+          <w:numId w:val="18"/>
+        </w:numPr>
+        <w:spacing w:line="360" w:lineRule="auto"/>
+      </w:pPr>
+      <w:r>
+        <w:rPr/>
+        <w:t xml:space="preserve">W3C. Nu Html Checker [online]. [cit. 2026-10-19]. Dostupné z: https://validator.w3.org/nu/</w:t>
+      </w:r>
+    </w:p>
+    <w:p>
+      <w:pPr>
+        <w:pStyle w:val="Odstavecseseznamem"/>
+        <w:numPr>
+          <w:ilvl w:val="0"/>
+          <w:numId w:val="18"/>
+        </w:numPr>
+        <w:spacing w:line="360" w:lineRule="auto"/>
+      </w:pPr>
+      <w:r>
+        <w:rPr/>
+        <w:t xml:space="preserve">OWASP. Cross-Site Request Forgery Prevention Cheat Sheet [online]. [cit. 2026-10-19]. Dostupné z: https://cheatsheetseries.owasp.org/cheatsheets/Cross-Site_Request_Forgery_Prevention_Cheat_Sheet.html</w:t>
+      </w:r>
+    </w:p>
+    <w:p>
+      <w:pPr>
+        <w:pStyle w:val="Odstavecseseznamem"/>
+        <w:numPr>
+          <w:ilvl w:val="0"/>
+          <w:numId w:val="18"/>
+        </w:numPr>
+        <w:spacing w:line="360" w:lineRule="auto"/>
+      </w:pPr>
+      <w:r>
+        <w:rPr/>
         <w:t xml:space="preserve">UNSPLASH. Unsplash License [online]. [cit. 2026-10-14]. Dostupné z: https://unsplash.com/license</w:t>
       </w:r>
     </w:p>
@@ -6164,7 +6951,7 @@
       </w:pPr>
       <w:r>
         <w:rPr/>
-        <w:t xml:space="preserve">Obrázek 9: Wireframe výpisu inzerátů (počítač a mobil)</w:t>
+        <w:t xml:space="preserve">Obrázek 9: Výsledek Lighthouse v kategorii přístupnost (detail inzerátu)</w:t>
       </w:r>
     </w:p>
     <w:p>
@@ -6175,7 +6962,7 @@
       </w:pPr>
       <w:r>
         <w:rPr/>
-        <w:t xml:space="preserve">Obrázek 10: Wireframe formuláře Nahlásit věc (počítač a mobil)</w:t>
+        <w:t xml:space="preserve">Obrázek 10: Fokus na kartě inzerátu při ovládání klávesnicí</w:t>
       </w:r>
     </w:p>
     <w:p>
@@ -6186,7 +6973,7 @@
       </w:pPr>
       <w:r>
         <w:rPr/>
-        <w:t xml:space="preserve">Obrázek 11: Wireframe přihlášení a registrace</w:t>
+        <w:t xml:space="preserve">Obrázek 11: Wireframe výpisu inzerátů (počítač a mobil)</w:t>
       </w:r>
     </w:p>
     <w:p>
@@ -6197,7 +6984,7 @@
       </w:pPr>
       <w:r>
         <w:rPr/>
-        <w:t xml:space="preserve">Obrázek 12: Wireframe stránky Můj účet</w:t>
+        <w:t xml:space="preserve">Obrázek 12: Wireframe formuláře Nahlásit věc (počítač a mobil)</w:t>
       </w:r>
     </w:p>
     <w:p>
@@ -6208,7 +6995,7 @@
       </w:pPr>
       <w:r>
         <w:rPr/>
-        <w:t xml:space="preserve">Obrázek 13: Wireframe administrace</w:t>
+        <w:t xml:space="preserve">Obrázek 13: Wireframe přihlášení a registrace</w:t>
       </w:r>
     </w:p>
     <w:p>
@@ -6219,7 +7006,29 @@
       </w:pPr>
       <w:r>
         <w:rPr/>
-        <w:t xml:space="preserve">Obrázek 14: Wireframe společných komponent</w:t>
+        <w:t xml:space="preserve">Obrázek 14: Wireframe stránky Můj účet</w:t>
+      </w:r>
+    </w:p>
+    <w:p>
+      <w:pPr>
+        <w:spacing w:line="360" w:lineRule="auto"/>
+        <w:ind w:firstLine="567"/>
+        <w:jc w:val="both"/>
+      </w:pPr>
+      <w:r>
+        <w:rPr/>
+        <w:t xml:space="preserve">Obrázek 15: Wireframe administrace</w:t>
+      </w:r>
+    </w:p>
+    <w:p>
+      <w:pPr>
+        <w:spacing w:line="360" w:lineRule="auto"/>
+        <w:ind w:firstLine="567"/>
+        <w:jc w:val="both"/>
+      </w:pPr>
+      <w:r>
+        <w:rPr/>
+        <w:t xml:space="preserve">Obrázek 16: Wireframe společných komponent</w:t>
       </w:r>
     </w:p>
     <w:p>
@@ -6285,6 +7094,17 @@
       <w:r>
         <w:rPr/>
         <w:t xml:space="preserve">Tabulka 5: Úkoly pro test použitelnosti</w:t>
+      </w:r>
+    </w:p>
+    <w:p>
+      <w:pPr>
+        <w:spacing w:line="360" w:lineRule="auto"/>
+        <w:ind w:firstLine="567"/>
+        <w:jc w:val="both"/>
+      </w:pPr>
+      <w:r>
+        <w:rPr/>
+        <w:t xml:space="preserve">Tabulka 6: Výsledky automatických testů přístupnosti</w:t>
       </w:r>
     </w:p>
     <w:p>
@@ -6884,16 +7704,16 @@
         <w:drawing>
           <wp:inline distT="0" distB="0" distL="0" distR="0">
             <wp:extent cx="3556000" cy="3458210"/>
-            <wp:docPr id="112" name="Obrázek 112" descr="Wireframe výpisu inzerátů (počítač a mobil)"/>
+            <wp:docPr id="114" name="Obrázek 114" descr="Wireframe výpisu inzerátů (počítač a mobil)"/>
             <a:graphic xmlns:a="http://schemas.openxmlformats.org/drawingml/2006/main">
               <a:graphicData uri="http://schemas.openxmlformats.org/drawingml/2006/picture">
                 <pic:pic xmlns:pic="http://schemas.openxmlformats.org/drawingml/2006/picture">
                   <pic:nvPicPr>
-                    <pic:cNvPr id="112" name="02-vypis-pocitac.jpg"/>
+                    <pic:cNvPr id="114" name="02-vypis-pocitac.jpg"/>
                     <pic:cNvPicPr/>
                   </pic:nvPicPr>
                   <pic:blipFill>
-                    <a:blip r:embed="rIdImg12"/>
+                    <a:blip r:embed="rIdImg14"/>
                     <a:stretch>
                       <a:fillRect/>
                     </a:stretch>
@@ -6925,16 +7745,16 @@
         <w:drawing>
           <wp:inline distT="0" distB="0" distL="0" distR="0">
             <wp:extent cx="1206500" cy="4585273"/>
-            <wp:docPr id="113" name="Obrázek 113" descr="Wireframe výpisu inzerátů (počítač a mobil)"/>
+            <wp:docPr id="115" name="Obrázek 115" descr="Wireframe výpisu inzerátů (počítač a mobil)"/>
             <a:graphic xmlns:a="http://schemas.openxmlformats.org/drawingml/2006/main">
               <a:graphicData uri="http://schemas.openxmlformats.org/drawingml/2006/picture">
                 <pic:pic xmlns:pic="http://schemas.openxmlformats.org/drawingml/2006/picture">
                   <pic:nvPicPr>
-                    <pic:cNvPr id="113" name="02-vypis-mobil.jpg"/>
+                    <pic:cNvPr id="115" name="02-vypis-mobil.jpg"/>
                     <pic:cNvPicPr/>
                   </pic:nvPicPr>
                   <pic:blipFill>
-                    <a:blip r:embed="rIdImg13"/>
+                    <a:blip r:embed="rIdImg15"/>
                     <a:stretch>
                       <a:fillRect/>
                     </a:stretch>
@@ -6971,7 +7791,7 @@
           <w:sz w:val="22"/>
           <w:b/>
         </w:rPr>
-        <w:t xml:space="preserve">Obrázek 9: </w:t>
+        <w:t xml:space="preserve">Obrázek 11: </w:t>
       </w:r>
       <w:r>
         <w:rPr>
@@ -6990,16 +7810,16 @@
         <w:drawing>
           <wp:inline distT="0" distB="0" distL="0" distR="0">
             <wp:extent cx="3556000" cy="4192778"/>
-            <wp:docPr id="114" name="Obrázek 114" descr="Wireframe formuláře Nahlásit věc (počítač a mobil)"/>
+            <wp:docPr id="116" name="Obrázek 116" descr="Wireframe formuláře Nahlásit věc (počítač a mobil)"/>
             <a:graphic xmlns:a="http://schemas.openxmlformats.org/drawingml/2006/main">
               <a:graphicData uri="http://schemas.openxmlformats.org/drawingml/2006/picture">
                 <pic:pic xmlns:pic="http://schemas.openxmlformats.org/drawingml/2006/picture">
                   <pic:nvPicPr>
-                    <pic:cNvPr id="114" name="04-nahlasit-pocitac.jpg"/>
+                    <pic:cNvPr id="116" name="04-nahlasit-pocitac.jpg"/>
                     <pic:cNvPicPr/>
                   </pic:nvPicPr>
                   <pic:blipFill>
-                    <a:blip r:embed="rIdImg14"/>
+                    <a:blip r:embed="rIdImg16"/>
                     <a:stretch>
                       <a:fillRect/>
                     </a:stretch>
@@ -7031,16 +7851,16 @@
         <w:drawing>
           <wp:inline distT="0" distB="0" distL="0" distR="0">
             <wp:extent cx="1206500" cy="5027083"/>
-            <wp:docPr id="115" name="Obrázek 115" descr="Wireframe formuláře Nahlásit věc (počítač a mobil)"/>
+            <wp:docPr id="117" name="Obrázek 117" descr="Wireframe formuláře Nahlásit věc (počítač a mobil)"/>
             <a:graphic xmlns:a="http://schemas.openxmlformats.org/drawingml/2006/main">
               <a:graphicData uri="http://schemas.openxmlformats.org/drawingml/2006/picture">
                 <pic:pic xmlns:pic="http://schemas.openxmlformats.org/drawingml/2006/picture">
                   <pic:nvPicPr>
-                    <pic:cNvPr id="115" name="04-nahlasit-mobil.jpg"/>
+                    <pic:cNvPr id="117" name="04-nahlasit-mobil.jpg"/>
                     <pic:cNvPicPr/>
                   </pic:nvPicPr>
                   <pic:blipFill>
-                    <a:blip r:embed="rIdImg15"/>
+                    <a:blip r:embed="rIdImg17"/>
                     <a:stretch>
                       <a:fillRect/>
                     </a:stretch>
@@ -7077,7 +7897,7 @@
           <w:sz w:val="22"/>
           <w:b/>
         </w:rPr>
-        <w:t xml:space="preserve">Obrázek 10: </w:t>
+        <w:t xml:space="preserve">Obrázek 12: </w:t>
       </w:r>
       <w:r>
         <w:rPr>
@@ -7096,16 +7916,16 @@
         <w:drawing>
           <wp:inline distT="0" distB="0" distL="0" distR="0">
             <wp:extent cx="5580380" cy="3836511"/>
-            <wp:docPr id="116" name="Obrázek 116" descr="Wireframe přihlášení a registrace"/>
+            <wp:docPr id="118" name="Obrázek 118" descr="Wireframe přihlášení a registrace"/>
             <a:graphic xmlns:a="http://schemas.openxmlformats.org/drawingml/2006/main">
               <a:graphicData uri="http://schemas.openxmlformats.org/drawingml/2006/picture">
                 <pic:pic xmlns:pic="http://schemas.openxmlformats.org/drawingml/2006/picture">
                   <pic:nvPicPr>
-                    <pic:cNvPr id="116" name="05-prihlaseni-registrace.jpg"/>
+                    <pic:cNvPr id="118" name="05-prihlaseni-registrace.jpg"/>
                     <pic:cNvPicPr/>
                   </pic:nvPicPr>
                   <pic:blipFill>
-                    <a:blip r:embed="rIdImg16"/>
+                    <a:blip r:embed="rIdImg18"/>
                     <a:stretch>
                       <a:fillRect/>
                     </a:stretch>
@@ -7142,7 +7962,7 @@
           <w:sz w:val="22"/>
           <w:b/>
         </w:rPr>
-        <w:t xml:space="preserve">Obrázek 11: </w:t>
+        <w:t xml:space="preserve">Obrázek 13: </w:t>
       </w:r>
       <w:r>
         <w:rPr>
@@ -7161,16 +7981,16 @@
         <w:drawing>
           <wp:inline distT="0" distB="0" distL="0" distR="0">
             <wp:extent cx="5580380" cy="3592370"/>
-            <wp:docPr id="117" name="Obrázek 117" descr="Wireframe stránky Můj účet"/>
+            <wp:docPr id="119" name="Obrázek 119" descr="Wireframe stránky Můj účet"/>
             <a:graphic xmlns:a="http://schemas.openxmlformats.org/drawingml/2006/main">
               <a:graphicData uri="http://schemas.openxmlformats.org/drawingml/2006/picture">
                 <pic:pic xmlns:pic="http://schemas.openxmlformats.org/drawingml/2006/picture">
                   <pic:nvPicPr>
-                    <pic:cNvPr id="117" name="06-muj-ucet.jpg"/>
+                    <pic:cNvPr id="119" name="06-muj-ucet.jpg"/>
                     <pic:cNvPicPr/>
                   </pic:nvPicPr>
                   <pic:blipFill>
-                    <a:blip r:embed="rIdImg17"/>
+                    <a:blip r:embed="rIdImg19"/>
                     <a:stretch>
                       <a:fillRect/>
                     </a:stretch>
@@ -7207,7 +8027,7 @@
           <w:sz w:val="22"/>
           <w:b/>
         </w:rPr>
-        <w:t xml:space="preserve">Obrázek 12: </w:t>
+        <w:t xml:space="preserve">Obrázek 14: </w:t>
       </w:r>
       <w:r>
         <w:rPr>
@@ -7226,16 +8046,16 @@
         <w:drawing>
           <wp:inline distT="0" distB="0" distL="0" distR="0">
             <wp:extent cx="5580380" cy="3972533"/>
-            <wp:docPr id="118" name="Obrázek 118" descr="Wireframe administrace"/>
+            <wp:docPr id="120" name="Obrázek 120" descr="Wireframe administrace"/>
             <a:graphic xmlns:a="http://schemas.openxmlformats.org/drawingml/2006/main">
               <a:graphicData uri="http://schemas.openxmlformats.org/drawingml/2006/picture">
                 <pic:pic xmlns:pic="http://schemas.openxmlformats.org/drawingml/2006/picture">
                   <pic:nvPicPr>
-                    <pic:cNvPr id="118" name="07-administrace.jpg"/>
+                    <pic:cNvPr id="120" name="07-administrace.jpg"/>
                     <pic:cNvPicPr/>
                   </pic:nvPicPr>
                   <pic:blipFill>
-                    <a:blip r:embed="rIdImg18"/>
+                    <a:blip r:embed="rIdImg20"/>
                     <a:stretch>
                       <a:fillRect/>
                     </a:stretch>
@@ -7272,7 +8092,7 @@
           <w:sz w:val="22"/>
           <w:b/>
         </w:rPr>
-        <w:t xml:space="preserve">Obrázek 13: </w:t>
+        <w:t xml:space="preserve">Obrázek 15: </w:t>
       </w:r>
       <w:r>
         <w:rPr>
@@ -7291,16 +8111,16 @@
         <w:drawing>
           <wp:inline distT="0" distB="0" distL="0" distR="0">
             <wp:extent cx="5580380" cy="4115530"/>
-            <wp:docPr id="119" name="Obrázek 119" descr="Wireframe společných komponent"/>
+            <wp:docPr id="121" name="Obrázek 121" descr="Wireframe společných komponent"/>
             <a:graphic xmlns:a="http://schemas.openxmlformats.org/drawingml/2006/main">
               <a:graphicData uri="http://schemas.openxmlformats.org/drawingml/2006/picture">
                 <pic:pic xmlns:pic="http://schemas.openxmlformats.org/drawingml/2006/picture">
                   <pic:nvPicPr>
-                    <pic:cNvPr id="119" name="00-komponenty.jpg"/>
+                    <pic:cNvPr id="121" name="00-komponenty.jpg"/>
                     <pic:cNvPicPr/>
                   </pic:nvPicPr>
                   <pic:blipFill>
-                    <a:blip r:embed="rIdImg19"/>
+                    <a:blip r:embed="rIdImg21"/>
                     <a:stretch>
                       <a:fillRect/>
                     </a:stretch>
@@ -7337,7 +8157,7 @@
           <w:sz w:val="22"/>
           <w:b/>
         </w:rPr>
-        <w:t xml:space="preserve">Obrázek 14: </w:t>
+        <w:t xml:space="preserve">Obrázek 16: </w:t>
       </w:r>
       <w:r>
         <w:rPr>

</xml_diff>